<commit_message>
update docs entregable cloud_tec
</commit_message>
<xml_diff>
--- a/teorico/cloud_tec/entregable/PIAD-626_FORMATOALUMNOTRABAJOFINAL.docx
+++ b/teorico/cloud_tec/entregable/PIAD-626_FORMATOALUMNOTRABAJOFINAL.docx
@@ -343,7 +343,7 @@
         </w:tc>
         <w:tc>
           <w:tcPr>
-            <w:tcW w:w="1345" w:type="dxa"/>
+            <w:tcW w:w="1344" w:type="dxa"/>
             <w:gridSpan w:val="2"/>
             <w:tcBorders>
               <w:top w:val="nil"/>
@@ -496,6 +496,7 @@
           </w:tcPr>
           <w:p>
             <w:pPr>
+              <w:spacing w:line="276" w:lineRule="auto"/>
               <w:rPr>
                 <w:rFonts w:ascii="Arial" w:hAnsi="Arial" w:cs="Arial"/>
                 <w:sz w:val="20"/>
@@ -509,16 +510,7 @@
                 <w:szCs w:val="20"/>
                 <w:lang w:val="es-PE"/>
               </w:rPr>
-              <w:t>Ing. De Software con Inte</w:t>
-            </w:r>
-            <w:r>
-              <w:rPr>
-                <w:rFonts w:ascii="Arial" w:hAnsi="Arial" w:cs="Arial"/>
-                <w:sz w:val="20"/>
-                <w:szCs w:val="20"/>
-                <w:lang w:val="es-PE"/>
-              </w:rPr>
-              <w:t>ligencia Artificial</w:t>
+              <w:t>Ing. De Software con Inteligencia Artificial</w:t>
             </w:r>
           </w:p>
         </w:tc>
@@ -555,7 +547,7 @@
         </w:tc>
         <w:tc>
           <w:tcPr>
-            <w:tcW w:w="795" w:type="dxa"/>
+            <w:tcW w:w="794" w:type="dxa"/>
             <w:tcBorders>
               <w:top w:val="single" w:sz="4" w:space="0" w:color="auto"/>
               <w:left w:val="nil"/>
@@ -631,7 +623,15 @@
                 <w:sz w:val="20"/>
                 <w:szCs w:val="20"/>
               </w:rPr>
-              <w:t>. Formativo:</w:t>
+              <w:t>. Formativo</w:t>
+            </w:r>
+            <w:r>
+              <w:rPr>
+                <w:rFonts w:ascii="Arial" w:hAnsi="Arial" w:cs="Arial"/>
+                <w:sz w:val="20"/>
+                <w:szCs w:val="20"/>
+              </w:rPr>
+              <w:t>:</w:t>
             </w:r>
           </w:p>
         </w:tc>
@@ -650,51 +650,22 @@
           </w:tcPr>
           <w:p>
             <w:pPr>
-              <w:rPr>
-                <w:rFonts w:ascii="Arial" w:hAnsi="Arial" w:cs="Arial"/>
-                <w:sz w:val="20"/>
-                <w:szCs w:val="20"/>
-              </w:rPr>
-            </w:pPr>
-            <w:r>
-              <w:rPr>
-                <w:rFonts w:ascii="Arial" w:hAnsi="Arial" w:cs="Arial"/>
-                <w:sz w:val="20"/>
-                <w:szCs w:val="20"/>
-              </w:rPr>
-              <w:t>T</w:t>
-            </w:r>
-            <w:r>
-              <w:rPr>
-                <w:rFonts w:ascii="Arial" w:hAnsi="Arial" w:cs="Arial"/>
-                <w:sz w:val="20"/>
-                <w:szCs w:val="20"/>
-              </w:rPr>
-              <w:t xml:space="preserve">ecnología </w:t>
-            </w:r>
-            <w:r>
-              <w:rPr>
-                <w:rFonts w:ascii="Arial" w:hAnsi="Arial" w:cs="Arial"/>
-                <w:sz w:val="20"/>
-                <w:szCs w:val="20"/>
-              </w:rPr>
-              <w:t>C</w:t>
-            </w:r>
-            <w:r>
-              <w:rPr>
-                <w:rFonts w:ascii="Arial" w:hAnsi="Arial" w:cs="Arial"/>
-                <w:sz w:val="20"/>
-                <w:szCs w:val="20"/>
-              </w:rPr>
-              <w:t>loud con</w:t>
-            </w:r>
-            <w:r>
-              <w:rPr>
-                <w:rFonts w:ascii="Arial" w:hAnsi="Arial" w:cs="Arial"/>
-                <w:sz w:val="20"/>
-                <w:szCs w:val="20"/>
-              </w:rPr>
-              <w:t xml:space="preserve"> AWS</w:t>
+              <w:spacing w:line="276" w:lineRule="auto"/>
+              <w:rPr>
+                <w:rFonts w:ascii="Arial" w:hAnsi="Arial" w:cs="Arial"/>
+                <w:sz w:val="20"/>
+                <w:szCs w:val="20"/>
+                <w:lang w:val="es-PE"/>
+              </w:rPr>
+            </w:pPr>
+            <w:r>
+              <w:rPr>
+                <w:rFonts w:ascii="Arial" w:hAnsi="Arial" w:cs="Arial"/>
+                <w:sz w:val="20"/>
+                <w:szCs w:val="20"/>
+                <w:lang w:val="es-PE"/>
+              </w:rPr>
+              <w:t>Big Data y Análisis de Datos</w:t>
             </w:r>
           </w:p>
         </w:tc>
@@ -728,7 +699,15 @@
                 <w:sz w:val="20"/>
                 <w:szCs w:val="20"/>
               </w:rPr>
-              <w:t>Tema de Trabajo Final</w:t>
+              <w:t>Tema de Trabajo</w:t>
+            </w:r>
+            <w:r>
+              <w:rPr>
+                <w:rFonts w:ascii="Arial" w:hAnsi="Arial" w:cs="Arial"/>
+                <w:sz w:val="20"/>
+                <w:szCs w:val="20"/>
+              </w:rPr>
+              <w:t xml:space="preserve"> Final</w:t>
             </w:r>
             <w:r>
               <w:rPr>
@@ -755,17 +734,20 @@
           </w:tcPr>
           <w:p>
             <w:pPr>
-              <w:rPr>
-                <w:rFonts w:ascii="Arial" w:hAnsi="Arial" w:cs="Arial"/>
-                <w:sz w:val="20"/>
-                <w:szCs w:val="20"/>
-              </w:rPr>
-            </w:pPr>
-            <w:r>
-              <w:rPr>
-                <w:rFonts w:ascii="Arial" w:hAnsi="Arial" w:cs="Arial"/>
-                <w:sz w:val="20"/>
-                <w:szCs w:val="20"/>
+              <w:spacing w:line="276" w:lineRule="auto"/>
+              <w:rPr>
+                <w:rFonts w:ascii="Arial" w:hAnsi="Arial" w:cs="Arial"/>
+                <w:sz w:val="20"/>
+                <w:szCs w:val="20"/>
+                <w:lang w:val="es-PE"/>
+              </w:rPr>
+            </w:pPr>
+            <w:r>
+              <w:rPr>
+                <w:rFonts w:ascii="Arial" w:hAnsi="Arial" w:cs="Arial"/>
+                <w:sz w:val="20"/>
+                <w:szCs w:val="20"/>
+                <w:lang w:val="es-PE"/>
               </w:rPr>
               <w:t>Optimización de la Infraestructura en la Nube para Servicios de Videovigilancia: Migración Eficiente y Segura en AWS</w:t>
             </w:r>
@@ -983,6 +965,16 @@
     <w:p>
       <w:pPr>
         <w:pStyle w:val="Prrafodelista"/>
+        <w:ind w:left="568"/>
+        <w:rPr>
+          <w:rFonts w:ascii="Arial" w:hAnsi="Arial" w:cs="Arial"/>
+          <w:b/>
+        </w:rPr>
+      </w:pPr>
+    </w:p>
+    <w:p>
+      <w:pPr>
+        <w:pStyle w:val="Prrafodelista"/>
         <w:ind w:left="567"/>
         <w:rPr>
           <w:rFonts w:ascii="Arial" w:hAnsi="Arial" w:cs="Arial"/>
@@ -1050,7 +1042,88 @@
                               <w:rPr>
                                 <w:rFonts w:ascii="Arial" w:hAnsi="Arial" w:cs="Arial"/>
                                 <w:color w:val="000000" w:themeColor="text1"/>
-                                <w:lang w:val="en-US"/>
+                                <w:lang w:val="es-PE"/>
+                              </w:rPr>
+                            </w:pPr>
+                            <w:r>
+                              <w:rPr>
+                                <w:rFonts w:ascii="Arial" w:hAnsi="Arial" w:cs="Arial"/>
+                                <w:color w:val="000000" w:themeColor="text1"/>
+                                <w:lang w:val="es-PE"/>
+                              </w:rPr>
+                              <w:t xml:space="preserve">La problemática central del </w:t>
+                            </w:r>
+                            <w:r>
+                              <w:rPr>
+                                <w:rFonts w:ascii="Arial" w:hAnsi="Arial" w:cs="Arial"/>
+                                <w:color w:val="000000" w:themeColor="text1"/>
+                                <w:lang w:val="es-PE"/>
+                              </w:rPr>
+                              <w:t xml:space="preserve">nuestro </w:t>
+                            </w:r>
+                            <w:r>
+                              <w:rPr>
+                                <w:rFonts w:ascii="Arial" w:hAnsi="Arial" w:cs="Arial"/>
+                                <w:color w:val="000000" w:themeColor="text1"/>
+                                <w:lang w:val="es-PE"/>
+                              </w:rPr>
+                              <w:t>caso práctico es la dependencia de un sistema de seguridad</w:t>
+                            </w:r>
+                            <w:r>
+                              <w:rPr>
+                                <w:rFonts w:ascii="Arial" w:hAnsi="Arial" w:cs="Arial"/>
+                                <w:color w:val="000000" w:themeColor="text1"/>
+                                <w:lang w:val="es-PE"/>
+                              </w:rPr>
+                              <w:t xml:space="preserve"> ambiguo</w:t>
+                            </w:r>
+                            <w:r>
+                              <w:rPr>
+                                <w:rFonts w:ascii="Arial" w:hAnsi="Arial" w:cs="Arial"/>
+                                <w:color w:val="000000" w:themeColor="text1"/>
+                                <w:lang w:val="es-PE"/>
+                              </w:rPr>
+                              <w:t xml:space="preserve">, pasivo e ineficaz para proteger los </w:t>
+                            </w:r>
+                            <w:r>
+                              <w:rPr>
+                                <w:rFonts w:ascii="Arial" w:hAnsi="Arial" w:cs="Arial"/>
+                                <w:color w:val="000000" w:themeColor="text1"/>
+                                <w:lang w:val="es-PE"/>
+                              </w:rPr>
+                              <w:t>productos</w:t>
+                            </w:r>
+                            <w:r>
+                              <w:rPr>
+                                <w:rFonts w:ascii="Arial" w:hAnsi="Arial" w:cs="Arial"/>
+                                <w:color w:val="000000" w:themeColor="text1"/>
+                                <w:lang w:val="es-PE"/>
+                              </w:rPr>
+                              <w:t xml:space="preserve"> de la empresa, especialmente durante las horas de cierre</w:t>
+                            </w:r>
+                            <w:r>
+                              <w:rPr>
+                                <w:rFonts w:ascii="Arial" w:hAnsi="Arial" w:cs="Arial"/>
+                                <w:color w:val="000000" w:themeColor="text1"/>
+                                <w:lang w:val="es-PE"/>
+                              </w:rPr>
+                              <w:t xml:space="preserve"> (madrugada)</w:t>
+                            </w:r>
+                            <w:r>
+                              <w:rPr>
+                                <w:rFonts w:ascii="Arial" w:hAnsi="Arial" w:cs="Arial"/>
+                                <w:color w:val="000000" w:themeColor="text1"/>
+                                <w:lang w:val="es-PE"/>
+                              </w:rPr>
+                              <w:t xml:space="preserve">. La arquitectura actual, basada en una simple grabación de video sin análisis ni conectividad en tiempo real, genera una vulnerabilidad crítica: la detección de incidentes ocurre horas o incluso días después del suceso, eliminando cualquier posibilidad de respuesta o intervención inmediata. </w:t>
+                            </w:r>
+                          </w:p>
+                          <w:p>
+                            <w:pPr>
+                              <w:rPr>
+                                <w:rFonts w:ascii="Arial" w:hAnsi="Arial" w:cs="Arial"/>
+                                <w:color w:val="000000" w:themeColor="text1"/>
+                                <w:lang w:val="es-PE"/>
                               </w:rPr>
                             </w:pPr>
                           </w:p>
@@ -1059,117 +1132,17 @@
                               <w:rPr>
                                 <w:rFonts w:ascii="Arial" w:hAnsi="Arial" w:cs="Arial"/>
                                 <w:color w:val="000000" w:themeColor="text1"/>
-                                <w:lang w:val="en-US"/>
+                                <w:lang w:val="es-PE"/>
                               </w:rPr>
                             </w:pPr>
-                          </w:p>
-                          <w:p>
-                            <w:pPr>
+                            <w:r>
                               <w:rPr>
                                 <w:rFonts w:ascii="Arial" w:hAnsi="Arial" w:cs="Arial"/>
                                 <w:color w:val="000000" w:themeColor="text1"/>
-                                <w:lang w:val="en-US"/>
+                                <w:lang w:val="es-PE"/>
                               </w:rPr>
-                            </w:pPr>
-                          </w:p>
-                          <w:p>
-                            <w:pPr>
-                              <w:rPr>
-                                <w:rFonts w:ascii="Arial" w:hAnsi="Arial" w:cs="Arial"/>
-                                <w:color w:val="000000" w:themeColor="text1"/>
-                                <w:lang w:val="en-US"/>
-                              </w:rPr>
-                            </w:pPr>
-                          </w:p>
-                          <w:p>
-                            <w:pPr>
-                              <w:rPr>
-                                <w:rFonts w:ascii="Arial" w:hAnsi="Arial" w:cs="Arial"/>
-                                <w:color w:val="000000" w:themeColor="text1"/>
-                                <w:lang w:val="en-US"/>
-                              </w:rPr>
-                            </w:pPr>
-                          </w:p>
-                          <w:p>
-                            <w:pPr>
-                              <w:rPr>
-                                <w:rFonts w:ascii="Arial" w:hAnsi="Arial" w:cs="Arial"/>
-                                <w:color w:val="000000" w:themeColor="text1"/>
-                                <w:lang w:val="en-US"/>
-                              </w:rPr>
-                            </w:pPr>
-                          </w:p>
-                          <w:p>
-                            <w:pPr>
-                              <w:rPr>
-                                <w:rFonts w:ascii="Arial" w:hAnsi="Arial" w:cs="Arial"/>
-                                <w:color w:val="000000" w:themeColor="text1"/>
-                                <w:lang w:val="en-US"/>
-                              </w:rPr>
-                            </w:pPr>
-                          </w:p>
-                          <w:p>
-                            <w:pPr>
-                              <w:rPr>
-                                <w:rFonts w:ascii="Arial" w:hAnsi="Arial" w:cs="Arial"/>
-                                <w:color w:val="000000" w:themeColor="text1"/>
-                                <w:lang w:val="en-US"/>
-                              </w:rPr>
-                            </w:pPr>
-                          </w:p>
-                          <w:p>
-                            <w:pPr>
-                              <w:rPr>
-                                <w:rFonts w:ascii="Arial" w:hAnsi="Arial" w:cs="Arial"/>
-                                <w:color w:val="000000" w:themeColor="text1"/>
-                                <w:lang w:val="en-US"/>
-                              </w:rPr>
-                            </w:pPr>
-                          </w:p>
-                          <w:p>
-                            <w:pPr>
-                              <w:rPr>
-                                <w:rFonts w:ascii="Arial" w:hAnsi="Arial" w:cs="Arial"/>
-                                <w:color w:val="000000" w:themeColor="text1"/>
-                                <w:lang w:val="en-US"/>
-                              </w:rPr>
-                            </w:pPr>
-                          </w:p>
-                          <w:p>
-                            <w:pPr>
-                              <w:rPr>
-                                <w:rFonts w:ascii="Arial" w:hAnsi="Arial" w:cs="Arial"/>
-                                <w:color w:val="000000" w:themeColor="text1"/>
-                                <w:lang w:val="en-US"/>
-                              </w:rPr>
-                            </w:pPr>
-                          </w:p>
-                          <w:p>
-                            <w:pPr>
-                              <w:rPr>
-                                <w:rFonts w:ascii="Arial" w:hAnsi="Arial" w:cs="Arial"/>
-                                <w:color w:val="000000" w:themeColor="text1"/>
-                                <w:lang w:val="en-US"/>
-                              </w:rPr>
-                            </w:pPr>
-                          </w:p>
-                          <w:p>
-                            <w:pPr>
-                              <w:rPr>
-                                <w:rFonts w:ascii="Arial" w:hAnsi="Arial" w:cs="Arial"/>
-                                <w:color w:val="000000" w:themeColor="text1"/>
-                                <w:lang w:val="en-US"/>
-                              </w:rPr>
-                            </w:pPr>
-                          </w:p>
-                          <w:p>
-                            <w:pPr>
-                              <w:rPr>
-                                <w:rFonts w:ascii="Arial" w:hAnsi="Arial" w:cs="Arial"/>
-                                <w:color w:val="000000" w:themeColor="text1"/>
-                                <w:lang w:val="en-US"/>
-                              </w:rPr>
-                            </w:pPr>
+                              <w:t>Esta incapacidad de actuar a tiempo no solo resulta en pérdidas económicas significativas, como el robo de S/ 240,000, sino que también consume recursos valiosos en la revisión manual de evidencia y perpetúa un estado de riesgo constante que amenaza la viabilidad financiera del negocio.</w:t>
+                            </w:r>
                           </w:p>
                         </w:txbxContent>
                       </wps:txbx>
@@ -1196,7 +1169,88 @@
                         <w:rPr>
                           <w:rFonts w:ascii="Arial" w:hAnsi="Arial" w:cs="Arial"/>
                           <w:color w:val="000000" w:themeColor="text1"/>
-                          <w:lang w:val="en-US"/>
+                          <w:lang w:val="es-PE"/>
+                        </w:rPr>
+                      </w:pPr>
+                      <w:r>
+                        <w:rPr>
+                          <w:rFonts w:ascii="Arial" w:hAnsi="Arial" w:cs="Arial"/>
+                          <w:color w:val="000000" w:themeColor="text1"/>
+                          <w:lang w:val="es-PE"/>
+                        </w:rPr>
+                        <w:t xml:space="preserve">La problemática central del </w:t>
+                      </w:r>
+                      <w:r>
+                        <w:rPr>
+                          <w:rFonts w:ascii="Arial" w:hAnsi="Arial" w:cs="Arial"/>
+                          <w:color w:val="000000" w:themeColor="text1"/>
+                          <w:lang w:val="es-PE"/>
+                        </w:rPr>
+                        <w:t xml:space="preserve">nuestro </w:t>
+                      </w:r>
+                      <w:r>
+                        <w:rPr>
+                          <w:rFonts w:ascii="Arial" w:hAnsi="Arial" w:cs="Arial"/>
+                          <w:color w:val="000000" w:themeColor="text1"/>
+                          <w:lang w:val="es-PE"/>
+                        </w:rPr>
+                        <w:t>caso práctico es la dependencia de un sistema de seguridad</w:t>
+                      </w:r>
+                      <w:r>
+                        <w:rPr>
+                          <w:rFonts w:ascii="Arial" w:hAnsi="Arial" w:cs="Arial"/>
+                          <w:color w:val="000000" w:themeColor="text1"/>
+                          <w:lang w:val="es-PE"/>
+                        </w:rPr>
+                        <w:t xml:space="preserve"> ambiguo</w:t>
+                      </w:r>
+                      <w:r>
+                        <w:rPr>
+                          <w:rFonts w:ascii="Arial" w:hAnsi="Arial" w:cs="Arial"/>
+                          <w:color w:val="000000" w:themeColor="text1"/>
+                          <w:lang w:val="es-PE"/>
+                        </w:rPr>
+                        <w:t xml:space="preserve">, pasivo e ineficaz para proteger los </w:t>
+                      </w:r>
+                      <w:r>
+                        <w:rPr>
+                          <w:rFonts w:ascii="Arial" w:hAnsi="Arial" w:cs="Arial"/>
+                          <w:color w:val="000000" w:themeColor="text1"/>
+                          <w:lang w:val="es-PE"/>
+                        </w:rPr>
+                        <w:t>productos</w:t>
+                      </w:r>
+                      <w:r>
+                        <w:rPr>
+                          <w:rFonts w:ascii="Arial" w:hAnsi="Arial" w:cs="Arial"/>
+                          <w:color w:val="000000" w:themeColor="text1"/>
+                          <w:lang w:val="es-PE"/>
+                        </w:rPr>
+                        <w:t xml:space="preserve"> de la empresa, especialmente durante las horas de cierre</w:t>
+                      </w:r>
+                      <w:r>
+                        <w:rPr>
+                          <w:rFonts w:ascii="Arial" w:hAnsi="Arial" w:cs="Arial"/>
+                          <w:color w:val="000000" w:themeColor="text1"/>
+                          <w:lang w:val="es-PE"/>
+                        </w:rPr>
+                        <w:t xml:space="preserve"> (madrugada)</w:t>
+                      </w:r>
+                      <w:r>
+                        <w:rPr>
+                          <w:rFonts w:ascii="Arial" w:hAnsi="Arial" w:cs="Arial"/>
+                          <w:color w:val="000000" w:themeColor="text1"/>
+                          <w:lang w:val="es-PE"/>
+                        </w:rPr>
+                        <w:t xml:space="preserve">. La arquitectura actual, basada en una simple grabación de video sin análisis ni conectividad en tiempo real, genera una vulnerabilidad crítica: la detección de incidentes ocurre horas o incluso días después del suceso, eliminando cualquier posibilidad de respuesta o intervención inmediata. </w:t>
+                      </w:r>
+                    </w:p>
+                    <w:p>
+                      <w:pPr>
+                        <w:rPr>
+                          <w:rFonts w:ascii="Arial" w:hAnsi="Arial" w:cs="Arial"/>
+                          <w:color w:val="000000" w:themeColor="text1"/>
+                          <w:lang w:val="es-PE"/>
                         </w:rPr>
                       </w:pPr>
                     </w:p>
@@ -1205,117 +1259,17 @@
                         <w:rPr>
                           <w:rFonts w:ascii="Arial" w:hAnsi="Arial" w:cs="Arial"/>
                           <w:color w:val="000000" w:themeColor="text1"/>
-                          <w:lang w:val="en-US"/>
+                          <w:lang w:val="es-PE"/>
                         </w:rPr>
                       </w:pPr>
-                    </w:p>
-                    <w:p>
-                      <w:pPr>
+                      <w:r>
                         <w:rPr>
                           <w:rFonts w:ascii="Arial" w:hAnsi="Arial" w:cs="Arial"/>
                           <w:color w:val="000000" w:themeColor="text1"/>
-                          <w:lang w:val="en-US"/>
+                          <w:lang w:val="es-PE"/>
                         </w:rPr>
-                      </w:pPr>
-                    </w:p>
-                    <w:p>
-                      <w:pPr>
-                        <w:rPr>
-                          <w:rFonts w:ascii="Arial" w:hAnsi="Arial" w:cs="Arial"/>
-                          <w:color w:val="000000" w:themeColor="text1"/>
-                          <w:lang w:val="en-US"/>
-                        </w:rPr>
-                      </w:pPr>
-                    </w:p>
-                    <w:p>
-                      <w:pPr>
-                        <w:rPr>
-                          <w:rFonts w:ascii="Arial" w:hAnsi="Arial" w:cs="Arial"/>
-                          <w:color w:val="000000" w:themeColor="text1"/>
-                          <w:lang w:val="en-US"/>
-                        </w:rPr>
-                      </w:pPr>
-                    </w:p>
-                    <w:p>
-                      <w:pPr>
-                        <w:rPr>
-                          <w:rFonts w:ascii="Arial" w:hAnsi="Arial" w:cs="Arial"/>
-                          <w:color w:val="000000" w:themeColor="text1"/>
-                          <w:lang w:val="en-US"/>
-                        </w:rPr>
-                      </w:pPr>
-                    </w:p>
-                    <w:p>
-                      <w:pPr>
-                        <w:rPr>
-                          <w:rFonts w:ascii="Arial" w:hAnsi="Arial" w:cs="Arial"/>
-                          <w:color w:val="000000" w:themeColor="text1"/>
-                          <w:lang w:val="en-US"/>
-                        </w:rPr>
-                      </w:pPr>
-                    </w:p>
-                    <w:p>
-                      <w:pPr>
-                        <w:rPr>
-                          <w:rFonts w:ascii="Arial" w:hAnsi="Arial" w:cs="Arial"/>
-                          <w:color w:val="000000" w:themeColor="text1"/>
-                          <w:lang w:val="en-US"/>
-                        </w:rPr>
-                      </w:pPr>
-                    </w:p>
-                    <w:p>
-                      <w:pPr>
-                        <w:rPr>
-                          <w:rFonts w:ascii="Arial" w:hAnsi="Arial" w:cs="Arial"/>
-                          <w:color w:val="000000" w:themeColor="text1"/>
-                          <w:lang w:val="en-US"/>
-                        </w:rPr>
-                      </w:pPr>
-                    </w:p>
-                    <w:p>
-                      <w:pPr>
-                        <w:rPr>
-                          <w:rFonts w:ascii="Arial" w:hAnsi="Arial" w:cs="Arial"/>
-                          <w:color w:val="000000" w:themeColor="text1"/>
-                          <w:lang w:val="en-US"/>
-                        </w:rPr>
-                      </w:pPr>
-                    </w:p>
-                    <w:p>
-                      <w:pPr>
-                        <w:rPr>
-                          <w:rFonts w:ascii="Arial" w:hAnsi="Arial" w:cs="Arial"/>
-                          <w:color w:val="000000" w:themeColor="text1"/>
-                          <w:lang w:val="en-US"/>
-                        </w:rPr>
-                      </w:pPr>
-                    </w:p>
-                    <w:p>
-                      <w:pPr>
-                        <w:rPr>
-                          <w:rFonts w:ascii="Arial" w:hAnsi="Arial" w:cs="Arial"/>
-                          <w:color w:val="000000" w:themeColor="text1"/>
-                          <w:lang w:val="en-US"/>
-                        </w:rPr>
-                      </w:pPr>
-                    </w:p>
-                    <w:p>
-                      <w:pPr>
-                        <w:rPr>
-                          <w:rFonts w:ascii="Arial" w:hAnsi="Arial" w:cs="Arial"/>
-                          <w:color w:val="000000" w:themeColor="text1"/>
-                          <w:lang w:val="en-US"/>
-                        </w:rPr>
-                      </w:pPr>
-                    </w:p>
-                    <w:p>
-                      <w:pPr>
-                        <w:rPr>
-                          <w:rFonts w:ascii="Arial" w:hAnsi="Arial" w:cs="Arial"/>
-                          <w:color w:val="000000" w:themeColor="text1"/>
-                          <w:lang w:val="en-US"/>
-                        </w:rPr>
-                      </w:pPr>
+                        <w:t>Esta incapacidad de actuar a tiempo no solo resulta en pérdidas económicas significativas, como el robo de S/ 240,000, sino que también consume recursos valiosos en la revisión manual de evidencia y perpetúa un estado de riesgo constante que amenaza la viabilidad financiera del negocio.</w:t>
+                      </w:r>
                     </w:p>
                   </w:txbxContent>
                 </v:textbox>
@@ -1446,6 +1400,98 @@
                                 <w:color w:val="000000" w:themeColor="text1"/>
                               </w:rPr>
                             </w:pPr>
+                            <w:r>
+                              <w:rPr>
+                                <w:rFonts w:ascii="Arial" w:hAnsi="Arial" w:cs="Arial"/>
+                                <w:color w:val="000000" w:themeColor="text1"/>
+                              </w:rPr>
+                              <w:t>La propuesta que planteamo</w:t>
+                            </w:r>
+                            <w:r>
+                              <w:rPr>
+                                <w:rFonts w:ascii="Arial" w:hAnsi="Arial" w:cs="Arial"/>
+                                <w:color w:val="000000" w:themeColor="text1"/>
+                              </w:rPr>
+                              <w:t xml:space="preserve">s </w:t>
+                            </w:r>
+                            <w:r>
+                              <w:rPr>
+                                <w:rFonts w:ascii="Arial" w:hAnsi="Arial" w:cs="Arial"/>
+                                <w:color w:val="000000" w:themeColor="text1"/>
+                              </w:rPr>
+                              <w:t xml:space="preserve">es de </w:t>
+                            </w:r>
+                            <w:r>
+                              <w:rPr>
+                                <w:rFonts w:ascii="Arial" w:hAnsi="Arial" w:cs="Arial"/>
+                                <w:color w:val="000000" w:themeColor="text1"/>
+                              </w:rPr>
+                              <w:t xml:space="preserve">la implementación de un sistema de seguridad IoT proactivo, basado en una arquitectura </w:t>
+                            </w:r>
+                            <w:proofErr w:type="spellStart"/>
+                            <w:r>
+                              <w:rPr>
+                                <w:rFonts w:ascii="Arial" w:hAnsi="Arial" w:cs="Arial"/>
+                                <w:color w:val="000000" w:themeColor="text1"/>
+                              </w:rPr>
+                              <w:t>serverless</w:t>
+                            </w:r>
+                            <w:proofErr w:type="spellEnd"/>
+                            <w:r>
+                              <w:rPr>
+                                <w:rFonts w:ascii="Arial" w:hAnsi="Arial" w:cs="Arial"/>
+                                <w:color w:val="000000" w:themeColor="text1"/>
+                              </w:rPr>
+                              <w:t xml:space="preserve"> en AWS. Este sistema reemplaza el modelo reactivo actual con un dispositivo de borde (ESP32-CAM) que detecta movimiento de forma autónoma (Edge Computing), captura una imagen como evidencia y la envía instantáneamente a la nube. El </w:t>
+                            </w:r>
+                            <w:proofErr w:type="spellStart"/>
+                            <w:r>
+                              <w:rPr>
+                                <w:rFonts w:ascii="Arial" w:hAnsi="Arial" w:cs="Arial"/>
+                                <w:color w:val="000000" w:themeColor="text1"/>
+                              </w:rPr>
+                              <w:t>backend</w:t>
+                            </w:r>
+                            <w:proofErr w:type="spellEnd"/>
+                            <w:r>
+                              <w:rPr>
+                                <w:rFonts w:ascii="Arial" w:hAnsi="Arial" w:cs="Arial"/>
+                                <w:color w:val="000000" w:themeColor="text1"/>
+                              </w:rPr>
+                              <w:t xml:space="preserve">, orquestado por AWS </w:t>
+                            </w:r>
+                            <w:proofErr w:type="spellStart"/>
+                            <w:r>
+                              <w:rPr>
+                                <w:rFonts w:ascii="Arial" w:hAnsi="Arial" w:cs="Arial"/>
+                                <w:color w:val="000000" w:themeColor="text1"/>
+                              </w:rPr>
+                              <w:t>Amplify</w:t>
+                            </w:r>
+                            <w:proofErr w:type="spellEnd"/>
+                            <w:r>
+                              <w:rPr>
+                                <w:rFonts w:ascii="Arial" w:hAnsi="Arial" w:cs="Arial"/>
+                                <w:color w:val="000000" w:themeColor="text1"/>
+                              </w:rPr>
+                              <w:t xml:space="preserve">, utiliza Amazon S3 para el almacenamiento seguro de la evidencia y </w:t>
+                            </w:r>
+                            <w:proofErr w:type="spellStart"/>
+                            <w:r>
+                              <w:rPr>
+                                <w:rFonts w:ascii="Arial" w:hAnsi="Arial" w:cs="Arial"/>
+                                <w:color w:val="000000" w:themeColor="text1"/>
+                              </w:rPr>
+                              <w:t>DynamoDB</w:t>
+                            </w:r>
+                            <w:proofErr w:type="spellEnd"/>
+                            <w:r>
+                              <w:rPr>
+                                <w:rFonts w:ascii="Arial" w:hAnsi="Arial" w:cs="Arial"/>
+                                <w:color w:val="000000" w:themeColor="text1"/>
+                              </w:rPr>
+                              <w:t xml:space="preserve"> para registrar el evento, desencadenando una alerta en tiempo real a la aplicación móvil del responsable. </w:t>
+                            </w:r>
                           </w:p>
                           <w:p>
                             <w:pPr>
@@ -1462,102 +1508,29 @@
                                 <w:color w:val="000000" w:themeColor="text1"/>
                               </w:rPr>
                             </w:pPr>
-                          </w:p>
-                          <w:p>
-                            <w:pPr>
+                            <w:r>
                               <w:rPr>
                                 <w:rFonts w:ascii="Arial" w:hAnsi="Arial" w:cs="Arial"/>
                                 <w:color w:val="000000" w:themeColor="text1"/>
                               </w:rPr>
-                            </w:pPr>
-                          </w:p>
-                          <w:p>
-                            <w:pPr>
+                              <w:t xml:space="preserve">Las evidencias de su viabilidad son los objetivos técnicos cumplidos, como la integración del hardware, el despliegue del </w:t>
+                            </w:r>
+                            <w:proofErr w:type="spellStart"/>
+                            <w:r>
                               <w:rPr>
                                 <w:rFonts w:ascii="Arial" w:hAnsi="Arial" w:cs="Arial"/>
                                 <w:color w:val="000000" w:themeColor="text1"/>
                               </w:rPr>
-                            </w:pPr>
-                          </w:p>
-                          <w:p>
-                            <w:pPr>
+                              <w:t>backend</w:t>
+                            </w:r>
+                            <w:proofErr w:type="spellEnd"/>
+                            <w:r>
                               <w:rPr>
                                 <w:rFonts w:ascii="Arial" w:hAnsi="Arial" w:cs="Arial"/>
                                 <w:color w:val="000000" w:themeColor="text1"/>
                               </w:rPr>
-                            </w:pPr>
-                          </w:p>
-                          <w:p>
-                            <w:pPr>
-                              <w:rPr>
-                                <w:rFonts w:ascii="Arial" w:hAnsi="Arial" w:cs="Arial"/>
-                                <w:color w:val="000000" w:themeColor="text1"/>
-                              </w:rPr>
-                            </w:pPr>
-                          </w:p>
-                          <w:p>
-                            <w:pPr>
-                              <w:rPr>
-                                <w:rFonts w:ascii="Arial" w:hAnsi="Arial" w:cs="Arial"/>
-                                <w:color w:val="000000" w:themeColor="text1"/>
-                              </w:rPr>
-                            </w:pPr>
-                          </w:p>
-                          <w:p>
-                            <w:pPr>
-                              <w:rPr>
-                                <w:rFonts w:ascii="Arial" w:hAnsi="Arial" w:cs="Arial"/>
-                                <w:color w:val="000000" w:themeColor="text1"/>
-                              </w:rPr>
-                            </w:pPr>
-                          </w:p>
-                          <w:p>
-                            <w:pPr>
-                              <w:rPr>
-                                <w:rFonts w:ascii="Arial" w:hAnsi="Arial" w:cs="Arial"/>
-                                <w:color w:val="000000" w:themeColor="text1"/>
-                              </w:rPr>
-                            </w:pPr>
-                          </w:p>
-                          <w:p>
-                            <w:pPr>
-                              <w:rPr>
-                                <w:rFonts w:ascii="Arial" w:hAnsi="Arial" w:cs="Arial"/>
-                                <w:color w:val="000000" w:themeColor="text1"/>
-                              </w:rPr>
-                            </w:pPr>
-                          </w:p>
-                          <w:p>
-                            <w:pPr>
-                              <w:rPr>
-                                <w:rFonts w:ascii="Arial" w:hAnsi="Arial" w:cs="Arial"/>
-                                <w:color w:val="000000" w:themeColor="text1"/>
-                              </w:rPr>
-                            </w:pPr>
-                          </w:p>
-                          <w:p>
-                            <w:pPr>
-                              <w:rPr>
-                                <w:rFonts w:ascii="Arial" w:hAnsi="Arial" w:cs="Arial"/>
-                                <w:color w:val="000000" w:themeColor="text1"/>
-                              </w:rPr>
-                            </w:pPr>
-                          </w:p>
-                          <w:p>
-                            <w:pPr>
-                              <w:rPr>
-                                <w:rFonts w:ascii="Arial" w:hAnsi="Arial" w:cs="Arial"/>
-                                <w:color w:val="000000" w:themeColor="text1"/>
-                              </w:rPr>
-                            </w:pPr>
-                          </w:p>
-                          <w:p>
-                            <w:pPr>
-                              <w:rPr>
-                                <w:rFonts w:ascii="Arial" w:hAnsi="Arial" w:cs="Arial"/>
-                                <w:color w:val="000000" w:themeColor="text1"/>
-                              </w:rPr>
-                            </w:pPr>
+                              <w:t xml:space="preserve"> y el desarrollo de la app. La evidencia de su valor es el análisis Beneficio/Costo, que demuestra un beneficio económico anual de S/ 120,000 por mitigación de riesgo y un periodo de recuperación de la inversión de solo 1.2 meses, validando la solución como una inversión financieramente estratégica y de alto impacto.</w:t>
+                            </w:r>
                           </w:p>
                         </w:txbxContent>
                       </wps:txbx>
@@ -1586,6 +1559,98 @@
                           <w:color w:val="000000" w:themeColor="text1"/>
                         </w:rPr>
                       </w:pPr>
+                      <w:r>
+                        <w:rPr>
+                          <w:rFonts w:ascii="Arial" w:hAnsi="Arial" w:cs="Arial"/>
+                          <w:color w:val="000000" w:themeColor="text1"/>
+                        </w:rPr>
+                        <w:t>La propuesta que planteamo</w:t>
+                      </w:r>
+                      <w:r>
+                        <w:rPr>
+                          <w:rFonts w:ascii="Arial" w:hAnsi="Arial" w:cs="Arial"/>
+                          <w:color w:val="000000" w:themeColor="text1"/>
+                        </w:rPr>
+                        <w:t xml:space="preserve">s </w:t>
+                      </w:r>
+                      <w:r>
+                        <w:rPr>
+                          <w:rFonts w:ascii="Arial" w:hAnsi="Arial" w:cs="Arial"/>
+                          <w:color w:val="000000" w:themeColor="text1"/>
+                        </w:rPr>
+                        <w:t xml:space="preserve">es de </w:t>
+                      </w:r>
+                      <w:r>
+                        <w:rPr>
+                          <w:rFonts w:ascii="Arial" w:hAnsi="Arial" w:cs="Arial"/>
+                          <w:color w:val="000000" w:themeColor="text1"/>
+                        </w:rPr>
+                        <w:t xml:space="preserve">la implementación de un sistema de seguridad IoT proactivo, basado en una arquitectura </w:t>
+                      </w:r>
+                      <w:proofErr w:type="spellStart"/>
+                      <w:r>
+                        <w:rPr>
+                          <w:rFonts w:ascii="Arial" w:hAnsi="Arial" w:cs="Arial"/>
+                          <w:color w:val="000000" w:themeColor="text1"/>
+                        </w:rPr>
+                        <w:t>serverless</w:t>
+                      </w:r>
+                      <w:proofErr w:type="spellEnd"/>
+                      <w:r>
+                        <w:rPr>
+                          <w:rFonts w:ascii="Arial" w:hAnsi="Arial" w:cs="Arial"/>
+                          <w:color w:val="000000" w:themeColor="text1"/>
+                        </w:rPr>
+                        <w:t xml:space="preserve"> en AWS. Este sistema reemplaza el modelo reactivo actual con un dispositivo de borde (ESP32-CAM) que detecta movimiento de forma autónoma (Edge Computing), captura una imagen como evidencia y la envía instantáneamente a la nube. El </w:t>
+                      </w:r>
+                      <w:proofErr w:type="spellStart"/>
+                      <w:r>
+                        <w:rPr>
+                          <w:rFonts w:ascii="Arial" w:hAnsi="Arial" w:cs="Arial"/>
+                          <w:color w:val="000000" w:themeColor="text1"/>
+                        </w:rPr>
+                        <w:t>backend</w:t>
+                      </w:r>
+                      <w:proofErr w:type="spellEnd"/>
+                      <w:r>
+                        <w:rPr>
+                          <w:rFonts w:ascii="Arial" w:hAnsi="Arial" w:cs="Arial"/>
+                          <w:color w:val="000000" w:themeColor="text1"/>
+                        </w:rPr>
+                        <w:t xml:space="preserve">, orquestado por AWS </w:t>
+                      </w:r>
+                      <w:proofErr w:type="spellStart"/>
+                      <w:r>
+                        <w:rPr>
+                          <w:rFonts w:ascii="Arial" w:hAnsi="Arial" w:cs="Arial"/>
+                          <w:color w:val="000000" w:themeColor="text1"/>
+                        </w:rPr>
+                        <w:t>Amplify</w:t>
+                      </w:r>
+                      <w:proofErr w:type="spellEnd"/>
+                      <w:r>
+                        <w:rPr>
+                          <w:rFonts w:ascii="Arial" w:hAnsi="Arial" w:cs="Arial"/>
+                          <w:color w:val="000000" w:themeColor="text1"/>
+                        </w:rPr>
+                        <w:t xml:space="preserve">, utiliza Amazon S3 para el almacenamiento seguro de la evidencia y </w:t>
+                      </w:r>
+                      <w:proofErr w:type="spellStart"/>
+                      <w:r>
+                        <w:rPr>
+                          <w:rFonts w:ascii="Arial" w:hAnsi="Arial" w:cs="Arial"/>
+                          <w:color w:val="000000" w:themeColor="text1"/>
+                        </w:rPr>
+                        <w:t>DynamoDB</w:t>
+                      </w:r>
+                      <w:proofErr w:type="spellEnd"/>
+                      <w:r>
+                        <w:rPr>
+                          <w:rFonts w:ascii="Arial" w:hAnsi="Arial" w:cs="Arial"/>
+                          <w:color w:val="000000" w:themeColor="text1"/>
+                        </w:rPr>
+                        <w:t xml:space="preserve"> para registrar el evento, desencadenando una alerta en tiempo real a la aplicación móvil del responsable. </w:t>
+                      </w:r>
                     </w:p>
                     <w:p>
                       <w:pPr>
@@ -1602,102 +1667,29 @@
                           <w:color w:val="000000" w:themeColor="text1"/>
                         </w:rPr>
                       </w:pPr>
-                    </w:p>
-                    <w:p>
-                      <w:pPr>
+                      <w:r>
                         <w:rPr>
                           <w:rFonts w:ascii="Arial" w:hAnsi="Arial" w:cs="Arial"/>
                           <w:color w:val="000000" w:themeColor="text1"/>
                         </w:rPr>
-                      </w:pPr>
-                    </w:p>
-                    <w:p>
-                      <w:pPr>
+                        <w:t xml:space="preserve">Las evidencias de su viabilidad son los objetivos técnicos cumplidos, como la integración del hardware, el despliegue del </w:t>
+                      </w:r>
+                      <w:proofErr w:type="spellStart"/>
+                      <w:r>
                         <w:rPr>
                           <w:rFonts w:ascii="Arial" w:hAnsi="Arial" w:cs="Arial"/>
                           <w:color w:val="000000" w:themeColor="text1"/>
                         </w:rPr>
-                      </w:pPr>
-                    </w:p>
-                    <w:p>
-                      <w:pPr>
+                        <w:t>backend</w:t>
+                      </w:r>
+                      <w:proofErr w:type="spellEnd"/>
+                      <w:r>
                         <w:rPr>
                           <w:rFonts w:ascii="Arial" w:hAnsi="Arial" w:cs="Arial"/>
                           <w:color w:val="000000" w:themeColor="text1"/>
                         </w:rPr>
-                      </w:pPr>
-                    </w:p>
-                    <w:p>
-                      <w:pPr>
-                        <w:rPr>
-                          <w:rFonts w:ascii="Arial" w:hAnsi="Arial" w:cs="Arial"/>
-                          <w:color w:val="000000" w:themeColor="text1"/>
-                        </w:rPr>
-                      </w:pPr>
-                    </w:p>
-                    <w:p>
-                      <w:pPr>
-                        <w:rPr>
-                          <w:rFonts w:ascii="Arial" w:hAnsi="Arial" w:cs="Arial"/>
-                          <w:color w:val="000000" w:themeColor="text1"/>
-                        </w:rPr>
-                      </w:pPr>
-                    </w:p>
-                    <w:p>
-                      <w:pPr>
-                        <w:rPr>
-                          <w:rFonts w:ascii="Arial" w:hAnsi="Arial" w:cs="Arial"/>
-                          <w:color w:val="000000" w:themeColor="text1"/>
-                        </w:rPr>
-                      </w:pPr>
-                    </w:p>
-                    <w:p>
-                      <w:pPr>
-                        <w:rPr>
-                          <w:rFonts w:ascii="Arial" w:hAnsi="Arial" w:cs="Arial"/>
-                          <w:color w:val="000000" w:themeColor="text1"/>
-                        </w:rPr>
-                      </w:pPr>
-                    </w:p>
-                    <w:p>
-                      <w:pPr>
-                        <w:rPr>
-                          <w:rFonts w:ascii="Arial" w:hAnsi="Arial" w:cs="Arial"/>
-                          <w:color w:val="000000" w:themeColor="text1"/>
-                        </w:rPr>
-                      </w:pPr>
-                    </w:p>
-                    <w:p>
-                      <w:pPr>
-                        <w:rPr>
-                          <w:rFonts w:ascii="Arial" w:hAnsi="Arial" w:cs="Arial"/>
-                          <w:color w:val="000000" w:themeColor="text1"/>
-                        </w:rPr>
-                      </w:pPr>
-                    </w:p>
-                    <w:p>
-                      <w:pPr>
-                        <w:rPr>
-                          <w:rFonts w:ascii="Arial" w:hAnsi="Arial" w:cs="Arial"/>
-                          <w:color w:val="000000" w:themeColor="text1"/>
-                        </w:rPr>
-                      </w:pPr>
-                    </w:p>
-                    <w:p>
-                      <w:pPr>
-                        <w:rPr>
-                          <w:rFonts w:ascii="Arial" w:hAnsi="Arial" w:cs="Arial"/>
-                          <w:color w:val="000000" w:themeColor="text1"/>
-                        </w:rPr>
-                      </w:pPr>
-                    </w:p>
-                    <w:p>
-                      <w:pPr>
-                        <w:rPr>
-                          <w:rFonts w:ascii="Arial" w:hAnsi="Arial" w:cs="Arial"/>
-                          <w:color w:val="000000" w:themeColor="text1"/>
-                        </w:rPr>
-                      </w:pPr>
+                        <w:t xml:space="preserve"> y el desarrollo de la app. La evidencia de su valor es el análisis Beneficio/Costo, que demuestra un beneficio económico anual de S/ 120,000 por mitigación de riesgo y un periodo de recuperación de la inversión de solo 1.2 meses, validando la solución como una inversión financieramente estratégica y de alto impacto.</w:t>
+                      </w:r>
                     </w:p>
                   </w:txbxContent>
                 </v:textbox>
@@ -1962,9 +1954,20 @@
               <w:ind w:left="360"/>
               <w:rPr>
                 <w:rFonts w:ascii="Arial" w:hAnsi="Arial" w:cs="Arial"/>
+                <w:sz w:val="20"/>
+                <w:szCs w:val="20"/>
                 <w:lang w:val="es-PE"/>
               </w:rPr>
             </w:pPr>
+            <w:r>
+              <w:rPr>
+                <w:rFonts w:ascii="Arial" w:hAnsi="Arial" w:cs="Arial"/>
+                <w:sz w:val="20"/>
+                <w:szCs w:val="20"/>
+                <w:lang w:val="es-PE"/>
+              </w:rPr>
+              <w:t>¿Cómo se pueden optimizar los costos asociados al uso de instancias EC2 sin afectar el procesamiento de video en tiempo real?</w:t>
+            </w:r>
           </w:p>
         </w:tc>
       </w:tr>
@@ -1996,6 +1999,116 @@
                 <w:lang w:val="es-PE"/>
               </w:rPr>
             </w:pPr>
+            <w:r>
+              <w:rPr>
+                <w:rFonts w:ascii="Arial" w:hAnsi="Arial" w:cs="Arial"/>
+                <w:sz w:val="20"/>
+                <w:szCs w:val="20"/>
+                <w:lang w:val="es-PE"/>
+              </w:rPr>
+              <w:t>Para optimizar los costos de EC2, se deben aplicar estrategias como el "</w:t>
+            </w:r>
+            <w:proofErr w:type="spellStart"/>
+            <w:r>
+              <w:rPr>
+                <w:rFonts w:ascii="Arial" w:hAnsi="Arial" w:cs="Arial"/>
+                <w:sz w:val="20"/>
+                <w:szCs w:val="20"/>
+                <w:lang w:val="es-PE"/>
+              </w:rPr>
+              <w:t>Right</w:t>
+            </w:r>
+            <w:proofErr w:type="spellEnd"/>
+            <w:r>
+              <w:rPr>
+                <w:rFonts w:ascii="Arial" w:hAnsi="Arial" w:cs="Arial"/>
+                <w:sz w:val="20"/>
+                <w:szCs w:val="20"/>
+                <w:lang w:val="es-PE"/>
+              </w:rPr>
+              <w:t xml:space="preserve"> </w:t>
+            </w:r>
+            <w:proofErr w:type="spellStart"/>
+            <w:r>
+              <w:rPr>
+                <w:rFonts w:ascii="Arial" w:hAnsi="Arial" w:cs="Arial"/>
+                <w:sz w:val="20"/>
+                <w:szCs w:val="20"/>
+                <w:lang w:val="es-PE"/>
+              </w:rPr>
+              <w:t>Sizing</w:t>
+            </w:r>
+            <w:proofErr w:type="spellEnd"/>
+            <w:r>
+              <w:rPr>
+                <w:rFonts w:ascii="Arial" w:hAnsi="Arial" w:cs="Arial"/>
+                <w:sz w:val="20"/>
+                <w:szCs w:val="20"/>
+                <w:lang w:val="es-PE"/>
+              </w:rPr>
+              <w:t xml:space="preserve">" para seleccionar el tamaño de instancia adecuado, el "Auto </w:t>
+            </w:r>
+            <w:proofErr w:type="spellStart"/>
+            <w:r>
+              <w:rPr>
+                <w:rFonts w:ascii="Arial" w:hAnsi="Arial" w:cs="Arial"/>
+                <w:sz w:val="20"/>
+                <w:szCs w:val="20"/>
+                <w:lang w:val="es-PE"/>
+              </w:rPr>
+              <w:t>Scaling</w:t>
+            </w:r>
+            <w:proofErr w:type="spellEnd"/>
+            <w:r>
+              <w:rPr>
+                <w:rFonts w:ascii="Arial" w:hAnsi="Arial" w:cs="Arial"/>
+                <w:sz w:val="20"/>
+                <w:szCs w:val="20"/>
+                <w:lang w:val="es-PE"/>
+              </w:rPr>
+              <w:t xml:space="preserve">" para ajustar la capacidad a la demanda, y el uso de modelos de precios como Instancias Reservadas o Spot para obtener descuentos. </w:t>
+            </w:r>
+          </w:p>
+          <w:p>
+            <w:pPr>
+              <w:spacing w:before="120"/>
+              <w:ind w:left="284"/>
+              <w:rPr>
+                <w:rFonts w:ascii="Arial" w:hAnsi="Arial" w:cs="Arial"/>
+                <w:sz w:val="20"/>
+                <w:szCs w:val="20"/>
+                <w:lang w:val="es-PE"/>
+              </w:rPr>
+            </w:pPr>
+            <w:r>
+              <w:rPr>
+                <w:rFonts w:ascii="Arial" w:hAnsi="Arial" w:cs="Arial"/>
+                <w:sz w:val="20"/>
+                <w:szCs w:val="20"/>
+                <w:lang w:val="es-PE"/>
+              </w:rPr>
+              <w:t xml:space="preserve">Sin embargo, la solución propuesta en este proyecto es inherentemente superior, ya que al ser una arquitectura </w:t>
+            </w:r>
+            <w:proofErr w:type="spellStart"/>
+            <w:r>
+              <w:rPr>
+                <w:rFonts w:ascii="Arial" w:hAnsi="Arial" w:cs="Arial"/>
+                <w:sz w:val="20"/>
+                <w:szCs w:val="20"/>
+                <w:lang w:val="es-PE"/>
+              </w:rPr>
+              <w:t>serverless</w:t>
+            </w:r>
+            <w:proofErr w:type="spellEnd"/>
+            <w:r>
+              <w:rPr>
+                <w:rFonts w:ascii="Arial" w:hAnsi="Arial" w:cs="Arial"/>
+                <w:sz w:val="20"/>
+                <w:szCs w:val="20"/>
+                <w:lang w:val="es-PE"/>
+              </w:rPr>
+              <w:t xml:space="preserve"> que no utiliza EC2, elimina por completo los costos de infraestructura inactiva. El procesamiento se realiza en el borde (Edge Computing) y las funciones en la nube solo se cobran por milisegundos de uso, representando la máxima optimización de costos posible para una aplicación basada en eventos.</w:t>
+            </w:r>
           </w:p>
         </w:tc>
       </w:tr>
@@ -2077,7 +2190,7 @@
                 <w:szCs w:val="20"/>
                 <w:lang w:val="es-PE"/>
               </w:rPr>
-              <w:t> </w:t>
+              <w:t>¿Qué estrategias de seguridad se deben implementar para proteger los datos y cuentas de AWS de manera efectiva?</w:t>
             </w:r>
           </w:p>
         </w:tc>
@@ -2117,7 +2230,108 @@
                 <w:szCs w:val="20"/>
                 <w:lang w:val="es-PE"/>
               </w:rPr>
-              <w:t> </w:t>
+              <w:t xml:space="preserve">Una estrategia de seguridad efectiva en AWS se basa en el Principio de Mínimo Privilegio, implementado a través de roles y políticas de IAM, la activación de Autenticación Multi-Factor (MFA), la encriptación de datos en tránsito y en reposo, y el monitoreo con servicios como </w:t>
+            </w:r>
+            <w:proofErr w:type="spellStart"/>
+            <w:r>
+              <w:rPr>
+                <w:rFonts w:ascii="Arial" w:hAnsi="Arial" w:cs="Arial"/>
+                <w:sz w:val="20"/>
+                <w:szCs w:val="20"/>
+                <w:lang w:val="es-PE"/>
+              </w:rPr>
+              <w:t>CloudTrail</w:t>
+            </w:r>
+            <w:proofErr w:type="spellEnd"/>
+            <w:r>
+              <w:rPr>
+                <w:rFonts w:ascii="Arial" w:hAnsi="Arial" w:cs="Arial"/>
+                <w:sz w:val="20"/>
+                <w:szCs w:val="20"/>
+                <w:lang w:val="es-PE"/>
+              </w:rPr>
+              <w:t xml:space="preserve">. </w:t>
+            </w:r>
+          </w:p>
+          <w:p>
+            <w:pPr>
+              <w:spacing w:before="120"/>
+              <w:ind w:left="284"/>
+              <w:rPr>
+                <w:rFonts w:ascii="Arial" w:hAnsi="Arial" w:cs="Arial"/>
+                <w:sz w:val="20"/>
+                <w:szCs w:val="20"/>
+                <w:lang w:val="es-PE"/>
+              </w:rPr>
+            </w:pPr>
+            <w:r>
+              <w:rPr>
+                <w:rFonts w:ascii="Arial" w:hAnsi="Arial" w:cs="Arial"/>
+                <w:sz w:val="20"/>
+                <w:szCs w:val="20"/>
+                <w:lang w:val="es-PE"/>
+              </w:rPr>
+              <w:t xml:space="preserve">En la solución propuesta, AWS </w:t>
+            </w:r>
+            <w:proofErr w:type="spellStart"/>
+            <w:r>
+              <w:rPr>
+                <w:rFonts w:ascii="Arial" w:hAnsi="Arial" w:cs="Arial"/>
+                <w:sz w:val="20"/>
+                <w:szCs w:val="20"/>
+                <w:lang w:val="es-PE"/>
+              </w:rPr>
+              <w:t>Amplify</w:t>
+            </w:r>
+            <w:proofErr w:type="spellEnd"/>
+            <w:r>
+              <w:rPr>
+                <w:rFonts w:ascii="Arial" w:hAnsi="Arial" w:cs="Arial"/>
+                <w:sz w:val="20"/>
+                <w:szCs w:val="20"/>
+                <w:lang w:val="es-PE"/>
+              </w:rPr>
+              <w:t xml:space="preserve"> automatiza gran parte de esta estrategia, creando roles de IAM con permisos restringidos, integrando Amazon </w:t>
+            </w:r>
+            <w:proofErr w:type="spellStart"/>
+            <w:r>
+              <w:rPr>
+                <w:rFonts w:ascii="Arial" w:hAnsi="Arial" w:cs="Arial"/>
+                <w:sz w:val="20"/>
+                <w:szCs w:val="20"/>
+                <w:lang w:val="es-PE"/>
+              </w:rPr>
+              <w:t>Cognito</w:t>
+            </w:r>
+            <w:proofErr w:type="spellEnd"/>
+            <w:r>
+              <w:rPr>
+                <w:rFonts w:ascii="Arial" w:hAnsi="Arial" w:cs="Arial"/>
+                <w:sz w:val="20"/>
+                <w:szCs w:val="20"/>
+                <w:lang w:val="es-PE"/>
+              </w:rPr>
+              <w:t xml:space="preserve"> para la autenticación segura de usuarios en la app, y utilizando la encriptación nativa de servicios como S3 y </w:t>
+            </w:r>
+            <w:proofErr w:type="spellStart"/>
+            <w:r>
+              <w:rPr>
+                <w:rFonts w:ascii="Arial" w:hAnsi="Arial" w:cs="Arial"/>
+                <w:sz w:val="20"/>
+                <w:szCs w:val="20"/>
+                <w:lang w:val="es-PE"/>
+              </w:rPr>
+              <w:t>DynamoDB</w:t>
+            </w:r>
+            <w:proofErr w:type="spellEnd"/>
+            <w:r>
+              <w:rPr>
+                <w:rFonts w:ascii="Arial" w:hAnsi="Arial" w:cs="Arial"/>
+                <w:sz w:val="20"/>
+                <w:szCs w:val="20"/>
+                <w:lang w:val="es-PE"/>
+              </w:rPr>
+              <w:t xml:space="preserve"> para garantizar la protección de los datos.</w:t>
             </w:r>
           </w:p>
         </w:tc>
@@ -2194,7 +2408,7 @@
                 <w:szCs w:val="20"/>
                 <w:lang w:val="es-PE"/>
               </w:rPr>
-              <w:t> </w:t>
+              <w:t>¿Cómo se puede mejorar el rendimiento y la escalabilidad de las bases de datos en Amazon RDS?</w:t>
             </w:r>
           </w:p>
         </w:tc>
@@ -2234,7 +2448,126 @@
                 <w:szCs w:val="20"/>
                 <w:lang w:val="es-PE"/>
               </w:rPr>
-              <w:t> </w:t>
+              <w:t>El rendimiento de RDS se mejora mediante el escalado vertical (instancias más potentes), el escalado horizontal con "</w:t>
+            </w:r>
+            <w:proofErr w:type="spellStart"/>
+            <w:r>
+              <w:rPr>
+                <w:rFonts w:ascii="Arial" w:hAnsi="Arial" w:cs="Arial"/>
+                <w:sz w:val="20"/>
+                <w:szCs w:val="20"/>
+                <w:lang w:val="es-PE"/>
+              </w:rPr>
+              <w:t>Read</w:t>
+            </w:r>
+            <w:proofErr w:type="spellEnd"/>
+            <w:r>
+              <w:rPr>
+                <w:rFonts w:ascii="Arial" w:hAnsi="Arial" w:cs="Arial"/>
+                <w:sz w:val="20"/>
+                <w:szCs w:val="20"/>
+                <w:lang w:val="es-PE"/>
+              </w:rPr>
+              <w:t xml:space="preserve"> Replicas", o migrando a Amazon Aurora para mayor rendimiento. No obstante, el proyecto propuesto evita estos desafíos de escalabilidad al utilizar Amazon </w:t>
+            </w:r>
+            <w:proofErr w:type="spellStart"/>
+            <w:r>
+              <w:rPr>
+                <w:rFonts w:ascii="Arial" w:hAnsi="Arial" w:cs="Arial"/>
+                <w:sz w:val="20"/>
+                <w:szCs w:val="20"/>
+                <w:lang w:val="es-PE"/>
+              </w:rPr>
+              <w:t>DynamoDB</w:t>
+            </w:r>
+            <w:proofErr w:type="spellEnd"/>
+            <w:r>
+              <w:rPr>
+                <w:rFonts w:ascii="Arial" w:hAnsi="Arial" w:cs="Arial"/>
+                <w:sz w:val="20"/>
+                <w:szCs w:val="20"/>
+                <w:lang w:val="es-PE"/>
+              </w:rPr>
+              <w:t xml:space="preserve">, una base de datos NoSQL </w:t>
+            </w:r>
+            <w:proofErr w:type="spellStart"/>
+            <w:r>
+              <w:rPr>
+                <w:rFonts w:ascii="Arial" w:hAnsi="Arial" w:cs="Arial"/>
+                <w:sz w:val="20"/>
+                <w:szCs w:val="20"/>
+                <w:lang w:val="es-PE"/>
+              </w:rPr>
+              <w:t>serverless</w:t>
+            </w:r>
+            <w:proofErr w:type="spellEnd"/>
+            <w:r>
+              <w:rPr>
+                <w:rFonts w:ascii="Arial" w:hAnsi="Arial" w:cs="Arial"/>
+                <w:sz w:val="20"/>
+                <w:szCs w:val="20"/>
+                <w:lang w:val="es-PE"/>
+              </w:rPr>
+              <w:t xml:space="preserve">. </w:t>
+            </w:r>
+            <w:proofErr w:type="spellStart"/>
+            <w:r>
+              <w:rPr>
+                <w:rFonts w:ascii="Arial" w:hAnsi="Arial" w:cs="Arial"/>
+                <w:sz w:val="20"/>
+                <w:szCs w:val="20"/>
+                <w:lang w:val="es-PE"/>
+              </w:rPr>
+              <w:t>DynamoDB</w:t>
+            </w:r>
+            <w:proofErr w:type="spellEnd"/>
+            <w:r>
+              <w:rPr>
+                <w:rFonts w:ascii="Arial" w:hAnsi="Arial" w:cs="Arial"/>
+                <w:sz w:val="20"/>
+                <w:szCs w:val="20"/>
+                <w:lang w:val="es-PE"/>
+              </w:rPr>
+              <w:t xml:space="preserve"> está diseñada para una escalabilidad masiva y automática</w:t>
+            </w:r>
+            <w:r>
+              <w:rPr>
+                <w:rFonts w:ascii="Arial" w:hAnsi="Arial" w:cs="Arial"/>
+                <w:sz w:val="20"/>
+                <w:szCs w:val="20"/>
+                <w:lang w:val="es-PE"/>
+              </w:rPr>
+              <w:t>.</w:t>
+            </w:r>
+          </w:p>
+          <w:p>
+            <w:pPr>
+              <w:spacing w:before="120"/>
+              <w:ind w:left="284"/>
+              <w:rPr>
+                <w:rFonts w:ascii="Arial" w:hAnsi="Arial" w:cs="Arial"/>
+                <w:sz w:val="20"/>
+                <w:szCs w:val="20"/>
+                <w:lang w:val="es-PE"/>
+              </w:rPr>
+            </w:pPr>
+            <w:r>
+              <w:rPr>
+                <w:rFonts w:ascii="Arial" w:hAnsi="Arial" w:cs="Arial"/>
+                <w:sz w:val="20"/>
+                <w:szCs w:val="20"/>
+                <w:lang w:val="es-PE"/>
+              </w:rPr>
+              <w:t xml:space="preserve">Llegando a ofrecer </w:t>
+            </w:r>
+            <w:r>
+              <w:rPr>
+                <w:rFonts w:ascii="Arial" w:hAnsi="Arial" w:cs="Arial"/>
+                <w:sz w:val="20"/>
+                <w:szCs w:val="20"/>
+                <w:lang w:val="es-PE"/>
+              </w:rPr>
+              <w:t>un rendimiento de milisegundos de baja latencia para el tipo de datos del proyecto (registros de eventos), lo que la convierte en una solución más eficiente y rentable para este caso de uso específico.</w:t>
             </w:r>
           </w:p>
         </w:tc>
@@ -2310,7 +2643,7 @@
                 <w:szCs w:val="20"/>
                 <w:lang w:val="es-PE"/>
               </w:rPr>
-              <w:t> </w:t>
+              <w:t>¿Qué servicios de almacenamiento de AWS son más adecuados para manejar el gran volumen de datos generados por las cámaras de videovigilancia?</w:t>
             </w:r>
           </w:p>
         </w:tc>
@@ -2352,6 +2685,36 @@
               </w:rPr>
               <w:t> </w:t>
             </w:r>
+            <w:r>
+              <w:rPr>
+                <w:rFonts w:ascii="Arial" w:hAnsi="Arial" w:cs="Arial"/>
+                <w:sz w:val="20"/>
+                <w:szCs w:val="20"/>
+                <w:lang w:val="es-PE"/>
+              </w:rPr>
+              <w:t xml:space="preserve">La mejor práctica es utilizar un almacenamiento por niveles: Amazon S3 Standard para el acceso inmediato a la evidencia reciente, y Amazon S3 Glacier para el archivado a largo plazo y de bajo costo de datos más antiguos. </w:t>
+            </w:r>
+          </w:p>
+          <w:p>
+            <w:pPr>
+              <w:spacing w:before="120"/>
+              <w:ind w:left="284"/>
+              <w:rPr>
+                <w:rFonts w:ascii="Arial" w:hAnsi="Arial" w:cs="Arial"/>
+                <w:sz w:val="20"/>
+                <w:szCs w:val="20"/>
+                <w:lang w:val="es-PE"/>
+              </w:rPr>
+            </w:pPr>
+            <w:r>
+              <w:rPr>
+                <w:rFonts w:ascii="Arial" w:hAnsi="Arial" w:cs="Arial"/>
+                <w:sz w:val="20"/>
+                <w:szCs w:val="20"/>
+                <w:lang w:val="es-PE"/>
+              </w:rPr>
+              <w:t>El proyecto propuesto implementa esta estrategia de forma óptima al utilizar Amazon S3 como repositorio principal para las capturas de imagen, lo que garantiza alta durabilidad y disponibilidad. A futuro, se pueden aplicar políticas de ciclo de vida en S3 para mover automáticamente la evidencia antigua a Glacier, minimizando los costos de almacenamiento a largo plazo.</w:t>
+            </w:r>
           </w:p>
         </w:tc>
       </w:tr>
@@ -2426,7 +2789,27 @@
                 <w:szCs w:val="20"/>
                 <w:lang w:val="es-PE"/>
               </w:rPr>
-              <w:t> </w:t>
+              <w:t xml:space="preserve">¿Cómo se puede utilizar AWS </w:t>
+            </w:r>
+            <w:proofErr w:type="spellStart"/>
+            <w:r>
+              <w:rPr>
+                <w:rFonts w:ascii="Arial" w:hAnsi="Arial" w:cs="Arial"/>
+                <w:sz w:val="20"/>
+                <w:szCs w:val="20"/>
+                <w:lang w:val="es-PE"/>
+              </w:rPr>
+              <w:t>Systems</w:t>
+            </w:r>
+            <w:proofErr w:type="spellEnd"/>
+            <w:r>
+              <w:rPr>
+                <w:rFonts w:ascii="Arial" w:hAnsi="Arial" w:cs="Arial"/>
+                <w:sz w:val="20"/>
+                <w:szCs w:val="20"/>
+                <w:lang w:val="es-PE"/>
+              </w:rPr>
+              <w:t xml:space="preserve"> Manager para automatizar y simplificar la gestión de la infraestructura en la nube?</w:t>
             </w:r>
           </w:p>
         </w:tc>
@@ -2466,7 +2849,108 @@
                 <w:szCs w:val="20"/>
                 <w:lang w:val="es-PE"/>
               </w:rPr>
-              <w:t> </w:t>
+              <w:t xml:space="preserve">AWS </w:t>
+            </w:r>
+            <w:proofErr w:type="spellStart"/>
+            <w:r>
+              <w:rPr>
+                <w:rFonts w:ascii="Arial" w:hAnsi="Arial" w:cs="Arial"/>
+                <w:sz w:val="20"/>
+                <w:szCs w:val="20"/>
+                <w:lang w:val="es-PE"/>
+              </w:rPr>
+              <w:t>Systems</w:t>
+            </w:r>
+            <w:proofErr w:type="spellEnd"/>
+            <w:r>
+              <w:rPr>
+                <w:rFonts w:ascii="Arial" w:hAnsi="Arial" w:cs="Arial"/>
+                <w:sz w:val="20"/>
+                <w:szCs w:val="20"/>
+                <w:lang w:val="es-PE"/>
+              </w:rPr>
+              <w:t xml:space="preserve"> Manager se utiliza para automatizar la gestión, el parcheo y el acceso a flotas de servidores EC2. Sin embargo, dado que la arquitectura del proyecto propuesto es 100% </w:t>
+            </w:r>
+            <w:proofErr w:type="spellStart"/>
+            <w:r>
+              <w:rPr>
+                <w:rFonts w:ascii="Arial" w:hAnsi="Arial" w:cs="Arial"/>
+                <w:sz w:val="20"/>
+                <w:szCs w:val="20"/>
+                <w:lang w:val="es-PE"/>
+              </w:rPr>
+              <w:t>serverless</w:t>
+            </w:r>
+            <w:proofErr w:type="spellEnd"/>
+            <w:r>
+              <w:rPr>
+                <w:rFonts w:ascii="Arial" w:hAnsi="Arial" w:cs="Arial"/>
+                <w:sz w:val="20"/>
+                <w:szCs w:val="20"/>
+                <w:lang w:val="es-PE"/>
+              </w:rPr>
+              <w:t xml:space="preserve"> y no emplea ninguna instancia EC2, </w:t>
+            </w:r>
+            <w:proofErr w:type="spellStart"/>
+            <w:r>
+              <w:rPr>
+                <w:rFonts w:ascii="Arial" w:hAnsi="Arial" w:cs="Arial"/>
+                <w:sz w:val="20"/>
+                <w:szCs w:val="20"/>
+                <w:lang w:val="es-PE"/>
+              </w:rPr>
+              <w:t>Systems</w:t>
+            </w:r>
+            <w:proofErr w:type="spellEnd"/>
+            <w:r>
+              <w:rPr>
+                <w:rFonts w:ascii="Arial" w:hAnsi="Arial" w:cs="Arial"/>
+                <w:sz w:val="20"/>
+                <w:szCs w:val="20"/>
+                <w:lang w:val="es-PE"/>
+              </w:rPr>
+              <w:t xml:space="preserve"> Manager no es aplicable. </w:t>
+            </w:r>
+          </w:p>
+          <w:p>
+            <w:pPr>
+              <w:spacing w:before="120"/>
+              <w:ind w:left="284"/>
+              <w:rPr>
+                <w:rFonts w:ascii="Arial" w:hAnsi="Arial" w:cs="Arial"/>
+                <w:sz w:val="20"/>
+                <w:szCs w:val="20"/>
+                <w:lang w:val="es-PE"/>
+              </w:rPr>
+            </w:pPr>
+            <w:r>
+              <w:rPr>
+                <w:rFonts w:ascii="Arial" w:hAnsi="Arial" w:cs="Arial"/>
+                <w:sz w:val="20"/>
+                <w:szCs w:val="20"/>
+                <w:lang w:val="es-PE"/>
+              </w:rPr>
+              <w:t xml:space="preserve">Uno de los beneficios fundamentales del modelo </w:t>
+            </w:r>
+            <w:proofErr w:type="spellStart"/>
+            <w:r>
+              <w:rPr>
+                <w:rFonts w:ascii="Arial" w:hAnsi="Arial" w:cs="Arial"/>
+                <w:sz w:val="20"/>
+                <w:szCs w:val="20"/>
+                <w:lang w:val="es-PE"/>
+              </w:rPr>
+              <w:t>serverless</w:t>
+            </w:r>
+            <w:proofErr w:type="spellEnd"/>
+            <w:r>
+              <w:rPr>
+                <w:rFonts w:ascii="Arial" w:hAnsi="Arial" w:cs="Arial"/>
+                <w:sz w:val="20"/>
+                <w:szCs w:val="20"/>
+                <w:lang w:val="es-PE"/>
+              </w:rPr>
+              <w:t xml:space="preserve"> es precisamente la eliminación de la necesidad de gestionar servidores, ya que AWS se encarga de toda la administración de la infraestructura subyacente, lo que simplifica drásticamente las operaciones.</w:t>
             </w:r>
           </w:p>
         </w:tc>
@@ -2734,6 +3218,18 @@
     </w:p>
     <w:p>
       <w:pPr>
+        <w:pStyle w:val="Prrafodelista"/>
+        <w:ind w:left="567" w:hanging="567"/>
+        <w:rPr>
+          <w:rFonts w:ascii="Arial" w:hAnsi="Arial" w:cs="Arial"/>
+          <w:b/>
+          <w:bCs/>
+          <w:color w:val="0000FF"/>
+        </w:rPr>
+      </w:pPr>
+    </w:p>
+    <w:p>
+      <w:pPr>
         <w:rPr>
           <w:rFonts w:ascii="Arial" w:hAnsi="Arial" w:cs="Arial"/>
           <w:b/>
@@ -2804,6 +3300,7 @@
                 <w:szCs w:val="20"/>
               </w:rPr>
             </w:pPr>
+            <w:proofErr w:type="spellStart"/>
             <w:r>
               <w:rPr>
                 <w:rFonts w:ascii="Arial" w:hAnsi="Arial" w:cs="Arial"/>
@@ -2814,6 +3311,7 @@
               </w:rPr>
               <w:t>N°</w:t>
             </w:r>
+            <w:proofErr w:type="spellEnd"/>
           </w:p>
         </w:tc>
         <w:tc>
@@ -3117,7 +3615,23 @@
                 <w:sz w:val="20"/>
                 <w:szCs w:val="20"/>
               </w:rPr>
-              <w:t>28/09</w:t>
+              <w:t>15</w:t>
+            </w:r>
+            <w:r>
+              <w:rPr>
+                <w:rFonts w:ascii="Arial" w:hAnsi="Arial" w:cs="Arial"/>
+                <w:sz w:val="20"/>
+                <w:szCs w:val="20"/>
+              </w:rPr>
+              <w:t>/</w:t>
+            </w:r>
+            <w:r>
+              <w:rPr>
+                <w:rFonts w:ascii="Arial" w:hAnsi="Arial" w:cs="Arial"/>
+                <w:sz w:val="20"/>
+                <w:szCs w:val="20"/>
+              </w:rPr>
+              <w:t>10</w:t>
             </w:r>
           </w:p>
         </w:tc>
@@ -3141,7 +3655,31 @@
                 <w:sz w:val="20"/>
                 <w:szCs w:val="20"/>
               </w:rPr>
-              <w:t>05/10</w:t>
+              <w:t>2</w:t>
+            </w:r>
+            <w:r>
+              <w:rPr>
+                <w:rFonts w:ascii="Arial" w:hAnsi="Arial" w:cs="Arial"/>
+                <w:sz w:val="20"/>
+                <w:szCs w:val="20"/>
+              </w:rPr>
+              <w:t>0</w:t>
+            </w:r>
+            <w:r>
+              <w:rPr>
+                <w:rFonts w:ascii="Arial" w:hAnsi="Arial" w:cs="Arial"/>
+                <w:sz w:val="20"/>
+                <w:szCs w:val="20"/>
+              </w:rPr>
+              <w:t>/</w:t>
+            </w:r>
+            <w:r>
+              <w:rPr>
+                <w:rFonts w:ascii="Arial" w:hAnsi="Arial" w:cs="Arial"/>
+                <w:sz w:val="20"/>
+                <w:szCs w:val="20"/>
+              </w:rPr>
+              <w:t>10</w:t>
             </w:r>
           </w:p>
         </w:tc>
@@ -3282,23 +3820,15 @@
                 <w:sz w:val="20"/>
                 <w:szCs w:val="20"/>
               </w:rPr>
-              <w:t>0</w:t>
-            </w:r>
-            <w:r>
-              <w:rPr>
-                <w:rFonts w:ascii="Arial" w:hAnsi="Arial" w:cs="Arial"/>
-                <w:sz w:val="20"/>
-                <w:szCs w:val="20"/>
-              </w:rPr>
-              <w:t>6</w:t>
-            </w:r>
-            <w:r>
-              <w:rPr>
-                <w:rFonts w:ascii="Arial" w:hAnsi="Arial" w:cs="Arial"/>
-                <w:sz w:val="20"/>
-                <w:szCs w:val="20"/>
-              </w:rPr>
-              <w:t>/10</w:t>
+              <w:t>24/</w:t>
+            </w:r>
+            <w:r>
+              <w:rPr>
+                <w:rFonts w:ascii="Arial" w:hAnsi="Arial" w:cs="Arial"/>
+                <w:sz w:val="20"/>
+                <w:szCs w:val="20"/>
+              </w:rPr>
+              <w:t>10</w:t>
             </w:r>
           </w:p>
         </w:tc>
@@ -3322,15 +3852,31 @@
                 <w:sz w:val="20"/>
                 <w:szCs w:val="20"/>
               </w:rPr>
+              <w:t>2</w:t>
+            </w:r>
+            <w:r>
+              <w:rPr>
+                <w:rFonts w:ascii="Arial" w:hAnsi="Arial" w:cs="Arial"/>
+                <w:sz w:val="20"/>
+                <w:szCs w:val="20"/>
+              </w:rPr>
+              <w:t>7</w:t>
+            </w:r>
+            <w:r>
+              <w:rPr>
+                <w:rFonts w:ascii="Arial" w:hAnsi="Arial" w:cs="Arial"/>
+                <w:sz w:val="20"/>
+                <w:szCs w:val="20"/>
+              </w:rPr>
+              <w:t>/</w:t>
+            </w:r>
+            <w:r>
+              <w:rPr>
+                <w:rFonts w:ascii="Arial" w:hAnsi="Arial" w:cs="Arial"/>
+                <w:sz w:val="20"/>
+                <w:szCs w:val="20"/>
+              </w:rPr>
               <w:t>10</w:t>
-            </w:r>
-            <w:r>
-              <w:rPr>
-                <w:rFonts w:ascii="Arial" w:hAnsi="Arial" w:cs="Arial"/>
-                <w:sz w:val="20"/>
-                <w:szCs w:val="20"/>
-              </w:rPr>
-              <w:t>/10</w:t>
             </w:r>
           </w:p>
         </w:tc>
@@ -3471,15 +4017,23 @@
                 <w:sz w:val="20"/>
                 <w:szCs w:val="20"/>
               </w:rPr>
-              <w:t>11</w:t>
-            </w:r>
-            <w:r>
-              <w:rPr>
-                <w:rFonts w:ascii="Arial" w:hAnsi="Arial" w:cs="Arial"/>
-                <w:sz w:val="20"/>
-                <w:szCs w:val="20"/>
-              </w:rPr>
-              <w:t>/10</w:t>
+              <w:t>30</w:t>
+            </w:r>
+            <w:r>
+              <w:rPr>
+                <w:rFonts w:ascii="Arial" w:hAnsi="Arial" w:cs="Arial"/>
+                <w:sz w:val="20"/>
+                <w:szCs w:val="20"/>
+              </w:rPr>
+              <w:t>/</w:t>
+            </w:r>
+            <w:r>
+              <w:rPr>
+                <w:rFonts w:ascii="Arial" w:hAnsi="Arial" w:cs="Arial"/>
+                <w:sz w:val="20"/>
+                <w:szCs w:val="20"/>
+              </w:rPr>
+              <w:t>10</w:t>
             </w:r>
           </w:p>
         </w:tc>
@@ -3503,15 +4057,31 @@
                 <w:sz w:val="20"/>
                 <w:szCs w:val="20"/>
               </w:rPr>
-              <w:t>15</w:t>
-            </w:r>
-            <w:r>
-              <w:rPr>
-                <w:rFonts w:ascii="Arial" w:hAnsi="Arial" w:cs="Arial"/>
-                <w:sz w:val="20"/>
-                <w:szCs w:val="20"/>
-              </w:rPr>
-              <w:t>/10</w:t>
+              <w:t>0</w:t>
+            </w:r>
+            <w:r>
+              <w:rPr>
+                <w:rFonts w:ascii="Arial" w:hAnsi="Arial" w:cs="Arial"/>
+                <w:sz w:val="20"/>
+                <w:szCs w:val="20"/>
+              </w:rPr>
+              <w:t>3</w:t>
+            </w:r>
+            <w:r>
+              <w:rPr>
+                <w:rFonts w:ascii="Arial" w:hAnsi="Arial" w:cs="Arial"/>
+                <w:sz w:val="20"/>
+                <w:szCs w:val="20"/>
+              </w:rPr>
+              <w:t>/</w:t>
+            </w:r>
+            <w:r>
+              <w:rPr>
+                <w:rFonts w:ascii="Arial" w:hAnsi="Arial" w:cs="Arial"/>
+                <w:sz w:val="20"/>
+                <w:szCs w:val="20"/>
+              </w:rPr>
+              <w:t>11</w:t>
             </w:r>
           </w:p>
         </w:tc>
@@ -3652,15 +4222,23 @@
                 <w:sz w:val="20"/>
                 <w:szCs w:val="20"/>
               </w:rPr>
-              <w:t>16</w:t>
-            </w:r>
-            <w:r>
-              <w:rPr>
-                <w:rFonts w:ascii="Arial" w:hAnsi="Arial" w:cs="Arial"/>
-                <w:sz w:val="20"/>
-                <w:szCs w:val="20"/>
-              </w:rPr>
-              <w:t>/10</w:t>
+              <w:t>05</w:t>
+            </w:r>
+            <w:r>
+              <w:rPr>
+                <w:rFonts w:ascii="Arial" w:hAnsi="Arial" w:cs="Arial"/>
+                <w:sz w:val="20"/>
+                <w:szCs w:val="20"/>
+              </w:rPr>
+              <w:t>/</w:t>
+            </w:r>
+            <w:r>
+              <w:rPr>
+                <w:rFonts w:ascii="Arial" w:hAnsi="Arial" w:cs="Arial"/>
+                <w:sz w:val="20"/>
+                <w:szCs w:val="20"/>
+              </w:rPr>
+              <w:t>11</w:t>
             </w:r>
           </w:p>
         </w:tc>
@@ -3684,15 +4262,31 @@
                 <w:sz w:val="20"/>
                 <w:szCs w:val="20"/>
               </w:rPr>
-              <w:t>20</w:t>
-            </w:r>
-            <w:r>
-              <w:rPr>
-                <w:rFonts w:ascii="Arial" w:hAnsi="Arial" w:cs="Arial"/>
-                <w:sz w:val="20"/>
-                <w:szCs w:val="20"/>
-              </w:rPr>
-              <w:t>/10</w:t>
+              <w:t>1</w:t>
+            </w:r>
+            <w:r>
+              <w:rPr>
+                <w:rFonts w:ascii="Arial" w:hAnsi="Arial" w:cs="Arial"/>
+                <w:sz w:val="20"/>
+                <w:szCs w:val="20"/>
+              </w:rPr>
+              <w:t>4</w:t>
+            </w:r>
+            <w:r>
+              <w:rPr>
+                <w:rFonts w:ascii="Arial" w:hAnsi="Arial" w:cs="Arial"/>
+                <w:sz w:val="20"/>
+                <w:szCs w:val="20"/>
+              </w:rPr>
+              <w:t>/</w:t>
+            </w:r>
+            <w:r>
+              <w:rPr>
+                <w:rFonts w:ascii="Arial" w:hAnsi="Arial" w:cs="Arial"/>
+                <w:sz w:val="20"/>
+                <w:szCs w:val="20"/>
+              </w:rPr>
+              <w:t>11</w:t>
             </w:r>
           </w:p>
         </w:tc>
@@ -3833,15 +4427,23 @@
                 <w:sz w:val="20"/>
                 <w:szCs w:val="20"/>
               </w:rPr>
-              <w:t>21</w:t>
-            </w:r>
-            <w:r>
-              <w:rPr>
-                <w:rFonts w:ascii="Arial" w:hAnsi="Arial" w:cs="Arial"/>
-                <w:sz w:val="20"/>
-                <w:szCs w:val="20"/>
-              </w:rPr>
-              <w:t>/10</w:t>
+              <w:t>19</w:t>
+            </w:r>
+            <w:r>
+              <w:rPr>
+                <w:rFonts w:ascii="Arial" w:hAnsi="Arial" w:cs="Arial"/>
+                <w:sz w:val="20"/>
+                <w:szCs w:val="20"/>
+              </w:rPr>
+              <w:t>/</w:t>
+            </w:r>
+            <w:r>
+              <w:rPr>
+                <w:rFonts w:ascii="Arial" w:hAnsi="Arial" w:cs="Arial"/>
+                <w:sz w:val="20"/>
+                <w:szCs w:val="20"/>
+              </w:rPr>
+              <w:t>11</w:t>
             </w:r>
           </w:p>
         </w:tc>
@@ -3865,156 +4467,24 @@
                 <w:sz w:val="20"/>
                 <w:szCs w:val="20"/>
               </w:rPr>
-              <w:t>25</w:t>
-            </w:r>
-            <w:r>
-              <w:rPr>
-                <w:rFonts w:ascii="Arial" w:hAnsi="Arial" w:cs="Arial"/>
-                <w:sz w:val="20"/>
-                <w:szCs w:val="20"/>
-              </w:rPr>
-              <w:t>/10</w:t>
-            </w:r>
-          </w:p>
-        </w:tc>
-        <w:tc>
-          <w:tcPr>
-            <w:tcW w:w="712" w:type="dxa"/>
-            <w:vAlign w:val="center"/>
-          </w:tcPr>
-          <w:p>
-            <w:pPr>
-              <w:jc w:val="center"/>
-              <w:rPr>
-                <w:rFonts w:ascii="Arial" w:hAnsi="Arial" w:cs="Arial"/>
-                <w:sz w:val="20"/>
-                <w:szCs w:val="20"/>
-              </w:rPr>
-            </w:pPr>
-          </w:p>
-        </w:tc>
-        <w:tc>
-          <w:tcPr>
-            <w:tcW w:w="713" w:type="dxa"/>
-            <w:vAlign w:val="center"/>
-          </w:tcPr>
-          <w:p>
-            <w:pPr>
-              <w:jc w:val="center"/>
-              <w:rPr>
-                <w:rFonts w:ascii="Arial" w:hAnsi="Arial" w:cs="Arial"/>
-                <w:sz w:val="20"/>
-                <w:szCs w:val="20"/>
-              </w:rPr>
-            </w:pPr>
-          </w:p>
-        </w:tc>
-        <w:tc>
-          <w:tcPr>
-            <w:tcW w:w="718" w:type="dxa"/>
-            <w:vAlign w:val="center"/>
-          </w:tcPr>
-          <w:p>
-            <w:pPr>
-              <w:jc w:val="center"/>
-              <w:rPr>
-                <w:rFonts w:ascii="Arial" w:hAnsi="Arial" w:cs="Arial"/>
-                <w:sz w:val="20"/>
-                <w:szCs w:val="20"/>
-              </w:rPr>
-            </w:pPr>
-          </w:p>
-        </w:tc>
-        <w:tc>
-          <w:tcPr>
-            <w:tcW w:w="595" w:type="dxa"/>
-            <w:vAlign w:val="center"/>
-          </w:tcPr>
-          <w:p>
-            <w:pPr>
-              <w:jc w:val="center"/>
-              <w:rPr>
-                <w:rFonts w:ascii="Arial" w:hAnsi="Arial" w:cs="Arial"/>
-                <w:sz w:val="20"/>
-                <w:szCs w:val="20"/>
-              </w:rPr>
-            </w:pPr>
-          </w:p>
-        </w:tc>
-      </w:tr>
-      <w:tr>
-        <w:trPr>
-          <w:trHeight w:val="409"/>
-        </w:trPr>
-        <w:tc>
-          <w:tcPr>
-            <w:tcW w:w="567" w:type="dxa"/>
-            <w:vAlign w:val="center"/>
-          </w:tcPr>
-          <w:p>
-            <w:pPr>
-              <w:jc w:val="center"/>
-              <w:rPr>
-                <w:rFonts w:ascii="Arial" w:hAnsi="Arial" w:cs="Arial"/>
-                <w:sz w:val="20"/>
-                <w:szCs w:val="20"/>
-              </w:rPr>
-            </w:pPr>
-            <w:r>
-              <w:rPr>
-                <w:rFonts w:ascii="Arial" w:hAnsi="Arial" w:cs="Arial"/>
-                <w:sz w:val="20"/>
-                <w:szCs w:val="20"/>
-              </w:rPr>
-              <w:t>6</w:t>
-            </w:r>
-          </w:p>
-        </w:tc>
-        <w:tc>
-          <w:tcPr>
-            <w:tcW w:w="4191" w:type="dxa"/>
-            <w:vAlign w:val="center"/>
-          </w:tcPr>
-          <w:p>
-            <w:pPr>
-              <w:rPr>
-                <w:rFonts w:ascii="Arial" w:hAnsi="Arial" w:cs="Arial"/>
-                <w:sz w:val="20"/>
-                <w:szCs w:val="20"/>
-              </w:rPr>
-            </w:pPr>
-          </w:p>
-        </w:tc>
-        <w:tc>
-          <w:tcPr>
-            <w:tcW w:w="717" w:type="dxa"/>
-            <w:vAlign w:val="center"/>
-          </w:tcPr>
-          <w:p>
-            <w:pPr>
-              <w:jc w:val="center"/>
-              <w:rPr>
-                <w:rFonts w:ascii="Arial" w:hAnsi="Arial" w:cs="Arial"/>
-                <w:sz w:val="20"/>
-                <w:szCs w:val="20"/>
-              </w:rPr>
-            </w:pPr>
-          </w:p>
-        </w:tc>
-        <w:tc>
-          <w:tcPr>
-            <w:tcW w:w="717" w:type="dxa"/>
-            <w:vAlign w:val="center"/>
-          </w:tcPr>
-          <w:p>
-            <w:pPr>
-              <w:jc w:val="center"/>
-              <w:rPr>
-                <w:rFonts w:ascii="Arial" w:hAnsi="Arial" w:cs="Arial"/>
-                <w:sz w:val="20"/>
-                <w:szCs w:val="20"/>
-              </w:rPr>
-            </w:pPr>
+              <w:t>22</w:t>
+            </w:r>
+            <w:r>
+              <w:rPr>
+                <w:rFonts w:ascii="Arial" w:hAnsi="Arial" w:cs="Arial"/>
+                <w:sz w:val="20"/>
+                <w:szCs w:val="20"/>
+              </w:rPr>
+              <w:t>/</w:t>
+            </w:r>
+            <w:r>
+              <w:rPr>
+                <w:rFonts w:ascii="Arial" w:hAnsi="Arial" w:cs="Arial"/>
+                <w:sz w:val="20"/>
+                <w:szCs w:val="20"/>
+              </w:rPr>
+              <w:t>11</w:t>
+            </w:r>
           </w:p>
         </w:tc>
         <w:tc>
@@ -4651,6 +5121,40 @@
                 <w:rFonts w:ascii="Arial" w:hAnsi="Arial" w:cs="Arial"/>
               </w:rPr>
             </w:pPr>
+            <w:r>
+              <w:rPr>
+                <w:rFonts w:ascii="Arial" w:hAnsi="Arial" w:cs="Arial"/>
+              </w:rPr>
+              <w:t xml:space="preserve">IDE de Desarrollo (Android Studio, VS </w:t>
+            </w:r>
+            <w:proofErr w:type="spellStart"/>
+            <w:r>
+              <w:rPr>
+                <w:rFonts w:ascii="Arial" w:hAnsi="Arial" w:cs="Arial"/>
+              </w:rPr>
+              <w:t>Code</w:t>
+            </w:r>
+            <w:proofErr w:type="spellEnd"/>
+            <w:r>
+              <w:rPr>
+                <w:rFonts w:ascii="Arial" w:hAnsi="Arial" w:cs="Arial"/>
+              </w:rPr>
+              <w:t xml:space="preserve"> con </w:t>
+            </w:r>
+            <w:proofErr w:type="spellStart"/>
+            <w:r>
+              <w:rPr>
+                <w:rFonts w:ascii="Arial" w:hAnsi="Arial" w:cs="Arial"/>
+              </w:rPr>
+              <w:t>PlatformIO</w:t>
+            </w:r>
+            <w:proofErr w:type="spellEnd"/>
+            <w:r>
+              <w:rPr>
+                <w:rFonts w:ascii="Arial" w:hAnsi="Arial" w:cs="Arial"/>
+              </w:rPr>
+              <w:t>)</w:t>
+            </w:r>
           </w:p>
         </w:tc>
         <w:tc>
@@ -4670,6 +5174,13 @@
                 <w:rFonts w:ascii="Arial" w:hAnsi="Arial" w:cs="Arial"/>
               </w:rPr>
             </w:pPr>
+            <w:r>
+              <w:rPr>
+                <w:rFonts w:ascii="Arial" w:hAnsi="Arial" w:cs="Arial"/>
+                <w:szCs w:val="20"/>
+              </w:rPr>
+              <w:t>Múltiple</w:t>
+            </w:r>
           </w:p>
         </w:tc>
       </w:tr>
@@ -4698,6 +5209,29 @@
                 <w:spacing w:val="-3"/>
               </w:rPr>
             </w:pPr>
+            <w:r>
+              <w:rPr>
+                <w:rFonts w:ascii="Arial" w:hAnsi="Arial" w:cs="Arial"/>
+                <w:spacing w:val="-3"/>
+              </w:rPr>
+              <w:t>Lenguajes de Programación (</w:t>
+            </w:r>
+            <w:proofErr w:type="spellStart"/>
+            <w:r>
+              <w:rPr>
+                <w:rFonts w:ascii="Arial" w:hAnsi="Arial" w:cs="Arial"/>
+                <w:spacing w:val="-3"/>
+              </w:rPr>
+              <w:t>Kotlin</w:t>
+            </w:r>
+            <w:proofErr w:type="spellEnd"/>
+            <w:r>
+              <w:rPr>
+                <w:rFonts w:ascii="Arial" w:hAnsi="Arial" w:cs="Arial"/>
+                <w:spacing w:val="-3"/>
+              </w:rPr>
+              <w:t>, C++)</w:t>
+            </w:r>
           </w:p>
         </w:tc>
         <w:tc>
@@ -4718,6 +5252,13 @@
                 <w:szCs w:val="20"/>
               </w:rPr>
             </w:pPr>
+            <w:r>
+              <w:rPr>
+                <w:rFonts w:ascii="Arial" w:hAnsi="Arial" w:cs="Arial"/>
+                <w:szCs w:val="20"/>
+              </w:rPr>
+              <w:t>1</w:t>
+            </w:r>
           </w:p>
         </w:tc>
       </w:tr>
@@ -4745,6 +5286,54 @@
                 <w:rFonts w:ascii="Arial" w:hAnsi="Arial" w:cs="Arial"/>
               </w:rPr>
             </w:pPr>
+            <w:r>
+              <w:rPr>
+                <w:rFonts w:ascii="Arial" w:hAnsi="Arial" w:cs="Arial"/>
+              </w:rPr>
+              <w:t>Servicios de AWS (</w:t>
+            </w:r>
+            <w:proofErr w:type="spellStart"/>
+            <w:r>
+              <w:rPr>
+                <w:rFonts w:ascii="Arial" w:hAnsi="Arial" w:cs="Arial"/>
+              </w:rPr>
+              <w:t>Amplify</w:t>
+            </w:r>
+            <w:proofErr w:type="spellEnd"/>
+            <w:r>
+              <w:rPr>
+                <w:rFonts w:ascii="Arial" w:hAnsi="Arial" w:cs="Arial"/>
+              </w:rPr>
+              <w:t xml:space="preserve">, </w:t>
+            </w:r>
+            <w:proofErr w:type="spellStart"/>
+            <w:r>
+              <w:rPr>
+                <w:rFonts w:ascii="Arial" w:hAnsi="Arial" w:cs="Arial"/>
+              </w:rPr>
+              <w:t>DynamoDB</w:t>
+            </w:r>
+            <w:proofErr w:type="spellEnd"/>
+            <w:r>
+              <w:rPr>
+                <w:rFonts w:ascii="Arial" w:hAnsi="Arial" w:cs="Arial"/>
+              </w:rPr>
+              <w:t xml:space="preserve">, S3, </w:t>
+            </w:r>
+            <w:proofErr w:type="spellStart"/>
+            <w:r>
+              <w:rPr>
+                <w:rFonts w:ascii="Arial" w:hAnsi="Arial" w:cs="Arial"/>
+              </w:rPr>
+              <w:t>Cognito</w:t>
+            </w:r>
+            <w:proofErr w:type="spellEnd"/>
+            <w:r>
+              <w:rPr>
+                <w:rFonts w:ascii="Arial" w:hAnsi="Arial" w:cs="Arial"/>
+              </w:rPr>
+              <w:t>)</w:t>
+            </w:r>
           </w:p>
         </w:tc>
         <w:tc>
@@ -4765,6 +5354,13 @@
                 <w:szCs w:val="20"/>
               </w:rPr>
             </w:pPr>
+            <w:r>
+              <w:rPr>
+                <w:rFonts w:ascii="Arial" w:hAnsi="Arial" w:cs="Arial"/>
+                <w:szCs w:val="20"/>
+              </w:rPr>
+              <w:t>Múltiple</w:t>
+            </w:r>
           </w:p>
         </w:tc>
       </w:tr>
@@ -4792,6 +5388,32 @@
                 <w:rFonts w:ascii="Arial" w:hAnsi="Arial" w:cs="Arial"/>
               </w:rPr>
             </w:pPr>
+            <w:r>
+              <w:rPr>
+                <w:rFonts w:ascii="Arial" w:hAnsi="Arial" w:cs="Arial"/>
+              </w:rPr>
+              <w:t xml:space="preserve">Entorno de Desarrollo Embebido (Arduino IDE / </w:t>
+            </w:r>
+            <w:proofErr w:type="spellStart"/>
+            <w:r>
+              <w:rPr>
+                <w:rFonts w:ascii="Arial" w:hAnsi="Arial" w:cs="Arial"/>
+              </w:rPr>
+              <w:t>PlatformIO</w:t>
+            </w:r>
+            <w:proofErr w:type="spellEnd"/>
+            <w:r>
+              <w:rPr>
+                <w:rFonts w:ascii="Arial" w:hAnsi="Arial" w:cs="Arial"/>
+              </w:rPr>
+              <w:t>)</w:t>
+            </w:r>
+            <w:r>
+              <w:rPr>
+                <w:rFonts w:ascii="Arial" w:hAnsi="Arial" w:cs="Arial"/>
+              </w:rPr>
+              <w:tab/>
+            </w:r>
           </w:p>
         </w:tc>
         <w:tc>
@@ -4812,6 +5434,233 @@
                 <w:szCs w:val="20"/>
               </w:rPr>
             </w:pPr>
+            <w:r>
+              <w:rPr>
+                <w:rFonts w:ascii="Arial" w:hAnsi="Arial" w:cs="Arial"/>
+                <w:szCs w:val="20"/>
+              </w:rPr>
+              <w:t>Múltiple</w:t>
+            </w:r>
+          </w:p>
+        </w:tc>
+      </w:tr>
+      <w:tr>
+        <w:tc>
+          <w:tcPr>
+            <w:tcW w:w="7792" w:type="dxa"/>
+            <w:tcBorders>
+              <w:top w:val="single" w:sz="4" w:space="0" w:color="auto"/>
+              <w:left w:val="single" w:sz="4" w:space="0" w:color="auto"/>
+              <w:bottom w:val="single" w:sz="4" w:space="0" w:color="auto"/>
+              <w:right w:val="single" w:sz="4" w:space="0" w:color="auto"/>
+            </w:tcBorders>
+          </w:tcPr>
+          <w:p>
+            <w:pPr>
+              <w:tabs>
+                <w:tab w:val="left" w:pos="-720"/>
+                <w:tab w:val="left" w:pos="0"/>
+              </w:tabs>
+              <w:suppressAutoHyphens/>
+              <w:ind w:left="171"/>
+              <w:jc w:val="both"/>
+              <w:rPr>
+                <w:rFonts w:ascii="Arial" w:hAnsi="Arial" w:cs="Arial"/>
+              </w:rPr>
+            </w:pPr>
+            <w:r>
+              <w:rPr>
+                <w:rFonts w:ascii="Arial" w:hAnsi="Arial" w:cs="Arial"/>
+              </w:rPr>
+              <w:t>Documentación oficial (AWS, Android, ESP32)</w:t>
+            </w:r>
+            <w:r>
+              <w:rPr>
+                <w:rFonts w:ascii="Arial" w:hAnsi="Arial" w:cs="Arial"/>
+              </w:rPr>
+              <w:tab/>
+            </w:r>
+          </w:p>
+        </w:tc>
+        <w:tc>
+          <w:tcPr>
+            <w:tcW w:w="1275" w:type="dxa"/>
+            <w:tcBorders>
+              <w:top w:val="single" w:sz="4" w:space="0" w:color="auto"/>
+              <w:left w:val="single" w:sz="4" w:space="0" w:color="auto"/>
+              <w:bottom w:val="single" w:sz="4" w:space="0" w:color="auto"/>
+              <w:right w:val="single" w:sz="4" w:space="0" w:color="auto"/>
+            </w:tcBorders>
+          </w:tcPr>
+          <w:p>
+            <w:pPr>
+              <w:jc w:val="center"/>
+              <w:rPr>
+                <w:rFonts w:ascii="Arial" w:hAnsi="Arial" w:cs="Arial"/>
+                <w:szCs w:val="20"/>
+              </w:rPr>
+            </w:pPr>
+            <w:r>
+              <w:rPr>
+                <w:rFonts w:ascii="Arial" w:hAnsi="Arial" w:cs="Arial"/>
+                <w:szCs w:val="20"/>
+              </w:rPr>
+              <w:t>1</w:t>
+            </w:r>
+          </w:p>
+        </w:tc>
+      </w:tr>
+      <w:tr>
+        <w:tc>
+          <w:tcPr>
+            <w:tcW w:w="7792" w:type="dxa"/>
+            <w:tcBorders>
+              <w:top w:val="single" w:sz="4" w:space="0" w:color="auto"/>
+              <w:left w:val="single" w:sz="4" w:space="0" w:color="auto"/>
+              <w:bottom w:val="single" w:sz="4" w:space="0" w:color="auto"/>
+              <w:right w:val="single" w:sz="4" w:space="0" w:color="auto"/>
+            </w:tcBorders>
+          </w:tcPr>
+          <w:p>
+            <w:pPr>
+              <w:tabs>
+                <w:tab w:val="left" w:pos="-720"/>
+                <w:tab w:val="left" w:pos="0"/>
+              </w:tabs>
+              <w:suppressAutoHyphens/>
+              <w:ind w:left="171"/>
+              <w:jc w:val="both"/>
+              <w:rPr>
+                <w:rFonts w:ascii="Arial" w:hAnsi="Arial" w:cs="Arial"/>
+              </w:rPr>
+            </w:pPr>
+            <w:r>
+              <w:rPr>
+                <w:rFonts w:ascii="Arial" w:hAnsi="Arial" w:cs="Arial"/>
+              </w:rPr>
+              <w:t>Documentación oficial (</w:t>
+            </w:r>
+            <w:proofErr w:type="spellStart"/>
+            <w:r>
+              <w:rPr>
+                <w:rFonts w:ascii="Arial" w:hAnsi="Arial" w:cs="Arial"/>
+              </w:rPr>
+              <w:t>Databricks</w:t>
+            </w:r>
+            <w:proofErr w:type="spellEnd"/>
+            <w:r>
+              <w:rPr>
+                <w:rFonts w:ascii="Arial" w:hAnsi="Arial" w:cs="Arial"/>
+              </w:rPr>
+              <w:t xml:space="preserve">, </w:t>
+            </w:r>
+            <w:proofErr w:type="spellStart"/>
+            <w:r>
+              <w:rPr>
+                <w:rFonts w:ascii="Arial" w:hAnsi="Arial" w:cs="Arial"/>
+              </w:rPr>
+              <w:t>Spark</w:t>
+            </w:r>
+            <w:proofErr w:type="spellEnd"/>
+            <w:r>
+              <w:rPr>
+                <w:rFonts w:ascii="Arial" w:hAnsi="Arial" w:cs="Arial"/>
+              </w:rPr>
+              <w:t>)</w:t>
+            </w:r>
+            <w:r>
+              <w:rPr>
+                <w:rFonts w:ascii="Arial" w:hAnsi="Arial" w:cs="Arial"/>
+              </w:rPr>
+              <w:tab/>
+            </w:r>
+          </w:p>
+        </w:tc>
+        <w:tc>
+          <w:tcPr>
+            <w:tcW w:w="1275" w:type="dxa"/>
+            <w:tcBorders>
+              <w:top w:val="single" w:sz="4" w:space="0" w:color="auto"/>
+              <w:left w:val="single" w:sz="4" w:space="0" w:color="auto"/>
+              <w:bottom w:val="single" w:sz="4" w:space="0" w:color="auto"/>
+              <w:right w:val="single" w:sz="4" w:space="0" w:color="auto"/>
+            </w:tcBorders>
+          </w:tcPr>
+          <w:p>
+            <w:pPr>
+              <w:jc w:val="center"/>
+              <w:rPr>
+                <w:rFonts w:ascii="Arial" w:hAnsi="Arial" w:cs="Arial"/>
+                <w:szCs w:val="20"/>
+              </w:rPr>
+            </w:pPr>
+            <w:r>
+              <w:rPr>
+                <w:rFonts w:ascii="Arial" w:hAnsi="Arial" w:cs="Arial"/>
+                <w:szCs w:val="20"/>
+              </w:rPr>
+              <w:t>Múltiple</w:t>
+            </w:r>
+          </w:p>
+        </w:tc>
+      </w:tr>
+      <w:tr>
+        <w:tc>
+          <w:tcPr>
+            <w:tcW w:w="7792" w:type="dxa"/>
+            <w:tcBorders>
+              <w:top w:val="single" w:sz="4" w:space="0" w:color="auto"/>
+              <w:left w:val="single" w:sz="4" w:space="0" w:color="auto"/>
+              <w:bottom w:val="single" w:sz="4" w:space="0" w:color="auto"/>
+              <w:right w:val="single" w:sz="4" w:space="0" w:color="auto"/>
+            </w:tcBorders>
+          </w:tcPr>
+          <w:p>
+            <w:pPr>
+              <w:tabs>
+                <w:tab w:val="left" w:pos="-720"/>
+                <w:tab w:val="left" w:pos="0"/>
+              </w:tabs>
+              <w:suppressAutoHyphens/>
+              <w:ind w:left="171"/>
+              <w:jc w:val="both"/>
+              <w:rPr>
+                <w:rFonts w:ascii="Arial" w:hAnsi="Arial" w:cs="Arial"/>
+              </w:rPr>
+            </w:pPr>
+            <w:r>
+              <w:rPr>
+                <w:rFonts w:ascii="Arial" w:hAnsi="Arial" w:cs="Arial"/>
+              </w:rPr>
+              <w:t>Tutoriales y foros especializados en IoT y Desarrollo Móvil</w:t>
+            </w:r>
+          </w:p>
+        </w:tc>
+        <w:tc>
+          <w:tcPr>
+            <w:tcW w:w="1275" w:type="dxa"/>
+            <w:tcBorders>
+              <w:top w:val="single" w:sz="4" w:space="0" w:color="auto"/>
+              <w:left w:val="single" w:sz="4" w:space="0" w:color="auto"/>
+              <w:bottom w:val="single" w:sz="4" w:space="0" w:color="auto"/>
+              <w:right w:val="single" w:sz="4" w:space="0" w:color="auto"/>
+            </w:tcBorders>
+          </w:tcPr>
+          <w:p>
+            <w:pPr>
+              <w:jc w:val="center"/>
+              <w:rPr>
+                <w:rFonts w:ascii="Arial" w:hAnsi="Arial" w:cs="Arial"/>
+                <w:szCs w:val="20"/>
+              </w:rPr>
+            </w:pPr>
+            <w:r>
+              <w:rPr>
+                <w:rFonts w:ascii="Arial" w:hAnsi="Arial" w:cs="Arial"/>
+                <w:szCs w:val="20"/>
+              </w:rPr>
+              <w:t>Múltiple</w:t>
+            </w:r>
           </w:p>
         </w:tc>
       </w:tr>
@@ -5064,7 +5913,7 @@
                 <w:rFonts w:ascii="Arial" w:hAnsi="Arial" w:cs="Arial"/>
                 <w:szCs w:val="20"/>
               </w:rPr>
-              <w:t>6</w:t>
+              <w:t>Múltiple</w:t>
             </w:r>
           </w:p>
         </w:tc>
@@ -5184,7 +6033,7 @@
                 <w:rFonts w:ascii="Arial" w:hAnsi="Arial" w:cs="Arial"/>
                 <w:szCs w:val="20"/>
               </w:rPr>
-              <w:t>2</w:t>
+              <w:t>1</w:t>
             </w:r>
           </w:p>
         </w:tc>
@@ -5468,7 +6317,7 @@
         <w:tblLook w:val="01E0" w:firstRow="1" w:lastRow="1" w:firstColumn="1" w:lastColumn="1" w:noHBand="0" w:noVBand="0"/>
       </w:tblPr>
       <w:tblGrid>
-        <w:gridCol w:w="9078"/>
+        <w:gridCol w:w="9487"/>
       </w:tblGrid>
       <w:tr>
         <w:trPr>
@@ -5554,10 +6403,39 @@
               <w:rPr>
                 <w:rFonts w:ascii="Arial" w:hAnsi="Arial" w:cs="Arial"/>
                 <w:b/>
-                <w:sz w:val="20"/>
-                <w:szCs w:val="20"/>
-              </w:rPr>
-            </w:pPr>
+                <w:sz w:val="22"/>
+                <w:szCs w:val="22"/>
+              </w:rPr>
+            </w:pPr>
+            <w:r>
+              <w:rPr>
+                <w:rFonts w:ascii="Arial" w:hAnsi="Arial" w:cs="Arial"/>
+                <w:b/>
+                <w:sz w:val="22"/>
+                <w:szCs w:val="22"/>
+              </w:rPr>
+              <w:t xml:space="preserve">Como estrategia para fortalecer la seguridad y mitigar el riesgo de pérdidas, se propone la implementación de un sistema de vigilancia proactivo basado en el Internet de las Cosas (IoT) y una arquitectura </w:t>
+            </w:r>
+            <w:proofErr w:type="spellStart"/>
+            <w:r>
+              <w:rPr>
+                <w:rFonts w:ascii="Arial" w:hAnsi="Arial" w:cs="Arial"/>
+                <w:b/>
+                <w:sz w:val="22"/>
+                <w:szCs w:val="22"/>
+              </w:rPr>
+              <w:t>serverless</w:t>
+            </w:r>
+            <w:proofErr w:type="spellEnd"/>
+            <w:r>
+              <w:rPr>
+                <w:rFonts w:ascii="Arial" w:hAnsi="Arial" w:cs="Arial"/>
+                <w:b/>
+                <w:sz w:val="22"/>
+                <w:szCs w:val="22"/>
+              </w:rPr>
+              <w:t xml:space="preserve"> en la nube de AWS. Esta solución busca construir un ecosistema de seguridad inteligente para reemplazar el sistema de vigilancia pasivo y obsoleto actual. El objetivo es cambiar la gestión de la seguridad, de un proceso reactivo basado en el descubrimiento tardío de incidentes, a un modelo preventivo y de respuesta en tiempo real que es más ágil, eficiente y seguro, mitigando así el riesgo de pérdidas catastróficas.</w:t>
+            </w:r>
           </w:p>
           <w:p>
             <w:pPr>
@@ -5565,8 +6443,8 @@
               <w:rPr>
                 <w:rFonts w:ascii="Arial" w:hAnsi="Arial" w:cs="Arial"/>
                 <w:b/>
-                <w:sz w:val="20"/>
-                <w:szCs w:val="20"/>
+                <w:sz w:val="22"/>
+                <w:szCs w:val="22"/>
               </w:rPr>
             </w:pPr>
           </w:p>
@@ -5576,10 +6454,81 @@
               <w:rPr>
                 <w:rFonts w:ascii="Arial" w:hAnsi="Arial" w:cs="Arial"/>
                 <w:b/>
-                <w:sz w:val="20"/>
-                <w:szCs w:val="20"/>
-              </w:rPr>
-            </w:pPr>
+                <w:sz w:val="22"/>
+                <w:szCs w:val="22"/>
+              </w:rPr>
+            </w:pPr>
+            <w:r>
+              <w:rPr>
+                <w:rFonts w:ascii="Arial" w:hAnsi="Arial" w:cs="Arial"/>
+                <w:b/>
+                <w:sz w:val="22"/>
+                <w:szCs w:val="22"/>
+              </w:rPr>
+              <w:t xml:space="preserve">Esta plataforma utilizará un dispositivo de borde (ESP32-CAM con sensor PIR) para la detección autónoma de movimiento y la captura de evidencia. El </w:t>
+            </w:r>
+            <w:proofErr w:type="spellStart"/>
+            <w:r>
+              <w:rPr>
+                <w:rFonts w:ascii="Arial" w:hAnsi="Arial" w:cs="Arial"/>
+                <w:b/>
+                <w:sz w:val="22"/>
+                <w:szCs w:val="22"/>
+              </w:rPr>
+              <w:t>backend</w:t>
+            </w:r>
+            <w:proofErr w:type="spellEnd"/>
+            <w:r>
+              <w:rPr>
+                <w:rFonts w:ascii="Arial" w:hAnsi="Arial" w:cs="Arial"/>
+                <w:b/>
+                <w:sz w:val="22"/>
+                <w:szCs w:val="22"/>
+              </w:rPr>
+              <w:t xml:space="preserve"> se desplegará en AWS utilizando AWS </w:t>
+            </w:r>
+            <w:proofErr w:type="spellStart"/>
+            <w:r>
+              <w:rPr>
+                <w:rFonts w:ascii="Arial" w:hAnsi="Arial" w:cs="Arial"/>
+                <w:b/>
+                <w:sz w:val="22"/>
+                <w:szCs w:val="22"/>
+              </w:rPr>
+              <w:t>Amplify</w:t>
+            </w:r>
+            <w:proofErr w:type="spellEnd"/>
+            <w:r>
+              <w:rPr>
+                <w:rFonts w:ascii="Arial" w:hAnsi="Arial" w:cs="Arial"/>
+                <w:b/>
+                <w:sz w:val="22"/>
+                <w:szCs w:val="22"/>
+              </w:rPr>
+              <w:t xml:space="preserve"> para orquestar los servicios. Las capturas de imagen se almacenarán de forma segura en Amazon S3 y los metadatos de los eventos en una base de datos </w:t>
+            </w:r>
+            <w:proofErr w:type="spellStart"/>
+            <w:r>
+              <w:rPr>
+                <w:rFonts w:ascii="Arial" w:hAnsi="Arial" w:cs="Arial"/>
+                <w:b/>
+                <w:sz w:val="22"/>
+                <w:szCs w:val="22"/>
+              </w:rPr>
+              <w:t>DynamoDB</w:t>
+            </w:r>
+            <w:proofErr w:type="spellEnd"/>
+            <w:r>
+              <w:rPr>
+                <w:rFonts w:ascii="Arial" w:hAnsi="Arial" w:cs="Arial"/>
+                <w:b/>
+                <w:sz w:val="22"/>
+                <w:szCs w:val="22"/>
+              </w:rPr>
+              <w:t>. El sistema notificará al usuario a través de una aplicación móvil nativa en Android, que servirá como el centro de control y monitoreo, permitiendo una respuesta inmediata.</w:t>
+            </w:r>
+            <w:bookmarkStart w:id="1" w:name="_GoBack"/>
+            <w:bookmarkEnd w:id="1"/>
           </w:p>
           <w:p>
             <w:pPr>
@@ -5587,14 +6536,15 @@
               <w:rPr>
                 <w:rFonts w:ascii="Arial" w:hAnsi="Arial" w:cs="Arial"/>
                 <w:b/>
-                <w:sz w:val="20"/>
-                <w:szCs w:val="20"/>
+                <w:sz w:val="22"/>
+                <w:szCs w:val="22"/>
               </w:rPr>
             </w:pPr>
           </w:p>
           <w:p>
             <w:pPr>
               <w:spacing w:before="120" w:line="276" w:lineRule="auto"/>
+              <w:jc w:val="center"/>
               <w:rPr>
                 <w:rFonts w:ascii="Arial" w:hAnsi="Arial" w:cs="Arial"/>
                 <w:b/>
@@ -5602,6 +6552,76 @@
                 <w:szCs w:val="20"/>
               </w:rPr>
             </w:pPr>
+            <w:r>
+              <w:rPr>
+                <w:noProof/>
+              </w:rPr>
+              <w:drawing>
+                <wp:anchor distT="0" distB="0" distL="114300" distR="114300" simplePos="0" relativeHeight="251713536" behindDoc="0" locked="0" layoutInCell="1" allowOverlap="1" wp14:anchorId="407A4967" wp14:editId="1EA5F3ED">
+                  <wp:simplePos x="0" y="0"/>
+                  <wp:positionH relativeFrom="margin">
+                    <wp:posOffset>-65273</wp:posOffset>
+                  </wp:positionH>
+                  <wp:positionV relativeFrom="margin">
+                    <wp:posOffset>3924242</wp:posOffset>
+                  </wp:positionV>
+                  <wp:extent cx="6032500" cy="3446145"/>
+                  <wp:effectExtent l="0" t="0" r="6350" b="1905"/>
+                  <wp:wrapSquare wrapText="bothSides"/>
+                  <wp:docPr id="4" name="Imagen 4"/>
+                  <wp:cNvGraphicFramePr>
+                    <a:graphicFrameLocks xmlns:a="http://schemas.openxmlformats.org/drawingml/2006/main" noChangeAspect="1"/>
+                  </wp:cNvGraphicFramePr>
+                  <a:graphic xmlns:a="http://schemas.openxmlformats.org/drawingml/2006/main">
+                    <a:graphicData uri="http://schemas.openxmlformats.org/drawingml/2006/picture">
+                      <pic:pic xmlns:pic="http://schemas.openxmlformats.org/drawingml/2006/picture">
+                        <pic:nvPicPr>
+                          <pic:cNvPr id="0" name="Picture 6"/>
+                          <pic:cNvPicPr>
+                            <a:picLocks noChangeAspect="1" noChangeArrowheads="1"/>
+                          </pic:cNvPicPr>
+                        </pic:nvPicPr>
+                        <pic:blipFill>
+                          <a:blip r:embed="rId15">
+                            <a:extLst>
+                              <a:ext uri="{28A0092B-C50C-407E-A947-70E740481C1C}">
+                                <a14:useLocalDpi xmlns:a14="http://schemas.microsoft.com/office/drawing/2010/main" val="0"/>
+                              </a:ext>
+                            </a:extLst>
+                          </a:blip>
+                          <a:srcRect/>
+                          <a:stretch>
+                            <a:fillRect/>
+                          </a:stretch>
+                        </pic:blipFill>
+                        <pic:spPr bwMode="auto">
+                          <a:xfrm>
+                            <a:off x="0" y="0"/>
+                            <a:ext cx="6032500" cy="3446145"/>
+                          </a:xfrm>
+                          <a:prstGeom prst="rect">
+                            <a:avLst/>
+                          </a:prstGeom>
+                          <a:noFill/>
+                          <a:ln>
+                            <a:noFill/>
+                          </a:ln>
+                        </pic:spPr>
+                      </pic:pic>
+                    </a:graphicData>
+                  </a:graphic>
+                </wp:anchor>
+              </w:drawing>
+            </w:r>
+            <w:r>
+              <w:rPr>
+                <w:rFonts w:ascii="Arial" w:hAnsi="Arial" w:cs="Arial"/>
+                <w:b/>
+                <w:sz w:val="20"/>
+                <w:szCs w:val="20"/>
+              </w:rPr>
+              <w:t>TABLA DE USUARIOS Y DEVICES (DISPOSITIVOS) CON DYNAMODB</w:t>
+            </w:r>
           </w:p>
           <w:p>
             <w:pPr>
@@ -5619,29 +6639,43 @@
               <w:spacing w:before="120" w:line="276" w:lineRule="auto"/>
               <w:rPr>
                 <w:rFonts w:ascii="Arial" w:hAnsi="Arial" w:cs="Arial"/>
-                <w:b/>
-                <w:sz w:val="20"/>
-                <w:szCs w:val="20"/>
-              </w:rPr>
-            </w:pPr>
+                <w:sz w:val="20"/>
+                <w:szCs w:val="20"/>
+              </w:rPr>
+            </w:pPr>
+            <w:r>
+              <w:rPr>
+                <w:rFonts w:ascii="Arial" w:hAnsi="Arial" w:cs="Arial"/>
+                <w:sz w:val="20"/>
+                <w:szCs w:val="20"/>
+              </w:rPr>
+              <w:lastRenderedPageBreak/>
+              <w:t>Fases de la Implementación:</w:t>
+            </w:r>
           </w:p>
           <w:p>
             <w:pPr>
               <w:spacing w:before="120" w:line="276" w:lineRule="auto"/>
               <w:rPr>
                 <w:rFonts w:ascii="Arial" w:hAnsi="Arial" w:cs="Arial"/>
-                <w:b/>
-                <w:sz w:val="20"/>
-                <w:szCs w:val="20"/>
-              </w:rPr>
-            </w:pPr>
+                <w:sz w:val="20"/>
+                <w:szCs w:val="20"/>
+              </w:rPr>
+            </w:pPr>
+            <w:r>
+              <w:rPr>
+                <w:rFonts w:ascii="Arial" w:hAnsi="Arial" w:cs="Arial"/>
+                <w:sz w:val="20"/>
+                <w:szCs w:val="20"/>
+              </w:rPr>
+              <w:t>Primero, comencé configurando el hardware de detección, integrando el sensor de movimiento PIR con el módulo ESP32-CAM. Realicé pruebas para calibrar la sensibilidad del sensor y asegurar una comunicación estable entre ambos componentes, estableciendo la base física del sistema.</w:t>
+            </w:r>
           </w:p>
           <w:p>
             <w:pPr>
               <w:spacing w:before="120" w:line="276" w:lineRule="auto"/>
               <w:rPr>
                 <w:rFonts w:ascii="Arial" w:hAnsi="Arial" w:cs="Arial"/>
-                <w:b/>
                 <w:sz w:val="20"/>
                 <w:szCs w:val="20"/>
               </w:rPr>
@@ -5652,18 +6686,78 @@
               <w:spacing w:before="120" w:line="276" w:lineRule="auto"/>
               <w:rPr>
                 <w:rFonts w:ascii="Arial" w:hAnsi="Arial" w:cs="Arial"/>
-                <w:b/>
-                <w:sz w:val="20"/>
-                <w:szCs w:val="20"/>
-              </w:rPr>
-            </w:pPr>
+                <w:sz w:val="20"/>
+                <w:szCs w:val="20"/>
+              </w:rPr>
+            </w:pPr>
+            <w:r>
+              <w:rPr>
+                <w:rFonts w:ascii="Arial" w:hAnsi="Arial" w:cs="Arial"/>
+                <w:sz w:val="20"/>
+                <w:szCs w:val="20"/>
+              </w:rPr>
+              <w:t xml:space="preserve">Luego, diseñé y desarrollé el firmware en C++ utilizando </w:t>
+            </w:r>
+            <w:proofErr w:type="spellStart"/>
+            <w:r>
+              <w:rPr>
+                <w:rFonts w:ascii="Arial" w:hAnsi="Arial" w:cs="Arial"/>
+                <w:sz w:val="20"/>
+                <w:szCs w:val="20"/>
+              </w:rPr>
+              <w:t>PlatformIO</w:t>
+            </w:r>
+            <w:proofErr w:type="spellEnd"/>
+            <w:r>
+              <w:rPr>
+                <w:rFonts w:ascii="Arial" w:hAnsi="Arial" w:cs="Arial"/>
+                <w:sz w:val="20"/>
+                <w:szCs w:val="20"/>
+              </w:rPr>
+              <w:t xml:space="preserve">. Programé la lógica para que el ESP32-CAM, al ser activado por el sensor PIR, capture una imagen con su cámara integrada. El mayor desafío técnico en esta fase fue implementar la conexión segura a la red </w:t>
+            </w:r>
+            <w:proofErr w:type="spellStart"/>
+            <w:r>
+              <w:rPr>
+                <w:rFonts w:ascii="Arial" w:hAnsi="Arial" w:cs="Arial"/>
+                <w:sz w:val="20"/>
+                <w:szCs w:val="20"/>
+              </w:rPr>
+              <w:t>Wi</w:t>
+            </w:r>
+            <w:proofErr w:type="spellEnd"/>
+            <w:r>
+              <w:rPr>
+                <w:rFonts w:ascii="Arial" w:hAnsi="Arial" w:cs="Arial"/>
+                <w:sz w:val="20"/>
+                <w:szCs w:val="20"/>
+              </w:rPr>
+              <w:t xml:space="preserve">-Fi y la comunicación con el </w:t>
+            </w:r>
+            <w:proofErr w:type="spellStart"/>
+            <w:r>
+              <w:rPr>
+                <w:rFonts w:ascii="Arial" w:hAnsi="Arial" w:cs="Arial"/>
+                <w:sz w:val="20"/>
+                <w:szCs w:val="20"/>
+              </w:rPr>
+              <w:t>backend</w:t>
+            </w:r>
+            <w:proofErr w:type="spellEnd"/>
+            <w:r>
+              <w:rPr>
+                <w:rFonts w:ascii="Arial" w:hAnsi="Arial" w:cs="Arial"/>
+                <w:sz w:val="20"/>
+                <w:szCs w:val="20"/>
+              </w:rPr>
+              <w:t xml:space="preserve"> de AWS.</w:t>
+            </w:r>
           </w:p>
           <w:p>
             <w:pPr>
               <w:spacing w:before="120" w:line="276" w:lineRule="auto"/>
               <w:rPr>
                 <w:rFonts w:ascii="Arial" w:hAnsi="Arial" w:cs="Arial"/>
-                <w:b/>
                 <w:sz w:val="20"/>
                 <w:szCs w:val="20"/>
               </w:rPr>
@@ -5674,18 +6768,114 @@
               <w:spacing w:before="120" w:line="276" w:lineRule="auto"/>
               <w:rPr>
                 <w:rFonts w:ascii="Arial" w:hAnsi="Arial" w:cs="Arial"/>
-                <w:b/>
-                <w:sz w:val="20"/>
-                <w:szCs w:val="20"/>
-              </w:rPr>
-            </w:pPr>
+                <w:sz w:val="20"/>
+                <w:szCs w:val="20"/>
+              </w:rPr>
+            </w:pPr>
+            <w:r>
+              <w:rPr>
+                <w:rFonts w:ascii="Arial" w:hAnsi="Arial" w:cs="Arial"/>
+                <w:sz w:val="20"/>
+                <w:szCs w:val="20"/>
+              </w:rPr>
+              <w:t xml:space="preserve">Después, desplegué la infraestructura </w:t>
+            </w:r>
+            <w:proofErr w:type="spellStart"/>
+            <w:r>
+              <w:rPr>
+                <w:rFonts w:ascii="Arial" w:hAnsi="Arial" w:cs="Arial"/>
+                <w:sz w:val="20"/>
+                <w:szCs w:val="20"/>
+              </w:rPr>
+              <w:t>serverless</w:t>
+            </w:r>
+            <w:proofErr w:type="spellEnd"/>
+            <w:r>
+              <w:rPr>
+                <w:rFonts w:ascii="Arial" w:hAnsi="Arial" w:cs="Arial"/>
+                <w:sz w:val="20"/>
+                <w:szCs w:val="20"/>
+              </w:rPr>
+              <w:t xml:space="preserve"> en la nube utilizando AWS </w:t>
+            </w:r>
+            <w:proofErr w:type="spellStart"/>
+            <w:r>
+              <w:rPr>
+                <w:rFonts w:ascii="Arial" w:hAnsi="Arial" w:cs="Arial"/>
+                <w:sz w:val="20"/>
+                <w:szCs w:val="20"/>
+              </w:rPr>
+              <w:t>Amplify</w:t>
+            </w:r>
+            <w:proofErr w:type="spellEnd"/>
+            <w:r>
+              <w:rPr>
+                <w:rFonts w:ascii="Arial" w:hAnsi="Arial" w:cs="Arial"/>
+                <w:sz w:val="20"/>
+                <w:szCs w:val="20"/>
+              </w:rPr>
+              <w:t xml:space="preserve">. Mediante la CLI de </w:t>
+            </w:r>
+            <w:proofErr w:type="spellStart"/>
+            <w:r>
+              <w:rPr>
+                <w:rFonts w:ascii="Arial" w:hAnsi="Arial" w:cs="Arial"/>
+                <w:sz w:val="20"/>
+                <w:szCs w:val="20"/>
+              </w:rPr>
+              <w:t>Amplify</w:t>
+            </w:r>
+            <w:proofErr w:type="spellEnd"/>
+            <w:r>
+              <w:rPr>
+                <w:rFonts w:ascii="Arial" w:hAnsi="Arial" w:cs="Arial"/>
+                <w:sz w:val="20"/>
+                <w:szCs w:val="20"/>
+              </w:rPr>
+              <w:t xml:space="preserve">, configuré y conecté automáticamente los servicios necesarios: una API (usando AWS </w:t>
+            </w:r>
+            <w:proofErr w:type="spellStart"/>
+            <w:r>
+              <w:rPr>
+                <w:rFonts w:ascii="Arial" w:hAnsi="Arial" w:cs="Arial"/>
+                <w:sz w:val="20"/>
+                <w:szCs w:val="20"/>
+              </w:rPr>
+              <w:t>AppSync</w:t>
+            </w:r>
+            <w:proofErr w:type="spellEnd"/>
+            <w:r>
+              <w:rPr>
+                <w:rFonts w:ascii="Arial" w:hAnsi="Arial" w:cs="Arial"/>
+                <w:sz w:val="20"/>
+                <w:szCs w:val="20"/>
+              </w:rPr>
+              <w:t>) para la comunicación, una base de datos NoSQL (</w:t>
+            </w:r>
+            <w:proofErr w:type="spellStart"/>
+            <w:r>
+              <w:rPr>
+                <w:rFonts w:ascii="Arial" w:hAnsi="Arial" w:cs="Arial"/>
+                <w:sz w:val="20"/>
+                <w:szCs w:val="20"/>
+              </w:rPr>
+              <w:t>DynamoDB</w:t>
+            </w:r>
+            <w:proofErr w:type="spellEnd"/>
+            <w:r>
+              <w:rPr>
+                <w:rFonts w:ascii="Arial" w:hAnsi="Arial" w:cs="Arial"/>
+                <w:sz w:val="20"/>
+                <w:szCs w:val="20"/>
+              </w:rPr>
+              <w:t>) para los registros de eventos, y un servicio de almacenamiento de objetos (Amazon S3) para las imágenes de evidencia.</w:t>
+            </w:r>
           </w:p>
           <w:p>
             <w:pPr>
               <w:spacing w:before="120" w:line="276" w:lineRule="auto"/>
               <w:rPr>
                 <w:rFonts w:ascii="Arial" w:hAnsi="Arial" w:cs="Arial"/>
-                <w:b/>
                 <w:sz w:val="20"/>
                 <w:szCs w:val="20"/>
               </w:rPr>
@@ -5696,18 +6886,78 @@
               <w:spacing w:before="120" w:line="276" w:lineRule="auto"/>
               <w:rPr>
                 <w:rFonts w:ascii="Arial" w:hAnsi="Arial" w:cs="Arial"/>
-                <w:b/>
-                <w:sz w:val="20"/>
-                <w:szCs w:val="20"/>
-              </w:rPr>
-            </w:pPr>
+                <w:sz w:val="20"/>
+                <w:szCs w:val="20"/>
+              </w:rPr>
+            </w:pPr>
+            <w:r>
+              <w:rPr>
+                <w:rFonts w:ascii="Arial" w:hAnsi="Arial" w:cs="Arial"/>
+                <w:sz w:val="20"/>
+                <w:szCs w:val="20"/>
+              </w:rPr>
+              <w:t xml:space="preserve">A continuación, desarrollé la aplicación móvil nativa en Android Studio utilizando </w:t>
+            </w:r>
+            <w:proofErr w:type="spellStart"/>
+            <w:r>
+              <w:rPr>
+                <w:rFonts w:ascii="Arial" w:hAnsi="Arial" w:cs="Arial"/>
+                <w:sz w:val="20"/>
+                <w:szCs w:val="20"/>
+              </w:rPr>
+              <w:t>Kotlin</w:t>
+            </w:r>
+            <w:proofErr w:type="spellEnd"/>
+            <w:r>
+              <w:rPr>
+                <w:rFonts w:ascii="Arial" w:hAnsi="Arial" w:cs="Arial"/>
+                <w:sz w:val="20"/>
+                <w:szCs w:val="20"/>
+              </w:rPr>
+              <w:t xml:space="preserve">. Diseñé las interfaces de usuario para la pantalla principal y la de historial de eventos. Integré las librerías de AWS </w:t>
+            </w:r>
+            <w:proofErr w:type="spellStart"/>
+            <w:r>
+              <w:rPr>
+                <w:rFonts w:ascii="Arial" w:hAnsi="Arial" w:cs="Arial"/>
+                <w:sz w:val="20"/>
+                <w:szCs w:val="20"/>
+              </w:rPr>
+              <w:t>Amplify</w:t>
+            </w:r>
+            <w:proofErr w:type="spellEnd"/>
+            <w:r>
+              <w:rPr>
+                <w:rFonts w:ascii="Arial" w:hAnsi="Arial" w:cs="Arial"/>
+                <w:sz w:val="20"/>
+                <w:szCs w:val="20"/>
+              </w:rPr>
+              <w:t xml:space="preserve"> en la aplicación para gestionar la autenticación de usuarios y la comunicación con el </w:t>
+            </w:r>
+            <w:proofErr w:type="spellStart"/>
+            <w:r>
+              <w:rPr>
+                <w:rFonts w:ascii="Arial" w:hAnsi="Arial" w:cs="Arial"/>
+                <w:sz w:val="20"/>
+                <w:szCs w:val="20"/>
+              </w:rPr>
+              <w:t>backend</w:t>
+            </w:r>
+            <w:proofErr w:type="spellEnd"/>
+            <w:r>
+              <w:rPr>
+                <w:rFonts w:ascii="Arial" w:hAnsi="Arial" w:cs="Arial"/>
+                <w:sz w:val="20"/>
+                <w:szCs w:val="20"/>
+              </w:rPr>
+              <w:t xml:space="preserve"> en la nube.</w:t>
+            </w:r>
           </w:p>
           <w:p>
             <w:pPr>
               <w:spacing w:before="120" w:line="276" w:lineRule="auto"/>
               <w:rPr>
                 <w:rFonts w:ascii="Arial" w:hAnsi="Arial" w:cs="Arial"/>
-                <w:b/>
                 <w:sz w:val="20"/>
                 <w:szCs w:val="20"/>
               </w:rPr>
@@ -5718,18 +6968,60 @@
               <w:spacing w:before="120" w:line="276" w:lineRule="auto"/>
               <w:rPr>
                 <w:rFonts w:ascii="Arial" w:hAnsi="Arial" w:cs="Arial"/>
-                <w:b/>
-                <w:sz w:val="20"/>
-                <w:szCs w:val="20"/>
-              </w:rPr>
-            </w:pPr>
+                <w:sz w:val="20"/>
+                <w:szCs w:val="20"/>
+              </w:rPr>
+            </w:pPr>
+            <w:r>
+              <w:rPr>
+                <w:rFonts w:ascii="Arial" w:hAnsi="Arial" w:cs="Arial"/>
+                <w:sz w:val="20"/>
+                <w:szCs w:val="20"/>
+              </w:rPr>
+              <w:t xml:space="preserve">Después, implementé las funcionalidades clave en la aplicación móvil. Desarrollé la lógica para mostrar el historial de eventos, consultando los datos desde </w:t>
+            </w:r>
+            <w:proofErr w:type="spellStart"/>
+            <w:r>
+              <w:rPr>
+                <w:rFonts w:ascii="Arial" w:hAnsi="Arial" w:cs="Arial"/>
+                <w:sz w:val="20"/>
+                <w:szCs w:val="20"/>
+              </w:rPr>
+              <w:t>DynamoDB</w:t>
+            </w:r>
+            <w:proofErr w:type="spellEnd"/>
+            <w:r>
+              <w:rPr>
+                <w:rFonts w:ascii="Arial" w:hAnsi="Arial" w:cs="Arial"/>
+                <w:sz w:val="20"/>
+                <w:szCs w:val="20"/>
+              </w:rPr>
+              <w:t xml:space="preserve"> y cargando las imágenes desde S3. También programé la función de control remoto, que permite al usuario activar o desactivar el sistema de vigilancia, enviando el nuevo estado al </w:t>
+            </w:r>
+            <w:proofErr w:type="spellStart"/>
+            <w:r>
+              <w:rPr>
+                <w:rFonts w:ascii="Arial" w:hAnsi="Arial" w:cs="Arial"/>
+                <w:sz w:val="20"/>
+                <w:szCs w:val="20"/>
+              </w:rPr>
+              <w:t>backend</w:t>
+            </w:r>
+            <w:proofErr w:type="spellEnd"/>
+            <w:r>
+              <w:rPr>
+                <w:rFonts w:ascii="Arial" w:hAnsi="Arial" w:cs="Arial"/>
+                <w:sz w:val="20"/>
+                <w:szCs w:val="20"/>
+              </w:rPr>
+              <w:t xml:space="preserve"> a través de la API.</w:t>
+            </w:r>
           </w:p>
           <w:p>
             <w:pPr>
               <w:spacing w:before="120" w:line="276" w:lineRule="auto"/>
               <w:rPr>
                 <w:rFonts w:ascii="Arial" w:hAnsi="Arial" w:cs="Arial"/>
-                <w:b/>
                 <w:sz w:val="20"/>
                 <w:szCs w:val="20"/>
               </w:rPr>
@@ -5740,18 +7032,114 @@
               <w:spacing w:before="120" w:line="276" w:lineRule="auto"/>
               <w:rPr>
                 <w:rFonts w:ascii="Arial" w:hAnsi="Arial" w:cs="Arial"/>
-                <w:b/>
-                <w:sz w:val="20"/>
-                <w:szCs w:val="20"/>
-              </w:rPr>
-            </w:pPr>
+                <w:sz w:val="20"/>
+                <w:szCs w:val="20"/>
+              </w:rPr>
+            </w:pPr>
+            <w:r>
+              <w:rPr>
+                <w:rFonts w:ascii="Arial" w:hAnsi="Arial" w:cs="Arial"/>
+                <w:sz w:val="20"/>
+                <w:szCs w:val="20"/>
+              </w:rPr>
+              <w:t xml:space="preserve">Luego, para demostrar la capacidad de respuesta del sistema, configuré el servicio de notificaciones </w:t>
+            </w:r>
+            <w:proofErr w:type="spellStart"/>
+            <w:r>
+              <w:rPr>
+                <w:rFonts w:ascii="Arial" w:hAnsi="Arial" w:cs="Arial"/>
+                <w:sz w:val="20"/>
+                <w:szCs w:val="20"/>
+              </w:rPr>
+              <w:t>push</w:t>
+            </w:r>
+            <w:proofErr w:type="spellEnd"/>
+            <w:r>
+              <w:rPr>
+                <w:rFonts w:ascii="Arial" w:hAnsi="Arial" w:cs="Arial"/>
+                <w:sz w:val="20"/>
+                <w:szCs w:val="20"/>
+              </w:rPr>
+              <w:t xml:space="preserve">. Integré </w:t>
+            </w:r>
+            <w:proofErr w:type="spellStart"/>
+            <w:r>
+              <w:rPr>
+                <w:rFonts w:ascii="Arial" w:hAnsi="Arial" w:cs="Arial"/>
+                <w:sz w:val="20"/>
+                <w:szCs w:val="20"/>
+              </w:rPr>
+              <w:t>Firebase</w:t>
+            </w:r>
+            <w:proofErr w:type="spellEnd"/>
+            <w:r>
+              <w:rPr>
+                <w:rFonts w:ascii="Arial" w:hAnsi="Arial" w:cs="Arial"/>
+                <w:sz w:val="20"/>
+                <w:szCs w:val="20"/>
+              </w:rPr>
+              <w:t xml:space="preserve"> Cloud </w:t>
+            </w:r>
+            <w:proofErr w:type="spellStart"/>
+            <w:r>
+              <w:rPr>
+                <w:rFonts w:ascii="Arial" w:hAnsi="Arial" w:cs="Arial"/>
+                <w:sz w:val="20"/>
+                <w:szCs w:val="20"/>
+              </w:rPr>
+              <w:t>Messaging</w:t>
+            </w:r>
+            <w:proofErr w:type="spellEnd"/>
+            <w:r>
+              <w:rPr>
+                <w:rFonts w:ascii="Arial" w:hAnsi="Arial" w:cs="Arial"/>
+                <w:sz w:val="20"/>
+                <w:szCs w:val="20"/>
+              </w:rPr>
+              <w:t xml:space="preserve"> (FCM) con el </w:t>
+            </w:r>
+            <w:proofErr w:type="spellStart"/>
+            <w:r>
+              <w:rPr>
+                <w:rFonts w:ascii="Arial" w:hAnsi="Arial" w:cs="Arial"/>
+                <w:sz w:val="20"/>
+                <w:szCs w:val="20"/>
+              </w:rPr>
+              <w:t>backend</w:t>
+            </w:r>
+            <w:proofErr w:type="spellEnd"/>
+            <w:r>
+              <w:rPr>
+                <w:rFonts w:ascii="Arial" w:hAnsi="Arial" w:cs="Arial"/>
+                <w:sz w:val="20"/>
+                <w:szCs w:val="20"/>
+              </w:rPr>
+              <w:t xml:space="preserve">, de modo que cada vez que se registra un nuevo evento en </w:t>
+            </w:r>
+            <w:proofErr w:type="spellStart"/>
+            <w:r>
+              <w:rPr>
+                <w:rFonts w:ascii="Arial" w:hAnsi="Arial" w:cs="Arial"/>
+                <w:sz w:val="20"/>
+                <w:szCs w:val="20"/>
+              </w:rPr>
+              <w:t>DynamoDB</w:t>
+            </w:r>
+            <w:proofErr w:type="spellEnd"/>
+            <w:r>
+              <w:rPr>
+                <w:rFonts w:ascii="Arial" w:hAnsi="Arial" w:cs="Arial"/>
+                <w:sz w:val="20"/>
+                <w:szCs w:val="20"/>
+              </w:rPr>
+              <w:t>, se desencadena una notificación que llega de forma instantánea al dispositivo móvil del usuario.</w:t>
+            </w:r>
           </w:p>
           <w:p>
             <w:pPr>
               <w:spacing w:before="120" w:line="276" w:lineRule="auto"/>
               <w:rPr>
                 <w:rFonts w:ascii="Arial" w:hAnsi="Arial" w:cs="Arial"/>
-                <w:b/>
                 <w:sz w:val="20"/>
                 <w:szCs w:val="20"/>
               </w:rPr>
@@ -5762,18 +7150,24 @@
               <w:spacing w:before="120" w:line="276" w:lineRule="auto"/>
               <w:rPr>
                 <w:rFonts w:ascii="Arial" w:hAnsi="Arial" w:cs="Arial"/>
-                <w:b/>
-                <w:sz w:val="20"/>
-                <w:szCs w:val="20"/>
-              </w:rPr>
-            </w:pPr>
+                <w:sz w:val="20"/>
+                <w:szCs w:val="20"/>
+              </w:rPr>
+            </w:pPr>
+            <w:r>
+              <w:rPr>
+                <w:rFonts w:ascii="Arial" w:hAnsi="Arial" w:cs="Arial"/>
+                <w:sz w:val="20"/>
+                <w:szCs w:val="20"/>
+              </w:rPr>
+              <w:t>Finalmente, realicé pruebas de validación de extremo a extremo para asegurar la calidad y la precisión de todo el flujo. Verifiqué la correcta comunicación desde la detección del sensor hasta la recepción de la alerta en la app, ajusté los tiempos de respuesta y documenté todo el proceso, dejando el sistema de seguridad listo para su despliegue.</w:t>
+            </w:r>
           </w:p>
           <w:p>
             <w:pPr>
               <w:spacing w:before="120" w:line="276" w:lineRule="auto"/>
               <w:rPr>
                 <w:rFonts w:ascii="Arial" w:hAnsi="Arial" w:cs="Arial"/>
-                <w:b/>
                 <w:sz w:val="20"/>
                 <w:szCs w:val="20"/>
               </w:rPr>
@@ -5784,73 +7178,60 @@
               <w:spacing w:before="120" w:line="276" w:lineRule="auto"/>
               <w:rPr>
                 <w:rFonts w:ascii="Arial" w:hAnsi="Arial" w:cs="Arial"/>
-                <w:b/>
-                <w:sz w:val="20"/>
-                <w:szCs w:val="20"/>
-              </w:rPr>
-            </w:pPr>
+                <w:sz w:val="20"/>
+                <w:szCs w:val="20"/>
+              </w:rPr>
+            </w:pPr>
+            <w:r>
+              <w:rPr>
+                <w:rFonts w:ascii="Arial" w:hAnsi="Arial" w:cs="Arial"/>
+                <w:sz w:val="20"/>
+                <w:szCs w:val="20"/>
+              </w:rPr>
+              <w:t xml:space="preserve">PDTA: Para mí, el mayor desafío fue la integración segura y fiable entre el hardware (ESP32-CAM) y el </w:t>
+            </w:r>
+            <w:proofErr w:type="spellStart"/>
+            <w:r>
+              <w:rPr>
+                <w:rFonts w:ascii="Arial" w:hAnsi="Arial" w:cs="Arial"/>
+                <w:sz w:val="20"/>
+                <w:szCs w:val="20"/>
+              </w:rPr>
+              <w:t>backend</w:t>
+            </w:r>
+            <w:proofErr w:type="spellEnd"/>
+            <w:r>
+              <w:rPr>
+                <w:rFonts w:ascii="Arial" w:hAnsi="Arial" w:cs="Arial"/>
+                <w:sz w:val="20"/>
+                <w:szCs w:val="20"/>
+              </w:rPr>
+              <w:t xml:space="preserve"> en la nube (AWS </w:t>
+            </w:r>
+            <w:proofErr w:type="spellStart"/>
+            <w:r>
+              <w:rPr>
+                <w:rFonts w:ascii="Arial" w:hAnsi="Arial" w:cs="Arial"/>
+                <w:sz w:val="20"/>
+                <w:szCs w:val="20"/>
+              </w:rPr>
+              <w:t>Amplify</w:t>
+            </w:r>
+            <w:proofErr w:type="spellEnd"/>
+            <w:r>
+              <w:rPr>
+                <w:rFonts w:ascii="Arial" w:hAnsi="Arial" w:cs="Arial"/>
+                <w:sz w:val="20"/>
+                <w:szCs w:val="20"/>
+              </w:rPr>
+              <w:t>). Lograr que un dispositivo de bajo costo y recursos limitados se autentique y comunique de manera segura con servicios de nivel empresarial como los de AWS requirió un profundo entendimiento de los protocolos de red, la gestión de certificados y la configuración de políticas de IAM, asegurando que la transmisión de datos fuera tanto eficiente como invulnerable.</w:t>
+            </w:r>
           </w:p>
           <w:p>
             <w:pPr>
               <w:spacing w:before="120" w:line="276" w:lineRule="auto"/>
               <w:rPr>
                 <w:rFonts w:ascii="Arial" w:hAnsi="Arial" w:cs="Arial"/>
-                <w:b/>
-                <w:sz w:val="20"/>
-                <w:szCs w:val="20"/>
-              </w:rPr>
-            </w:pPr>
-          </w:p>
-          <w:p>
-            <w:pPr>
-              <w:spacing w:before="120" w:line="276" w:lineRule="auto"/>
-              <w:rPr>
-                <w:rFonts w:ascii="Arial" w:hAnsi="Arial" w:cs="Arial"/>
-                <w:b/>
-                <w:sz w:val="20"/>
-                <w:szCs w:val="20"/>
-              </w:rPr>
-            </w:pPr>
-          </w:p>
-          <w:p>
-            <w:pPr>
-              <w:spacing w:before="120" w:line="276" w:lineRule="auto"/>
-              <w:rPr>
-                <w:rFonts w:ascii="Arial" w:hAnsi="Arial" w:cs="Arial"/>
-                <w:b/>
-                <w:sz w:val="20"/>
-                <w:szCs w:val="20"/>
-              </w:rPr>
-            </w:pPr>
-          </w:p>
-          <w:p>
-            <w:pPr>
-              <w:spacing w:before="120" w:line="276" w:lineRule="auto"/>
-              <w:rPr>
-                <w:rFonts w:ascii="Arial" w:hAnsi="Arial" w:cs="Arial"/>
-                <w:b/>
-                <w:sz w:val="20"/>
-                <w:szCs w:val="20"/>
-              </w:rPr>
-            </w:pPr>
-          </w:p>
-          <w:p>
-            <w:pPr>
-              <w:spacing w:before="120" w:line="276" w:lineRule="auto"/>
-              <w:rPr>
-                <w:rFonts w:ascii="Arial" w:hAnsi="Arial" w:cs="Arial"/>
-                <w:b/>
-                <w:sz w:val="20"/>
-                <w:szCs w:val="20"/>
-              </w:rPr>
-            </w:pPr>
-          </w:p>
-          <w:p>
-            <w:pPr>
-              <w:spacing w:before="120" w:line="276" w:lineRule="auto"/>
-              <w:rPr>
-                <w:rFonts w:ascii="Arial" w:hAnsi="Arial" w:cs="Arial"/>
-                <w:b/>
                 <w:sz w:val="20"/>
                 <w:szCs w:val="20"/>
               </w:rPr>
@@ -5912,15 +7293,6 @@
           <w:szCs w:val="20"/>
         </w:rPr>
       </w:pPr>
-      <w:r>
-        <w:rPr>
-          <w:rFonts w:ascii="Arial" w:hAnsi="Arial" w:cs="Arial"/>
-          <w:b/>
-          <w:sz w:val="20"/>
-          <w:szCs w:val="20"/>
-        </w:rPr>
-        <w:br w:type="page"/>
-      </w:r>
     </w:p>
     <w:p>
       <w:pPr>
@@ -6362,9 +7734,14 @@
             <w:pPr>
               <w:rPr>
                 <w:rFonts w:ascii="Arial" w:hAnsi="Arial" w:cs="Arial"/>
-                <w:b/>
-              </w:rPr>
-            </w:pPr>
+              </w:rPr>
+            </w:pPr>
+            <w:r>
+              <w:rPr>
+                <w:rFonts w:ascii="Arial" w:hAnsi="Arial" w:cs="Arial"/>
+              </w:rPr>
+              <w:t>Diseño de la Arquitectura Serverless en la Nube</w:t>
+            </w:r>
           </w:p>
         </w:tc>
         <w:tc>
@@ -6376,9 +7753,28 @@
             <w:pPr>
               <w:rPr>
                 <w:rFonts w:ascii="Arial" w:hAnsi="Arial" w:cs="Arial"/>
-                <w:b/>
-              </w:rPr>
-            </w:pPr>
+              </w:rPr>
+            </w:pPr>
+            <w:r>
+              <w:rPr>
+                <w:rFonts w:ascii="Arial" w:hAnsi="Arial" w:cs="Arial"/>
+              </w:rPr>
+              <w:t xml:space="preserve">AWS </w:t>
+            </w:r>
+            <w:proofErr w:type="spellStart"/>
+            <w:r>
+              <w:rPr>
+                <w:rFonts w:ascii="Arial" w:hAnsi="Arial" w:cs="Arial"/>
+              </w:rPr>
+              <w:t>Well-Architected</w:t>
+            </w:r>
+            <w:proofErr w:type="spellEnd"/>
+            <w:r>
+              <w:rPr>
+                <w:rFonts w:ascii="Arial" w:hAnsi="Arial" w:cs="Arial"/>
+              </w:rPr>
+              <w:t xml:space="preserve"> Framework</w:t>
+            </w:r>
           </w:p>
         </w:tc>
       </w:tr>
@@ -6397,6 +7793,20 @@
                 <w:rFonts w:ascii="Arial" w:hAnsi="Arial" w:cs="Arial"/>
               </w:rPr>
             </w:pPr>
+            <w:r>
+              <w:rPr>
+                <w:rFonts w:ascii="Arial" w:hAnsi="Arial" w:cs="Arial"/>
+              </w:rPr>
+              <w:t xml:space="preserve">Configuración del entorno en AWS </w:t>
+            </w:r>
+            <w:proofErr w:type="spellStart"/>
+            <w:r>
+              <w:rPr>
+                <w:rFonts w:ascii="Arial" w:hAnsi="Arial" w:cs="Arial"/>
+              </w:rPr>
+              <w:t>Amplify</w:t>
+            </w:r>
+            <w:proofErr w:type="spellEnd"/>
           </w:p>
         </w:tc>
         <w:tc>
@@ -6410,6 +7820,12 @@
                 <w:rFonts w:ascii="Arial" w:hAnsi="Arial" w:cs="Arial"/>
               </w:rPr>
             </w:pPr>
+            <w:r>
+              <w:rPr>
+                <w:rFonts w:ascii="Arial" w:hAnsi="Arial" w:cs="Arial"/>
+              </w:rPr>
+              <w:t xml:space="preserve">Metodologías de Desarrollo Ágil </w:t>
+            </w:r>
           </w:p>
         </w:tc>
       </w:tr>
@@ -6428,6 +7844,12 @@
                 <w:rFonts w:ascii="Arial" w:hAnsi="Arial" w:cs="Arial"/>
               </w:rPr>
             </w:pPr>
+            <w:r>
+              <w:rPr>
+                <w:rFonts w:ascii="Arial" w:hAnsi="Arial" w:cs="Arial"/>
+              </w:rPr>
+              <w:t>Desarrollo del firmware en C++ para ESP32-CAM</w:t>
+            </w:r>
           </w:p>
         </w:tc>
         <w:tc>
@@ -6441,6 +7863,12 @@
                 <w:rFonts w:ascii="Arial" w:hAnsi="Arial" w:cs="Arial"/>
               </w:rPr>
             </w:pPr>
+            <w:r>
+              <w:rPr>
+                <w:rFonts w:ascii="Arial" w:hAnsi="Arial" w:cs="Arial"/>
+              </w:rPr>
+              <w:t>Estándares de codificación de C++</w:t>
+            </w:r>
           </w:p>
         </w:tc>
       </w:tr>
@@ -6459,6 +7887,26 @@
                 <w:rFonts w:ascii="Arial" w:hAnsi="Arial" w:cs="Arial"/>
               </w:rPr>
             </w:pPr>
+            <w:r>
+              <w:rPr>
+                <w:rFonts w:ascii="Arial" w:hAnsi="Arial" w:cs="Arial"/>
+              </w:rPr>
+              <w:t>Implementación de la base de datos NoSQL (</w:t>
+            </w:r>
+            <w:proofErr w:type="spellStart"/>
+            <w:r>
+              <w:rPr>
+                <w:rFonts w:ascii="Arial" w:hAnsi="Arial" w:cs="Arial"/>
+              </w:rPr>
+              <w:t>DynamoDB</w:t>
+            </w:r>
+            <w:proofErr w:type="spellEnd"/>
+            <w:r>
+              <w:rPr>
+                <w:rFonts w:ascii="Arial" w:hAnsi="Arial" w:cs="Arial"/>
+              </w:rPr>
+              <w:t>)</w:t>
+            </w:r>
           </w:p>
         </w:tc>
         <w:tc>
@@ -6472,6 +7920,12 @@
                 <w:rFonts w:ascii="Arial" w:hAnsi="Arial" w:cs="Arial"/>
               </w:rPr>
             </w:pPr>
+            <w:r>
+              <w:rPr>
+                <w:rFonts w:ascii="Arial" w:hAnsi="Arial" w:cs="Arial"/>
+              </w:rPr>
+              <w:t>Buenas prácticas de modelado de datos NoSQL</w:t>
+            </w:r>
           </w:p>
         </w:tc>
       </w:tr>
@@ -6490,6 +7944,12 @@
                 <w:rFonts w:ascii="Arial" w:hAnsi="Arial" w:cs="Arial"/>
               </w:rPr>
             </w:pPr>
+            <w:r>
+              <w:rPr>
+                <w:rFonts w:ascii="Arial" w:hAnsi="Arial" w:cs="Arial"/>
+              </w:rPr>
+              <w:t>Configuración del almacenamiento de objetos (Amazon S3)</w:t>
+            </w:r>
           </w:p>
         </w:tc>
         <w:tc>
@@ -6503,6 +7963,12 @@
                 <w:rFonts w:ascii="Arial" w:hAnsi="Arial" w:cs="Arial"/>
               </w:rPr>
             </w:pPr>
+            <w:r>
+              <w:rPr>
+                <w:rFonts w:ascii="Arial" w:hAnsi="Arial" w:cs="Arial"/>
+              </w:rPr>
+              <w:t>Estándares de formato de imagen (JPEG)</w:t>
+            </w:r>
           </w:p>
         </w:tc>
       </w:tr>
@@ -6521,6 +7987,26 @@
                 <w:rFonts w:ascii="Arial" w:hAnsi="Arial" w:cs="Arial"/>
               </w:rPr>
             </w:pPr>
+            <w:r>
+              <w:rPr>
+                <w:rFonts w:ascii="Arial" w:hAnsi="Arial" w:cs="Arial"/>
+              </w:rPr>
+              <w:t xml:space="preserve">Construcción del aplicativo móvil en </w:t>
+            </w:r>
+            <w:proofErr w:type="spellStart"/>
+            <w:r>
+              <w:rPr>
+                <w:rFonts w:ascii="Arial" w:hAnsi="Arial" w:cs="Arial"/>
+              </w:rPr>
+              <w:t>Kotlin</w:t>
+            </w:r>
+            <w:proofErr w:type="spellEnd"/>
+            <w:r>
+              <w:rPr>
+                <w:rFonts w:ascii="Arial" w:hAnsi="Arial" w:cs="Arial"/>
+              </w:rPr>
+              <w:t xml:space="preserve"> (Android)</w:t>
+            </w:r>
           </w:p>
         </w:tc>
         <w:tc>
@@ -6534,6 +8020,26 @@
                 <w:rFonts w:ascii="Arial" w:hAnsi="Arial" w:cs="Arial"/>
               </w:rPr>
             </w:pPr>
+            <w:r>
+              <w:rPr>
+                <w:rFonts w:ascii="Arial" w:hAnsi="Arial" w:cs="Arial"/>
+              </w:rPr>
+              <w:t xml:space="preserve">Guías de diseño Material </w:t>
+            </w:r>
+            <w:proofErr w:type="spellStart"/>
+            <w:r>
+              <w:rPr>
+                <w:rFonts w:ascii="Arial" w:hAnsi="Arial" w:cs="Arial"/>
+              </w:rPr>
+              <w:t>Design</w:t>
+            </w:r>
+            <w:proofErr w:type="spellEnd"/>
+            <w:r>
+              <w:rPr>
+                <w:rFonts w:ascii="Arial" w:hAnsi="Arial" w:cs="Arial"/>
+              </w:rPr>
+              <w:t xml:space="preserve"> de Google</w:t>
+            </w:r>
           </w:p>
         </w:tc>
       </w:tr>
@@ -6552,6 +8058,26 @@
                 <w:rFonts w:ascii="Arial" w:hAnsi="Arial" w:cs="Arial"/>
               </w:rPr>
             </w:pPr>
+            <w:r>
+              <w:rPr>
+                <w:rFonts w:ascii="Arial" w:hAnsi="Arial" w:cs="Arial"/>
+              </w:rPr>
+              <w:t>Implementación de la autenticación de usuarios (</w:t>
+            </w:r>
+            <w:proofErr w:type="spellStart"/>
+            <w:r>
+              <w:rPr>
+                <w:rFonts w:ascii="Arial" w:hAnsi="Arial" w:cs="Arial"/>
+              </w:rPr>
+              <w:t>Cognito</w:t>
+            </w:r>
+            <w:proofErr w:type="spellEnd"/>
+            <w:r>
+              <w:rPr>
+                <w:rFonts w:ascii="Arial" w:hAnsi="Arial" w:cs="Arial"/>
+              </w:rPr>
+              <w:t>)</w:t>
+            </w:r>
           </w:p>
         </w:tc>
         <w:tc>
@@ -6565,6 +8091,34 @@
                 <w:rFonts w:ascii="Arial" w:hAnsi="Arial" w:cs="Arial"/>
               </w:rPr>
             </w:pPr>
+            <w:r>
+              <w:rPr>
+                <w:rFonts w:ascii="Arial" w:hAnsi="Arial" w:cs="Arial"/>
+              </w:rPr>
+              <w:t xml:space="preserve">Estándares de seguridad OAuth 2.0 / </w:t>
+            </w:r>
+            <w:proofErr w:type="spellStart"/>
+            <w:r>
+              <w:rPr>
+                <w:rFonts w:ascii="Arial" w:hAnsi="Arial" w:cs="Arial"/>
+              </w:rPr>
+              <w:t>OpenID</w:t>
+            </w:r>
+            <w:proofErr w:type="spellEnd"/>
+            <w:r>
+              <w:rPr>
+                <w:rFonts w:ascii="Arial" w:hAnsi="Arial" w:cs="Arial"/>
+              </w:rPr>
+              <w:t xml:space="preserve"> </w:t>
+            </w:r>
+            <w:proofErr w:type="spellStart"/>
+            <w:r>
+              <w:rPr>
+                <w:rFonts w:ascii="Arial" w:hAnsi="Arial" w:cs="Arial"/>
+              </w:rPr>
+              <w:t>Connect</w:t>
+            </w:r>
+            <w:proofErr w:type="spellEnd"/>
           </w:p>
         </w:tc>
       </w:tr>
@@ -6583,6 +8137,12 @@
                 <w:rFonts w:ascii="Arial" w:hAnsi="Arial" w:cs="Arial"/>
               </w:rPr>
             </w:pPr>
+            <w:r>
+              <w:rPr>
+                <w:rFonts w:ascii="Arial" w:hAnsi="Arial" w:cs="Arial"/>
+              </w:rPr>
+              <w:t>Pruebas de calidad y validación del flujo completo</w:t>
+            </w:r>
           </w:p>
         </w:tc>
         <w:tc>
@@ -6596,6 +8156,12 @@
                 <w:rFonts w:ascii="Arial" w:hAnsi="Arial" w:cs="Arial"/>
               </w:rPr>
             </w:pPr>
+            <w:r>
+              <w:rPr>
+                <w:rFonts w:ascii="Arial" w:hAnsi="Arial" w:cs="Arial"/>
+              </w:rPr>
+              <w:t>Norma ISO/IEC 25012 (Calidad de Datos)</w:t>
+            </w:r>
           </w:p>
         </w:tc>
       </w:tr>
@@ -6614,6 +8180,12 @@
                 <w:rFonts w:ascii="Arial" w:hAnsi="Arial" w:cs="Arial"/>
               </w:rPr>
             </w:pPr>
+            <w:r>
+              <w:rPr>
+                <w:rFonts w:ascii="Arial" w:hAnsi="Arial" w:cs="Arial"/>
+              </w:rPr>
+              <w:t>Implementación de la seguridad de la aplicación y los datos</w:t>
+            </w:r>
           </w:p>
         </w:tc>
         <w:tc>
@@ -6627,6 +8199,12 @@
                 <w:rFonts w:ascii="Arial" w:hAnsi="Arial" w:cs="Arial"/>
               </w:rPr>
             </w:pPr>
+            <w:r>
+              <w:rPr>
+                <w:rFonts w:ascii="Arial" w:hAnsi="Arial" w:cs="Arial"/>
+              </w:rPr>
+              <w:t>GDPR / Leyes de Protección de Datos Personales</w:t>
+            </w:r>
           </w:p>
         </w:tc>
       </w:tr>
@@ -6645,6 +8223,12 @@
                 <w:rFonts w:ascii="Arial" w:hAnsi="Arial" w:cs="Arial"/>
               </w:rPr>
             </w:pPr>
+            <w:r>
+              <w:rPr>
+                <w:rFonts w:ascii="Arial" w:hAnsi="Arial" w:cs="Arial"/>
+              </w:rPr>
+              <w:t>Asegurar la eficiencia de recursos en la nube (Serverless)</w:t>
+            </w:r>
           </w:p>
         </w:tc>
         <w:tc>
@@ -6658,6 +8242,20 @@
                 <w:rFonts w:ascii="Arial" w:hAnsi="Arial" w:cs="Arial"/>
               </w:rPr>
             </w:pPr>
+            <w:r>
+              <w:rPr>
+                <w:rFonts w:ascii="Arial" w:hAnsi="Arial" w:cs="Arial"/>
+              </w:rPr>
+              <w:t xml:space="preserve">Prácticas de Green IT y Cloud </w:t>
+            </w:r>
+            <w:proofErr w:type="spellStart"/>
+            <w:r>
+              <w:rPr>
+                <w:rFonts w:ascii="Arial" w:hAnsi="Arial" w:cs="Arial"/>
+              </w:rPr>
+              <w:t>FinOps</w:t>
+            </w:r>
+            <w:proofErr w:type="spellEnd"/>
           </w:p>
         </w:tc>
       </w:tr>
@@ -6676,6 +8274,12 @@
                 <w:rFonts w:ascii="Arial" w:hAnsi="Arial" w:cs="Arial"/>
               </w:rPr>
             </w:pPr>
+            <w:r>
+              <w:rPr>
+                <w:rFonts w:ascii="Arial" w:hAnsi="Arial" w:cs="Arial"/>
+              </w:rPr>
+              <w:t>Capacitación al usuario sobre el uso de la app móvil</w:t>
+            </w:r>
           </w:p>
         </w:tc>
         <w:tc>
@@ -6689,6 +8293,32 @@
                 <w:rFonts w:ascii="Arial" w:hAnsi="Arial" w:cs="Arial"/>
               </w:rPr>
             </w:pPr>
+            <w:r>
+              <w:rPr>
+                <w:rFonts w:ascii="Arial" w:hAnsi="Arial" w:cs="Arial"/>
+              </w:rPr>
+              <w:t>Buenas prácticas de UX/UI (</w:t>
+            </w:r>
+            <w:proofErr w:type="spellStart"/>
+            <w:r>
+              <w:rPr>
+                <w:rFonts w:ascii="Arial" w:hAnsi="Arial" w:cs="Arial"/>
+              </w:rPr>
+              <w:t>Exp</w:t>
+            </w:r>
+            <w:proofErr w:type="spellEnd"/>
+            <w:r>
+              <w:rPr>
+                <w:rFonts w:ascii="Arial" w:hAnsi="Arial" w:cs="Arial"/>
+              </w:rPr>
+              <w:t>.</w:t>
+            </w:r>
+            <w:r>
+              <w:rPr>
+                <w:rFonts w:ascii="Arial" w:hAnsi="Arial" w:cs="Arial"/>
+              </w:rPr>
+              <w:t xml:space="preserve"> de Usuario)</w:t>
+            </w:r>
           </w:p>
         </w:tc>
       </w:tr>
@@ -6707,6 +8337,12 @@
                 <w:rFonts w:ascii="Arial" w:hAnsi="Arial" w:cs="Arial"/>
               </w:rPr>
             </w:pPr>
+            <w:r>
+              <w:rPr>
+                <w:rFonts w:ascii="Arial" w:hAnsi="Arial" w:cs="Arial"/>
+              </w:rPr>
+              <w:t>Control de versiones del código con Git y repositorios</w:t>
+            </w:r>
           </w:p>
         </w:tc>
         <w:tc>
@@ -6720,6 +8356,26 @@
                 <w:rFonts w:ascii="Arial" w:hAnsi="Arial" w:cs="Arial"/>
               </w:rPr>
             </w:pPr>
+            <w:r>
+              <w:rPr>
+                <w:rFonts w:ascii="Arial" w:hAnsi="Arial" w:cs="Arial"/>
+              </w:rPr>
+              <w:t xml:space="preserve">Metodología de </w:t>
+            </w:r>
+            <w:proofErr w:type="spellStart"/>
+            <w:r>
+              <w:rPr>
+                <w:rFonts w:ascii="Arial" w:hAnsi="Arial" w:cs="Arial"/>
+              </w:rPr>
+              <w:t>versionamiento</w:t>
+            </w:r>
+            <w:proofErr w:type="spellEnd"/>
+            <w:r>
+              <w:rPr>
+                <w:rFonts w:ascii="Arial" w:hAnsi="Arial" w:cs="Arial"/>
+              </w:rPr>
+              <w:t xml:space="preserve"> (SemVer)</w:t>
+            </w:r>
           </w:p>
         </w:tc>
       </w:tr>
@@ -6738,6 +8394,12 @@
                 <w:rFonts w:ascii="Arial" w:hAnsi="Arial" w:cs="Arial"/>
               </w:rPr>
             </w:pPr>
+            <w:r>
+              <w:rPr>
+                <w:rFonts w:ascii="Arial" w:hAnsi="Arial" w:cs="Arial"/>
+              </w:rPr>
+              <w:t>Documentación de la arquitectura y los procesos desarrollados</w:t>
+            </w:r>
           </w:p>
         </w:tc>
         <w:tc>
@@ -6751,161 +8413,12 @@
                 <w:rFonts w:ascii="Arial" w:hAnsi="Arial" w:cs="Arial"/>
               </w:rPr>
             </w:pPr>
-          </w:p>
-        </w:tc>
-      </w:tr>
-      <w:tr>
-        <w:trPr>
-          <w:trHeight w:val="425"/>
-        </w:trPr>
-        <w:tc>
-          <w:tcPr>
-            <w:tcW w:w="6237" w:type="dxa"/>
-            <w:vAlign w:val="center"/>
-          </w:tcPr>
-          <w:p>
-            <w:pPr>
-              <w:rPr>
-                <w:rFonts w:ascii="Arial" w:hAnsi="Arial" w:cs="Arial"/>
-              </w:rPr>
-            </w:pPr>
-          </w:p>
-        </w:tc>
-        <w:tc>
-          <w:tcPr>
-            <w:tcW w:w="2977" w:type="dxa"/>
-            <w:vAlign w:val="center"/>
-          </w:tcPr>
-          <w:p>
-            <w:pPr>
-              <w:rPr>
-                <w:rFonts w:ascii="Arial" w:hAnsi="Arial" w:cs="Arial"/>
-              </w:rPr>
-            </w:pPr>
-          </w:p>
-        </w:tc>
-      </w:tr>
-      <w:tr>
-        <w:trPr>
-          <w:trHeight w:val="425"/>
-        </w:trPr>
-        <w:tc>
-          <w:tcPr>
-            <w:tcW w:w="6237" w:type="dxa"/>
-            <w:vAlign w:val="center"/>
-          </w:tcPr>
-          <w:p>
-            <w:pPr>
-              <w:rPr>
-                <w:rFonts w:ascii="Arial" w:hAnsi="Arial" w:cs="Arial"/>
-              </w:rPr>
-            </w:pPr>
-          </w:p>
-        </w:tc>
-        <w:tc>
-          <w:tcPr>
-            <w:tcW w:w="2977" w:type="dxa"/>
-            <w:vAlign w:val="center"/>
-          </w:tcPr>
-          <w:p>
-            <w:pPr>
-              <w:rPr>
-                <w:rFonts w:ascii="Arial" w:hAnsi="Arial" w:cs="Arial"/>
-              </w:rPr>
-            </w:pPr>
-          </w:p>
-        </w:tc>
-      </w:tr>
-      <w:tr>
-        <w:trPr>
-          <w:trHeight w:val="425"/>
-        </w:trPr>
-        <w:tc>
-          <w:tcPr>
-            <w:tcW w:w="6237" w:type="dxa"/>
-            <w:vAlign w:val="center"/>
-          </w:tcPr>
-          <w:p>
-            <w:pPr>
-              <w:rPr>
-                <w:rFonts w:ascii="Arial" w:hAnsi="Arial" w:cs="Arial"/>
-              </w:rPr>
-            </w:pPr>
-          </w:p>
-        </w:tc>
-        <w:tc>
-          <w:tcPr>
-            <w:tcW w:w="2977" w:type="dxa"/>
-            <w:vAlign w:val="center"/>
-          </w:tcPr>
-          <w:p>
-            <w:pPr>
-              <w:rPr>
-                <w:rFonts w:ascii="Arial" w:hAnsi="Arial" w:cs="Arial"/>
-              </w:rPr>
-            </w:pPr>
-          </w:p>
-        </w:tc>
-      </w:tr>
-      <w:tr>
-        <w:trPr>
-          <w:trHeight w:val="425"/>
-        </w:trPr>
-        <w:tc>
-          <w:tcPr>
-            <w:tcW w:w="6237" w:type="dxa"/>
-            <w:vAlign w:val="center"/>
-          </w:tcPr>
-          <w:p>
-            <w:pPr>
-              <w:rPr>
-                <w:rFonts w:ascii="Arial" w:hAnsi="Arial" w:cs="Arial"/>
-              </w:rPr>
-            </w:pPr>
-          </w:p>
-        </w:tc>
-        <w:tc>
-          <w:tcPr>
-            <w:tcW w:w="2977" w:type="dxa"/>
-            <w:vAlign w:val="center"/>
-          </w:tcPr>
-          <w:p>
-            <w:pPr>
-              <w:rPr>
-                <w:rFonts w:ascii="Arial" w:hAnsi="Arial" w:cs="Arial"/>
-              </w:rPr>
-            </w:pPr>
-          </w:p>
-        </w:tc>
-      </w:tr>
-      <w:tr>
-        <w:trPr>
-          <w:trHeight w:val="425"/>
-        </w:trPr>
-        <w:tc>
-          <w:tcPr>
-            <w:tcW w:w="6237" w:type="dxa"/>
-            <w:vAlign w:val="center"/>
-          </w:tcPr>
-          <w:p>
-            <w:pPr>
-              <w:rPr>
-                <w:rFonts w:ascii="Arial" w:hAnsi="Arial" w:cs="Arial"/>
-              </w:rPr>
-            </w:pPr>
-          </w:p>
-        </w:tc>
-        <w:tc>
-          <w:tcPr>
-            <w:tcW w:w="2977" w:type="dxa"/>
-            <w:vAlign w:val="center"/>
-          </w:tcPr>
-          <w:p>
-            <w:pPr>
-              <w:rPr>
-                <w:rFonts w:ascii="Arial" w:hAnsi="Arial" w:cs="Arial"/>
-              </w:rPr>
-            </w:pPr>
+            <w:r>
+              <w:rPr>
+                <w:rFonts w:ascii="Arial" w:hAnsi="Arial" w:cs="Arial"/>
+              </w:rPr>
+              <w:t>Lenguaje de Modelado Unificado (UML)</w:t>
+            </w:r>
           </w:p>
         </w:tc>
       </w:tr>
@@ -6984,15 +8497,6 @@
           <w:szCs w:val="20"/>
         </w:rPr>
       </w:pPr>
-      <w:r>
-        <w:rPr>
-          <w:rFonts w:ascii="Arial" w:hAnsi="Arial" w:cs="Arial"/>
-          <w:b/>
-          <w:sz w:val="20"/>
-          <w:szCs w:val="20"/>
-        </w:rPr>
-        <w:br w:type="page"/>
-      </w:r>
     </w:p>
     <w:tbl>
       <w:tblPr>
@@ -7002,9 +8506,9 @@
         <w:tblLook w:val="04A0" w:firstRow="1" w:lastRow="0" w:firstColumn="1" w:lastColumn="0" w:noHBand="0" w:noVBand="1"/>
       </w:tblPr>
       <w:tblGrid>
-        <w:gridCol w:w="1838"/>
-        <w:gridCol w:w="6237"/>
-        <w:gridCol w:w="1418"/>
+        <w:gridCol w:w="1794"/>
+        <w:gridCol w:w="6228"/>
+        <w:gridCol w:w="1797"/>
       </w:tblGrid>
       <w:tr>
         <w:trPr>
@@ -7022,6 +8526,163 @@
                 <w:rFonts w:ascii="Arial" w:hAnsi="Arial" w:cs="Arial"/>
               </w:rPr>
             </w:pPr>
+            <w:r>
+              <w:rPr>
+                <w:noProof/>
+              </w:rPr>
+              <w:lastRenderedPageBreak/>
+              <w:drawing>
+                <wp:anchor distT="0" distB="0" distL="114300" distR="114300" simplePos="0" relativeHeight="251714560" behindDoc="0" locked="0" layoutInCell="1" allowOverlap="1" wp14:anchorId="4748D2CA" wp14:editId="3E147608">
+                  <wp:simplePos x="0" y="0"/>
+                  <wp:positionH relativeFrom="margin">
+                    <wp:posOffset>37210</wp:posOffset>
+                  </wp:positionH>
+                  <wp:positionV relativeFrom="margin">
+                    <wp:posOffset>174625</wp:posOffset>
+                  </wp:positionV>
+                  <wp:extent cx="5992495" cy="3372485"/>
+                  <wp:effectExtent l="0" t="0" r="8255" b="0"/>
+                  <wp:wrapSquare wrapText="bothSides"/>
+                  <wp:docPr id="3" name="Imagen 3"/>
+                  <wp:cNvGraphicFramePr>
+                    <a:graphicFrameLocks xmlns:a="http://schemas.openxmlformats.org/drawingml/2006/main" noChangeAspect="1"/>
+                  </wp:cNvGraphicFramePr>
+                  <a:graphic xmlns:a="http://schemas.openxmlformats.org/drawingml/2006/main">
+                    <a:graphicData uri="http://schemas.openxmlformats.org/drawingml/2006/picture">
+                      <pic:pic xmlns:pic="http://schemas.openxmlformats.org/drawingml/2006/picture">
+                        <pic:nvPicPr>
+                          <pic:cNvPr id="0" name="Picture 8"/>
+                          <pic:cNvPicPr>
+                            <a:picLocks noChangeAspect="1" noChangeArrowheads="1"/>
+                          </pic:cNvPicPr>
+                        </pic:nvPicPr>
+                        <pic:blipFill>
+                          <a:blip r:embed="rId16" cstate="print">
+                            <a:extLst>
+                              <a:ext uri="{28A0092B-C50C-407E-A947-70E740481C1C}">
+                                <a14:useLocalDpi xmlns:a14="http://schemas.microsoft.com/office/drawing/2010/main" val="0"/>
+                              </a:ext>
+                            </a:extLst>
+                          </a:blip>
+                          <a:srcRect/>
+                          <a:stretch>
+                            <a:fillRect/>
+                          </a:stretch>
+                        </pic:blipFill>
+                        <pic:spPr bwMode="auto">
+                          <a:xfrm>
+                            <a:off x="0" y="0"/>
+                            <a:ext cx="5992495" cy="3372485"/>
+                          </a:xfrm>
+                          <a:prstGeom prst="rect">
+                            <a:avLst/>
+                          </a:prstGeom>
+                          <a:noFill/>
+                          <a:ln>
+                            <a:noFill/>
+                          </a:ln>
+                        </pic:spPr>
+                      </pic:pic>
+                    </a:graphicData>
+                  </a:graphic>
+                  <wp14:sizeRelH relativeFrom="margin">
+                    <wp14:pctWidth>0</wp14:pctWidth>
+                  </wp14:sizeRelH>
+                  <wp14:sizeRelV relativeFrom="margin">
+                    <wp14:pctHeight>0</wp14:pctHeight>
+                  </wp14:sizeRelV>
+                </wp:anchor>
+              </w:drawing>
+            </w:r>
+          </w:p>
+          <w:p>
+            <w:pPr>
+              <w:jc w:val="both"/>
+              <w:rPr>
+                <w:rFonts w:ascii="Arial" w:hAnsi="Arial" w:cs="Arial"/>
+              </w:rPr>
+            </w:pPr>
+            <w:r>
+              <w:rPr>
+                <w:noProof/>
+              </w:rPr>
+              <w:drawing>
+                <wp:anchor distT="0" distB="0" distL="114300" distR="114300" simplePos="0" relativeHeight="251715584" behindDoc="0" locked="0" layoutInCell="1" allowOverlap="1" wp14:anchorId="5A591544" wp14:editId="264224AB">
+                  <wp:simplePos x="0" y="0"/>
+                  <wp:positionH relativeFrom="margin">
+                    <wp:posOffset>-10292</wp:posOffset>
+                  </wp:positionH>
+                  <wp:positionV relativeFrom="margin">
+                    <wp:posOffset>3986274</wp:posOffset>
+                  </wp:positionV>
+                  <wp:extent cx="6097905" cy="3431540"/>
+                  <wp:effectExtent l="0" t="0" r="0" b="0"/>
+                  <wp:wrapSquare wrapText="bothSides"/>
+                  <wp:docPr id="5" name="Imagen 5"/>
+                  <wp:cNvGraphicFramePr>
+                    <a:graphicFrameLocks xmlns:a="http://schemas.openxmlformats.org/drawingml/2006/main" noChangeAspect="1"/>
+                  </wp:cNvGraphicFramePr>
+                  <a:graphic xmlns:a="http://schemas.openxmlformats.org/drawingml/2006/main">
+                    <a:graphicData uri="http://schemas.openxmlformats.org/drawingml/2006/picture">
+                      <pic:pic xmlns:pic="http://schemas.openxmlformats.org/drawingml/2006/picture">
+                        <pic:nvPicPr>
+                          <pic:cNvPr id="0" name="Picture 10"/>
+                          <pic:cNvPicPr>
+                            <a:picLocks noChangeAspect="1" noChangeArrowheads="1"/>
+                          </pic:cNvPicPr>
+                        </pic:nvPicPr>
+                        <pic:blipFill>
+                          <a:blip r:embed="rId17" cstate="print">
+                            <a:extLst>
+                              <a:ext uri="{28A0092B-C50C-407E-A947-70E740481C1C}">
+                                <a14:useLocalDpi xmlns:a14="http://schemas.microsoft.com/office/drawing/2010/main" val="0"/>
+                              </a:ext>
+                            </a:extLst>
+                          </a:blip>
+                          <a:srcRect/>
+                          <a:stretch>
+                            <a:fillRect/>
+                          </a:stretch>
+                        </pic:blipFill>
+                        <pic:spPr bwMode="auto">
+                          <a:xfrm>
+                            <a:off x="0" y="0"/>
+                            <a:ext cx="6097905" cy="3431540"/>
+                          </a:xfrm>
+                          <a:prstGeom prst="rect">
+                            <a:avLst/>
+                          </a:prstGeom>
+                          <a:noFill/>
+                          <a:ln>
+                            <a:noFill/>
+                          </a:ln>
+                        </pic:spPr>
+                      </pic:pic>
+                    </a:graphicData>
+                  </a:graphic>
+                  <wp14:sizeRelH relativeFrom="margin">
+                    <wp14:pctWidth>0</wp14:pctWidth>
+                  </wp14:sizeRelH>
+                  <wp14:sizeRelV relativeFrom="margin">
+                    <wp14:pctHeight>0</wp14:pctHeight>
+                  </wp14:sizeRelV>
+                </wp:anchor>
+              </w:drawing>
+            </w:r>
+          </w:p>
+          <w:p>
+            <w:pPr>
+              <w:jc w:val="both"/>
+              <w:rPr>
+                <w:rFonts w:ascii="Arial" w:hAnsi="Arial" w:cs="Arial"/>
+              </w:rPr>
+            </w:pPr>
+            <w:r>
+              <w:rPr>
+                <w:noProof/>
+              </w:rPr>
+              <w:t xml:space="preserve"> </w:t>
+            </w:r>
           </w:p>
         </w:tc>
       </w:tr>
@@ -7073,7 +8734,7 @@
                           </pic:cNvPicPr>
                         </pic:nvPicPr>
                         <pic:blipFill>
-                          <a:blip r:embed="rId15" cstate="print">
+                          <a:blip r:embed="rId18" cstate="print">
                             <a:extLst>
                               <a:ext uri="{28A0092B-C50C-407E-A947-70E740481C1C}">
                                 <a14:useLocalDpi xmlns:a14="http://schemas.microsoft.com/office/drawing/2010/main" val="0"/>
@@ -7141,7 +8802,7 @@
                 <w:color w:val="BFBFBF" w:themeColor="background1" w:themeShade="BF"/>
                 <w:sz w:val="22"/>
               </w:rPr>
-              <w:t>NOMBRE DEL TEMA DEL TRABAJO FINAL</w:t>
+              <w:t>Sistema IoT de Seguridad Basado en Eventos con AWS</w:t>
             </w:r>
             <w:r>
               <w:rPr>
@@ -7194,8 +8855,6 @@
               </w:rPr>
               <w:t>[</w:t>
             </w:r>
-            <w:bookmarkStart w:id="1" w:name="_GoBack"/>
-            <w:bookmarkEnd w:id="1"/>
             <w:r>
               <w:rPr>
                 <w:rFonts w:ascii="Arial" w:hAnsi="Arial" w:cs="Arial"/>
@@ -7596,7 +9255,6 @@
         <w:rPr>
           <w:noProof/>
         </w:rPr>
-        <w:lastRenderedPageBreak/>
         <mc:AlternateContent>
           <mc:Choice Requires="wps">
             <w:drawing>
@@ -9162,7 +10820,7 @@
               </wp:anchor>
             </w:drawing>
           </mc:Choice>
-          <mc:Fallback xmlns:oel="http://schemas.microsoft.com/office/2019/extlst" xmlns:w16cex="http://schemas.microsoft.com/office/word/2018/wordml/cex" xmlns:w16="http://schemas.microsoft.com/office/word/2018/wordml" xmlns:w16du="http://schemas.microsoft.com/office/word/2023/wordml/word16du" xmlns:w16sdtdh="http://schemas.microsoft.com/office/word/2020/wordml/sdtdatahash">
+          <mc:Fallback xmlns:w16sdtdh="http://schemas.microsoft.com/office/word/2020/wordml/sdtdatahash" xmlns:w16du="http://schemas.microsoft.com/office/word/2023/wordml/word16du" xmlns:w16="http://schemas.microsoft.com/office/word/2018/wordml" xmlns:w16cex="http://schemas.microsoft.com/office/word/2018/wordml/cex" xmlns:oel="http://schemas.microsoft.com/office/2019/extlst">
             <w:pict>
               <v:rect w14:anchorId="633487F7" id="Rectángulo 3" o:spid="_x0000_s1026" style="position:absolute;margin-left:-8.65pt;margin-top:249.25pt;width:616.5pt;height:840.55pt;z-index:251709440;visibility:visible;mso-wrap-style:square;mso-width-percent:0;mso-height-percent:0;mso-wrap-distance-left:9pt;mso-wrap-distance-top:0;mso-wrap-distance-right:9pt;mso-wrap-distance-bottom:0;mso-position-horizontal:absolute;mso-position-horizontal-relative:page;mso-position-vertical:absolute;mso-position-vertical-relative:text;mso-width-percent:0;mso-height-percent:0;mso-width-relative:margin;mso-height-relative:margin;v-text-anchor:middle" o:gfxdata="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" fillcolor="white [3212]" stroked="f" strokeweight="2pt">
                 <w10:wrap anchorx="page"/>
@@ -9474,7 +11132,7 @@
         </w:trPr>
         <w:tc>
           <w:tcPr>
-            <w:tcW w:w="2175" w:type="dxa"/>
+            <w:tcW w:w="2170" w:type="dxa"/>
             <w:shd w:val="clear" w:color="auto" w:fill="DBE5F1" w:themeFill="accent1" w:themeFillTint="33"/>
             <w:vAlign w:val="center"/>
           </w:tcPr>
@@ -9502,7 +11160,7 @@
         </w:tc>
         <w:tc>
           <w:tcPr>
-            <w:tcW w:w="3212" w:type="dxa"/>
+            <w:tcW w:w="3195" w:type="dxa"/>
             <w:shd w:val="clear" w:color="auto" w:fill="DBE5F1" w:themeFill="accent1" w:themeFillTint="33"/>
             <w:vAlign w:val="center"/>
           </w:tcPr>
@@ -9530,7 +11188,7 @@
         </w:tc>
         <w:tc>
           <w:tcPr>
-            <w:tcW w:w="1794" w:type="dxa"/>
+            <w:tcW w:w="1816" w:type="dxa"/>
             <w:shd w:val="clear" w:color="auto" w:fill="DBE5F1" w:themeFill="accent1" w:themeFillTint="33"/>
             <w:vAlign w:val="center"/>
           </w:tcPr>
@@ -9612,7 +11270,7 @@
         </w:trPr>
         <w:tc>
           <w:tcPr>
-            <w:tcW w:w="2175" w:type="dxa"/>
+            <w:tcW w:w="2170" w:type="dxa"/>
             <w:vAlign w:val="center"/>
           </w:tcPr>
           <w:p>
@@ -9632,7 +11290,7 @@
         </w:tc>
         <w:tc>
           <w:tcPr>
-            <w:tcW w:w="3212" w:type="dxa"/>
+            <w:tcW w:w="3195" w:type="dxa"/>
             <w:vAlign w:val="center"/>
           </w:tcPr>
           <w:p>
@@ -9646,19 +11304,13 @@
               <w:rPr>
                 <w:rFonts w:ascii="Arial" w:hAnsi="Arial" w:cs="Arial"/>
               </w:rPr>
-              <w:t>Claridad en la identificación del problema planteado</w:t>
-            </w:r>
-            <w:r>
-              <w:rPr>
-                <w:rFonts w:ascii="Arial" w:hAnsi="Arial" w:cs="Arial"/>
-              </w:rPr>
-              <w:t>.</w:t>
-            </w:r>
-          </w:p>
-        </w:tc>
-        <w:tc>
-          <w:tcPr>
-            <w:tcW w:w="1794" w:type="dxa"/>
+              <w:t>Claridad en la identificación del problema planteado.</w:t>
+            </w:r>
+          </w:p>
+        </w:tc>
+        <w:tc>
+          <w:tcPr>
+            <w:tcW w:w="1816" w:type="dxa"/>
             <w:vAlign w:val="center"/>
           </w:tcPr>
           <w:p>
@@ -9685,10 +11337,17 @@
           <w:p>
             <w:pPr>
               <w:spacing w:line="276" w:lineRule="auto"/>
-              <w:rPr>
-                <w:rFonts w:ascii="Arial" w:hAnsi="Arial" w:cs="Arial"/>
-              </w:rPr>
-            </w:pPr>
+              <w:jc w:val="center"/>
+              <w:rPr>
+                <w:rFonts w:ascii="Arial" w:hAnsi="Arial" w:cs="Arial"/>
+              </w:rPr>
+            </w:pPr>
+            <w:r>
+              <w:rPr>
+                <w:rFonts w:ascii="Arial" w:hAnsi="Arial" w:cs="Arial"/>
+              </w:rPr>
+              <w:t>3</w:t>
+            </w:r>
           </w:p>
         </w:tc>
       </w:tr>
@@ -9698,7 +11357,7 @@
         </w:trPr>
         <w:tc>
           <w:tcPr>
-            <w:tcW w:w="2175" w:type="dxa"/>
+            <w:tcW w:w="2170" w:type="dxa"/>
             <w:vAlign w:val="center"/>
           </w:tcPr>
           <w:p>
@@ -9712,19 +11371,13 @@
               <w:rPr>
                 <w:rFonts w:ascii="Arial" w:hAnsi="Arial" w:cs="Arial"/>
               </w:rPr>
-              <w:t xml:space="preserve">Relevancia de la </w:t>
-            </w:r>
-            <w:r>
-              <w:rPr>
-                <w:rFonts w:ascii="Arial" w:hAnsi="Arial" w:cs="Arial"/>
-              </w:rPr>
-              <w:t>propuesta de solución</w:t>
-            </w:r>
-          </w:p>
-        </w:tc>
-        <w:tc>
-          <w:tcPr>
-            <w:tcW w:w="3212" w:type="dxa"/>
+              <w:t>Relevancia de la propuesta de solución</w:t>
+            </w:r>
+          </w:p>
+        </w:tc>
+        <w:tc>
+          <w:tcPr>
+            <w:tcW w:w="3195" w:type="dxa"/>
             <w:vAlign w:val="center"/>
           </w:tcPr>
           <w:p>
@@ -9744,7 +11397,7 @@
         </w:tc>
         <w:tc>
           <w:tcPr>
-            <w:tcW w:w="1794" w:type="dxa"/>
+            <w:tcW w:w="1816" w:type="dxa"/>
             <w:vAlign w:val="center"/>
           </w:tcPr>
           <w:p>
@@ -9771,10 +11424,17 @@
           <w:p>
             <w:pPr>
               <w:spacing w:line="276" w:lineRule="auto"/>
-              <w:rPr>
-                <w:rFonts w:ascii="Arial" w:hAnsi="Arial" w:cs="Arial"/>
-              </w:rPr>
-            </w:pPr>
+              <w:jc w:val="center"/>
+              <w:rPr>
+                <w:rFonts w:ascii="Arial" w:hAnsi="Arial" w:cs="Arial"/>
+              </w:rPr>
+            </w:pPr>
+            <w:r>
+              <w:rPr>
+                <w:rFonts w:ascii="Arial" w:hAnsi="Arial" w:cs="Arial"/>
+              </w:rPr>
+              <w:t>6</w:t>
+            </w:r>
           </w:p>
         </w:tc>
       </w:tr>
@@ -9784,7 +11444,7 @@
         </w:trPr>
         <w:tc>
           <w:tcPr>
-            <w:tcW w:w="2175" w:type="dxa"/>
+            <w:tcW w:w="2170" w:type="dxa"/>
             <w:vAlign w:val="center"/>
           </w:tcPr>
           <w:p>
@@ -9804,7 +11464,7 @@
         </w:tc>
         <w:tc>
           <w:tcPr>
-            <w:tcW w:w="3212" w:type="dxa"/>
+            <w:tcW w:w="3195" w:type="dxa"/>
             <w:vAlign w:val="center"/>
           </w:tcPr>
           <w:p>
@@ -9824,7 +11484,7 @@
         </w:tc>
         <w:tc>
           <w:tcPr>
-            <w:tcW w:w="1794" w:type="dxa"/>
+            <w:tcW w:w="1816" w:type="dxa"/>
             <w:vAlign w:val="center"/>
           </w:tcPr>
           <w:p>
@@ -9851,10 +11511,17 @@
           <w:p>
             <w:pPr>
               <w:spacing w:line="276" w:lineRule="auto"/>
-              <w:rPr>
-                <w:rFonts w:ascii="Arial" w:hAnsi="Arial" w:cs="Arial"/>
-              </w:rPr>
-            </w:pPr>
+              <w:jc w:val="center"/>
+              <w:rPr>
+                <w:rFonts w:ascii="Arial" w:hAnsi="Arial" w:cs="Arial"/>
+              </w:rPr>
+            </w:pPr>
+            <w:r>
+              <w:rPr>
+                <w:rFonts w:ascii="Arial" w:hAnsi="Arial" w:cs="Arial"/>
+              </w:rPr>
+              <w:t>5</w:t>
+            </w:r>
           </w:p>
         </w:tc>
       </w:tr>
@@ -9864,7 +11531,7 @@
         </w:trPr>
         <w:tc>
           <w:tcPr>
-            <w:tcW w:w="2175" w:type="dxa"/>
+            <w:tcW w:w="2170" w:type="dxa"/>
             <w:vAlign w:val="center"/>
           </w:tcPr>
           <w:p>
@@ -9884,7 +11551,7 @@
         </w:tc>
         <w:tc>
           <w:tcPr>
-            <w:tcW w:w="3212" w:type="dxa"/>
+            <w:tcW w:w="3195" w:type="dxa"/>
             <w:vAlign w:val="center"/>
           </w:tcPr>
           <w:p>
@@ -9898,43 +11565,13 @@
               <w:rPr>
                 <w:rFonts w:ascii="Arial" w:hAnsi="Arial" w:cs="Arial"/>
               </w:rPr>
-              <w:t xml:space="preserve">La solución cumple con todas las </w:t>
-            </w:r>
-            <w:r>
-              <w:rPr>
-                <w:rFonts w:ascii="Arial" w:hAnsi="Arial" w:cs="Arial"/>
-              </w:rPr>
-              <w:t xml:space="preserve">normas </w:t>
-            </w:r>
-            <w:r>
-              <w:rPr>
-                <w:rFonts w:ascii="Arial" w:hAnsi="Arial" w:cs="Arial"/>
-              </w:rPr>
-              <w:t xml:space="preserve">técnicas </w:t>
-            </w:r>
-            <w:r>
-              <w:rPr>
-                <w:rFonts w:ascii="Arial" w:hAnsi="Arial" w:cs="Arial"/>
-              </w:rPr>
-              <w:t xml:space="preserve">de seguridad, </w:t>
-            </w:r>
-            <w:r>
-              <w:rPr>
-                <w:rFonts w:ascii="Arial" w:hAnsi="Arial" w:cs="Arial"/>
-              </w:rPr>
-              <w:t>higiene</w:t>
-            </w:r>
-            <w:r>
-              <w:rPr>
-                <w:rFonts w:ascii="Arial" w:hAnsi="Arial" w:cs="Arial"/>
-              </w:rPr>
-              <w:t xml:space="preserve"> y medio ambiente.</w:t>
-            </w:r>
-          </w:p>
-        </w:tc>
-        <w:tc>
-          <w:tcPr>
-            <w:tcW w:w="1794" w:type="dxa"/>
+              <w:t>La solución cumple con todas las normas técnicas de seguridad, higiene y medio ambiente.</w:t>
+            </w:r>
+          </w:p>
+        </w:tc>
+        <w:tc>
+          <w:tcPr>
+            <w:tcW w:w="1816" w:type="dxa"/>
             <w:vAlign w:val="center"/>
           </w:tcPr>
           <w:p>
@@ -9961,10 +11598,17 @@
           <w:p>
             <w:pPr>
               <w:spacing w:line="276" w:lineRule="auto"/>
-              <w:rPr>
-                <w:rFonts w:ascii="Arial" w:hAnsi="Arial" w:cs="Arial"/>
-              </w:rPr>
-            </w:pPr>
+              <w:jc w:val="center"/>
+              <w:rPr>
+                <w:rFonts w:ascii="Arial" w:hAnsi="Arial" w:cs="Arial"/>
+              </w:rPr>
+            </w:pPr>
+            <w:r>
+              <w:rPr>
+                <w:rFonts w:ascii="Arial" w:hAnsi="Arial" w:cs="Arial"/>
+              </w:rPr>
+              <w:t>3</w:t>
+            </w:r>
           </w:p>
         </w:tc>
       </w:tr>
@@ -9974,7 +11618,7 @@
         </w:trPr>
         <w:tc>
           <w:tcPr>
-            <w:tcW w:w="5387" w:type="dxa"/>
+            <w:tcW w:w="5365" w:type="dxa"/>
             <w:gridSpan w:val="2"/>
             <w:vAlign w:val="center"/>
           </w:tcPr>
@@ -9999,7 +11643,7 @@
         </w:tc>
         <w:tc>
           <w:tcPr>
-            <w:tcW w:w="1794" w:type="dxa"/>
+            <w:tcW w:w="1816" w:type="dxa"/>
             <w:vAlign w:val="center"/>
           </w:tcPr>
           <w:p>
@@ -10030,12 +11674,21 @@
           <w:p>
             <w:pPr>
               <w:spacing w:line="276" w:lineRule="auto"/>
+              <w:jc w:val="center"/>
               <w:rPr>
                 <w:rFonts w:ascii="Arial" w:hAnsi="Arial" w:cs="Arial"/>
                 <w:b/>
                 <w:bCs/>
               </w:rPr>
             </w:pPr>
+            <w:r>
+              <w:rPr>
+                <w:rFonts w:ascii="Arial" w:hAnsi="Arial" w:cs="Arial"/>
+                <w:b/>
+                <w:bCs/>
+              </w:rPr>
+              <w:t>17</w:t>
+            </w:r>
           </w:p>
         </w:tc>
       </w:tr>
@@ -10088,7 +11741,7 @@
                     </pic:cNvPicPr>
                   </pic:nvPicPr>
                   <pic:blipFill>
-                    <a:blip r:embed="rId16" cstate="print">
+                    <a:blip r:embed="rId19" cstate="print">
                       <a:extLst>
                         <a:ext uri="{28A0092B-C50C-407E-A947-70E740481C1C}">
                           <a14:useLocalDpi xmlns:a14="http://schemas.microsoft.com/office/drawing/2010/main" val="0"/>
@@ -10127,8 +11780,8 @@
       </w:r>
     </w:p>
     <w:sectPr>
-      <w:headerReference w:type="default" r:id="rId17"/>
-      <w:footerReference w:type="default" r:id="rId18"/>
+      <w:headerReference w:type="default" r:id="rId20"/>
+      <w:footerReference w:type="default" r:id="rId21"/>
       <w:pgSz w:w="11906" w:h="16838"/>
       <w:pgMar w:top="1418" w:right="1701" w:bottom="249" w:left="1418" w:header="709" w:footer="709" w:gutter="0"/>
       <w:cols w:space="708"/>
@@ -12731,26 +14384,12 @@
 </file>
 
 <file path=customXml/item1.xml><?xml version="1.0" encoding="utf-8"?>
-<p:properties xmlns:p="http://schemas.microsoft.com/office/2006/metadata/properties" xmlns:xsi="http://www.w3.org/2001/XMLSchema-instance" xmlns:pc="http://schemas.microsoft.com/office/infopath/2007/PartnerControls">
-  <documentManagement>
-    <TaxCatchAll xmlns="ee27a0f9-7ff9-4c05-b61a-f7053cc3ff56" xsi:nil="true"/>
-    <lcf76f155ced4ddcb4097134ff3c332f xmlns="8b0498ea-4bc6-4676-a87b-9cffe7f59fc7">
-      <Terms xmlns="http://schemas.microsoft.com/office/infopath/2007/PartnerControls"/>
-    </lcf76f155ced4ddcb4097134ff3c332f>
-    <SharedWithUsers xmlns="ee27a0f9-7ff9-4c05-b61a-f7053cc3ff56">
-      <UserInfo>
-        <DisplayName/>
-        <AccountId xsi:nil="true"/>
-        <AccountType/>
-      </UserInfo>
-    </SharedWithUsers>
-    <Entregado xmlns="8b0498ea-4bc6-4676-a87b-9cffe7f59fc7">false</Entregado>
-    <Tarea3 xmlns="8b0498ea-4bc6-4676-a87b-9cffe7f59fc7" xsi:nil="true"/>
-    <NumTareas xmlns="8b0498ea-4bc6-4676-a87b-9cffe7f59fc7" xsi:nil="true"/>
-    <FECHAYHORA xmlns="8b0498ea-4bc6-4676-a87b-9cffe7f59fc7" xsi:nil="true"/>
-    <Observado xmlns="8b0498ea-4bc6-4676-a87b-9cffe7f59fc7">false</Observado>
-  </documentManagement>
-</p:properties>
+<?mso-contentType ?>
+<FormTemplates xmlns="http://schemas.microsoft.com/sharepoint/v3/contenttype/forms">
+  <Display>DocumentLibraryForm</Display>
+  <Edit>DocumentLibraryForm</Edit>
+  <New>DocumentLibraryForm</New>
+</FormTemplates>
 </file>
 
 <file path=customXml/item2.xml><?xml version="1.0" encoding="utf-8"?>
@@ -13050,12 +14689,26 @@
 </file>
 
 <file path=customXml/item3.xml><?xml version="1.0" encoding="utf-8"?>
-<?mso-contentType ?>
-<FormTemplates xmlns="http://schemas.microsoft.com/sharepoint/v3/contenttype/forms">
-  <Display>DocumentLibraryForm</Display>
-  <Edit>DocumentLibraryForm</Edit>
-  <New>DocumentLibraryForm</New>
-</FormTemplates>
+<p:properties xmlns:p="http://schemas.microsoft.com/office/2006/metadata/properties" xmlns:xsi="http://www.w3.org/2001/XMLSchema-instance" xmlns:pc="http://schemas.microsoft.com/office/infopath/2007/PartnerControls">
+  <documentManagement>
+    <TaxCatchAll xmlns="ee27a0f9-7ff9-4c05-b61a-f7053cc3ff56" xsi:nil="true"/>
+    <lcf76f155ced4ddcb4097134ff3c332f xmlns="8b0498ea-4bc6-4676-a87b-9cffe7f59fc7">
+      <Terms xmlns="http://schemas.microsoft.com/office/infopath/2007/PartnerControls"/>
+    </lcf76f155ced4ddcb4097134ff3c332f>
+    <SharedWithUsers xmlns="ee27a0f9-7ff9-4c05-b61a-f7053cc3ff56">
+      <UserInfo>
+        <DisplayName/>
+        <AccountId xsi:nil="true"/>
+        <AccountType/>
+      </UserInfo>
+    </SharedWithUsers>
+    <Entregado xmlns="8b0498ea-4bc6-4676-a87b-9cffe7f59fc7">false</Entregado>
+    <Tarea3 xmlns="8b0498ea-4bc6-4676-a87b-9cffe7f59fc7" xsi:nil="true"/>
+    <NumTareas xmlns="8b0498ea-4bc6-4676-a87b-9cffe7f59fc7" xsi:nil="true"/>
+    <FECHAYHORA xmlns="8b0498ea-4bc6-4676-a87b-9cffe7f59fc7" xsi:nil="true"/>
+    <Observado xmlns="8b0498ea-4bc6-4676-a87b-9cffe7f59fc7">false</Observado>
+  </documentManagement>
+</p:properties>
 </file>
 
 <file path=customXml/item4.xml><?xml version="1.0" encoding="utf-8"?>
@@ -13063,12 +14716,9 @@
 </file>
 
 <file path=customXml/itemProps1.xml><?xml version="1.0" encoding="utf-8"?>
-<ds:datastoreItem xmlns:ds="http://schemas.openxmlformats.org/officeDocument/2006/customXml" ds:itemID="{BF77E685-4CE1-49EA-B15D-526260D8588E}">
+<ds:datastoreItem xmlns:ds="http://schemas.openxmlformats.org/officeDocument/2006/customXml" ds:itemID="{04A08A2F-85C4-4058-B79A-F3E79FBC01F5}">
   <ds:schemaRefs>
-    <ds:schemaRef ds:uri="http://schemas.microsoft.com/office/2006/metadata/properties"/>
-    <ds:schemaRef ds:uri="http://schemas.microsoft.com/office/infopath/2007/PartnerControls"/>
-    <ds:schemaRef ds:uri="ee27a0f9-7ff9-4c05-b61a-f7053cc3ff56"/>
-    <ds:schemaRef ds:uri="8b0498ea-4bc6-4676-a87b-9cffe7f59fc7"/>
+    <ds:schemaRef ds:uri="http://schemas.microsoft.com/sharepoint/v3/contenttype/forms"/>
   </ds:schemaRefs>
 </ds:datastoreItem>
 </file>
@@ -13093,15 +14743,18 @@
 </file>
 
 <file path=customXml/itemProps3.xml><?xml version="1.0" encoding="utf-8"?>
-<ds:datastoreItem xmlns:ds="http://schemas.openxmlformats.org/officeDocument/2006/customXml" ds:itemID="{04A08A2F-85C4-4058-B79A-F3E79FBC01F5}">
+<ds:datastoreItem xmlns:ds="http://schemas.openxmlformats.org/officeDocument/2006/customXml" ds:itemID="{BF77E685-4CE1-49EA-B15D-526260D8588E}">
   <ds:schemaRefs>
-    <ds:schemaRef ds:uri="http://schemas.microsoft.com/sharepoint/v3/contenttype/forms"/>
+    <ds:schemaRef ds:uri="http://schemas.microsoft.com/office/2006/metadata/properties"/>
+    <ds:schemaRef ds:uri="http://schemas.microsoft.com/office/infopath/2007/PartnerControls"/>
+    <ds:schemaRef ds:uri="ee27a0f9-7ff9-4c05-b61a-f7053cc3ff56"/>
+    <ds:schemaRef ds:uri="8b0498ea-4bc6-4676-a87b-9cffe7f59fc7"/>
   </ds:schemaRefs>
 </ds:datastoreItem>
 </file>
 
 <file path=customXml/itemProps4.xml><?xml version="1.0" encoding="utf-8"?>
-<ds:datastoreItem xmlns:ds="http://schemas.openxmlformats.org/officeDocument/2006/customXml" ds:itemID="{D2AF53BF-DE0A-4744-853B-16F1B9CDBAC9}">
+<ds:datastoreItem xmlns:ds="http://schemas.openxmlformats.org/officeDocument/2006/customXml" ds:itemID="{A19EF5FC-587F-4142-AB20-FDC33AB6B1BA}">
   <ds:schemaRefs>
     <ds:schemaRef ds:uri="http://schemas.openxmlformats.org/officeDocument/2006/bibliography"/>
   </ds:schemaRefs>

</xml_diff>